<commit_message>
Final updates to app and documentation
</commit_message>
<xml_diff>
--- a/documentation/CIP_FS2026_104_Project_Documentation.docx
+++ b/documentation/CIP_FS2026_104_Project_Documentation.docx
@@ -46,7 +46,7 @@
     </w:p>
     <w:p>
       <w:pPr>
-        <w:pStyle w:val="berschrift1"/>
+        <w:pStyle w:val="Balk1"/>
       </w:pPr>
       <w:r>
         <w:t>Overview and Motivation of our project</w:t>
@@ -151,7 +151,7 @@
     </w:p>
     <w:p>
       <w:pPr>
-        <w:pStyle w:val="berschrift1"/>
+        <w:pStyle w:val="Balk1"/>
         <w:numPr>
           <w:ilvl w:val="1"/>
           <w:numId w:val="4"/>
@@ -219,29 +219,7 @@
           <w:sz w:val="20"/>
           <w:szCs w:val="20"/>
         </w:rPr>
-        <w:t xml:space="preserve">Is there significant evidence that there is a strong linear relationship between </w:t>
-      </w:r>
-      <w:proofErr w:type="gramStart"/>
-      <w:r>
-        <w:rPr>
-          <w:rFonts w:ascii="Arial" w:hAnsi="Arial" w:cs="Arial"/>
-          <w:i/>
-          <w:iCs/>
-          <w:sz w:val="20"/>
-          <w:szCs w:val="20"/>
-        </w:rPr>
-        <w:t>GDP</w:t>
-      </w:r>
-      <w:proofErr w:type="gramEnd"/>
-      <w:r>
-        <w:rPr>
-          <w:rFonts w:ascii="Arial" w:hAnsi="Arial" w:cs="Arial"/>
-          <w:i/>
-          <w:iCs/>
-          <w:sz w:val="20"/>
-          <w:szCs w:val="20"/>
-        </w:rPr>
-        <w:t xml:space="preserve"> per capita and apartment rental prices per square meter across Swiss cantons, and how much of the variation in rental prices can be explained by GDP per capita?</w:t>
+        <w:t>Is there significant evidence that there is a strong linear relationship between GDP per capita and apartment rental prices per square meter across Swiss cantons, and how much of the variation in rental prices can be explained by GDP per capita?</w:t>
       </w:r>
     </w:p>
     <w:p>
@@ -334,7 +312,7 @@
     </w:p>
     <w:p>
       <w:pPr>
-        <w:pStyle w:val="berschrift1"/>
+        <w:pStyle w:val="Balk1"/>
       </w:pPr>
       <w:r>
         <w:t>Met</w:t>
@@ -345,7 +323,7 @@
     </w:p>
     <w:p>
       <w:pPr>
-        <w:pStyle w:val="berschrift1"/>
+        <w:pStyle w:val="Balk1"/>
         <w:numPr>
           <w:ilvl w:val="1"/>
           <w:numId w:val="4"/>
@@ -436,7 +414,7 @@
     </w:p>
     <w:p>
       <w:pPr>
-        <w:pStyle w:val="berschrift1"/>
+        <w:pStyle w:val="Balk1"/>
         <w:numPr>
           <w:ilvl w:val="1"/>
           <w:numId w:val="4"/>
@@ -601,6 +579,644 @@
     </w:p>
     <w:p>
       <w:pPr>
+        <w:pStyle w:val="NormalWeb"/>
+        <w:spacing w:after="0" w:afterAutospacing="0"/>
+        <w:jc w:val="both"/>
+        <w:rPr>
+          <w:rFonts w:ascii="Arial" w:hAnsi="Arial" w:cs="Arial"/>
+          <w:color w:val="EE0000"/>
+          <w:sz w:val="20"/>
+          <w:szCs w:val="20"/>
+        </w:rPr>
+      </w:pPr>
+      <w:r>
+        <w:rPr>
+          <w:rStyle w:val="normaltextrun"/>
+          <w:rFonts w:ascii="Arial" w:hAnsi="Arial" w:cs="Arial"/>
+          <w:color w:val="000000"/>
+          <w:sz w:val="20"/>
+          <w:szCs w:val="20"/>
+        </w:rPr>
+        <w:t xml:space="preserve">Before covering all cantons, we used a subset of the data (Zurich’s first page) to create reusable functions </w:t>
+      </w:r>
+      <w:r>
+        <w:rPr>
+          <w:rStyle w:val="normaltextrun"/>
+          <w:rFonts w:ascii="Arial" w:hAnsi="Arial" w:cs="Arial"/>
+          <w:color w:val="000000"/>
+          <w:sz w:val="20"/>
+          <w:szCs w:val="20"/>
+        </w:rPr>
+        <w:t>to</w:t>
+      </w:r>
+      <w:r>
+        <w:rPr>
+          <w:rStyle w:val="normaltextrun"/>
+          <w:rFonts w:ascii="Arial" w:hAnsi="Arial" w:cs="Arial"/>
+          <w:color w:val="000000"/>
+          <w:sz w:val="20"/>
+          <w:szCs w:val="20"/>
+        </w:rPr>
+        <w:t xml:space="preserve"> process the scraped data and </w:t>
+      </w:r>
+      <w:r>
+        <w:rPr>
+          <w:rStyle w:val="normaltextrun"/>
+          <w:rFonts w:ascii="Arial" w:hAnsi="Arial" w:cs="Arial"/>
+          <w:color w:val="000000"/>
+          <w:sz w:val="20"/>
+          <w:szCs w:val="20"/>
+        </w:rPr>
+        <w:t>ensure a</w:t>
+      </w:r>
+      <w:r>
+        <w:rPr>
+          <w:rStyle w:val="normaltextrun"/>
+          <w:rFonts w:ascii="Arial" w:hAnsi="Arial" w:cs="Arial"/>
+          <w:color w:val="000000"/>
+          <w:sz w:val="20"/>
+          <w:szCs w:val="20"/>
+        </w:rPr>
+        <w:t xml:space="preserve"> concise script when expanding </w:t>
+      </w:r>
+      <w:r>
+        <w:rPr>
+          <w:rStyle w:val="normaltextrun"/>
+          <w:rFonts w:ascii="Arial" w:hAnsi="Arial" w:cs="Arial"/>
+          <w:color w:val="000000"/>
+          <w:sz w:val="20"/>
+          <w:szCs w:val="20"/>
+        </w:rPr>
+        <w:t>the code to all cantons</w:t>
+      </w:r>
+      <w:r>
+        <w:rPr>
+          <w:rStyle w:val="normaltextrun"/>
+          <w:rFonts w:ascii="Arial" w:hAnsi="Arial" w:cs="Arial"/>
+          <w:color w:val="000000"/>
+          <w:sz w:val="20"/>
+          <w:szCs w:val="20"/>
+        </w:rPr>
+        <w:t xml:space="preserve">. These functions </w:t>
+      </w:r>
+      <w:r>
+        <w:rPr>
+          <w:rStyle w:val="normaltextrun"/>
+          <w:rFonts w:ascii="Arial" w:hAnsi="Arial" w:cs="Arial"/>
+          <w:color w:val="000000"/>
+          <w:sz w:val="20"/>
+          <w:szCs w:val="20"/>
+        </w:rPr>
+        <w:t>serve to</w:t>
+      </w:r>
+      <w:r>
+        <w:rPr>
+          <w:rStyle w:val="normaltextrun"/>
+          <w:rFonts w:ascii="Arial" w:hAnsi="Arial" w:cs="Arial"/>
+          <w:color w:val="000000"/>
+          <w:sz w:val="20"/>
+          <w:szCs w:val="20"/>
+        </w:rPr>
+        <w:t xml:space="preserve"> extract the relevant housing variables (price, living area, number of rooms, and location) </w:t>
+      </w:r>
+      <w:r>
+        <w:rPr>
+          <w:rStyle w:val="normaltextrun"/>
+          <w:rFonts w:ascii="Arial" w:hAnsi="Arial" w:cs="Arial"/>
+          <w:color w:val="000000"/>
+          <w:sz w:val="20"/>
+          <w:szCs w:val="20"/>
+        </w:rPr>
+        <w:lastRenderedPageBreak/>
+        <w:t>for each listing and ensure consistency across all records.</w:t>
+      </w:r>
+      <w:r>
+        <w:rPr>
+          <w:rStyle w:val="normaltextrun"/>
+          <w:rFonts w:ascii="Arial" w:hAnsi="Arial" w:cs="Arial"/>
+          <w:color w:val="000000"/>
+          <w:sz w:val="20"/>
+          <w:szCs w:val="20"/>
+        </w:rPr>
+        <w:t xml:space="preserve"> </w:t>
+      </w:r>
+      <w:r>
+        <w:rPr>
+          <w:rStyle w:val="normaltextrun"/>
+          <w:rFonts w:ascii="Arial" w:hAnsi="Arial" w:cs="Arial"/>
+          <w:color w:val="000000"/>
+          <w:sz w:val="20"/>
+          <w:szCs w:val="20"/>
+        </w:rPr>
+        <w:t xml:space="preserve">Housing variables were embedded in unstructured text and required the use of the </w:t>
+      </w:r>
+      <w:r>
+        <w:rPr>
+          <w:rStyle w:val="normaltextrun"/>
+          <w:rFonts w:ascii="Courier New" w:hAnsi="Courier New" w:cs="Courier New"/>
+          <w:i/>
+          <w:iCs/>
+          <w:color w:val="000000"/>
+          <w:sz w:val="18"/>
+          <w:szCs w:val="18"/>
+        </w:rPr>
+        <w:t>re</w:t>
+      </w:r>
+      <w:r>
+        <w:rPr>
+          <w:rStyle w:val="normaltextrun"/>
+          <w:rFonts w:ascii="Arial" w:hAnsi="Arial" w:cs="Arial"/>
+          <w:color w:val="000000"/>
+          <w:sz w:val="20"/>
+          <w:szCs w:val="20"/>
+        </w:rPr>
+        <w:t xml:space="preserve"> package to apply regular expressions for extraction and cleaning</w:t>
+      </w:r>
+      <w:r>
+        <w:rPr>
+          <w:rStyle w:val="normaltextrun"/>
+          <w:rFonts w:ascii="Arial" w:hAnsi="Arial" w:cs="Arial"/>
+          <w:color w:val="EE0000"/>
+          <w:sz w:val="20"/>
+          <w:szCs w:val="20"/>
+        </w:rPr>
+        <w:t xml:space="preserve">. </w:t>
+      </w:r>
+      <w:r>
+        <w:rPr>
+          <w:rStyle w:val="normaltextrun"/>
+          <w:rFonts w:ascii="Arial" w:hAnsi="Arial" w:cs="Arial"/>
+          <w:color w:val="EE0000"/>
+          <w:sz w:val="20"/>
+          <w:szCs w:val="20"/>
+        </w:rPr>
+        <w:t>T</w:t>
+      </w:r>
+      <w:r>
+        <w:rPr>
+          <w:rFonts w:ascii="Arial" w:hAnsi="Arial" w:cs="Arial"/>
+          <w:color w:val="EE0000"/>
+          <w:sz w:val="20"/>
+          <w:szCs w:val="20"/>
+        </w:rPr>
+        <w:t>he initial parsing attempts revealed substantial missing values, indicating inconsistencies in how housing attributes were embedded within the listing text. To address this, the extraction logic was refined by adjusting regular expression patterns based on inspection of the raw HTML structure.</w:t>
+      </w:r>
+      <w:r>
+        <w:rPr>
+          <w:rFonts w:ascii="Arial" w:hAnsi="Arial" w:cs="Arial"/>
+          <w:color w:val="EE0000"/>
+          <w:sz w:val="20"/>
+          <w:szCs w:val="20"/>
+        </w:rPr>
+        <w:t xml:space="preserve"> </w:t>
+      </w:r>
+      <w:r>
+        <w:rPr>
+          <w:rFonts w:ascii="Arial" w:hAnsi="Arial" w:cs="Arial"/>
+          <w:color w:val="EE0000"/>
+          <w:sz w:val="20"/>
+          <w:szCs w:val="20"/>
+        </w:rPr>
+        <w:t>These refinements led to a significant increase in data completeness. The number of missing values for</w:t>
+      </w:r>
+      <w:r>
+        <w:rPr>
+          <w:rStyle w:val="apple-converted-space"/>
+          <w:rFonts w:ascii="Arial" w:eastAsiaTheme="majorEastAsia" w:hAnsi="Arial" w:cs="Arial"/>
+          <w:color w:val="EE0000"/>
+          <w:sz w:val="20"/>
+          <w:szCs w:val="20"/>
+        </w:rPr>
+        <w:t> </w:t>
+      </w:r>
+      <w:r>
+        <w:rPr>
+          <w:rStyle w:val="Vurgu"/>
+          <w:rFonts w:ascii="Arial" w:eastAsiaTheme="majorEastAsia" w:hAnsi="Arial" w:cs="Arial"/>
+          <w:color w:val="EE0000"/>
+          <w:sz w:val="20"/>
+          <w:szCs w:val="20"/>
+        </w:rPr>
+        <w:t>living area</w:t>
+      </w:r>
+      <w:r>
+        <w:rPr>
+          <w:rStyle w:val="Vurgu"/>
+          <w:rFonts w:ascii="Arial" w:eastAsiaTheme="majorEastAsia" w:hAnsi="Arial" w:cs="Arial"/>
+          <w:color w:val="EE0000"/>
+          <w:sz w:val="20"/>
+          <w:szCs w:val="20"/>
+        </w:rPr>
+        <w:t xml:space="preserve"> </w:t>
+      </w:r>
+      <w:r>
+        <w:rPr>
+          <w:rFonts w:ascii="Arial" w:hAnsi="Arial" w:cs="Arial"/>
+          <w:color w:val="EE0000"/>
+          <w:sz w:val="20"/>
+          <w:szCs w:val="20"/>
+        </w:rPr>
+        <w:t>decreased from 4,689 to 653, reducing the missing rate from 100% to 13.8% (an improvement of approximately 86%).</w:t>
+      </w:r>
+      <w:r>
+        <w:rPr>
+          <w:rFonts w:ascii="Arial" w:hAnsi="Arial" w:cs="Arial"/>
+          <w:color w:val="EE0000"/>
+          <w:sz w:val="20"/>
+          <w:szCs w:val="20"/>
+        </w:rPr>
+        <w:t xml:space="preserve"> </w:t>
+      </w:r>
+      <w:r>
+        <w:rPr>
+          <w:rFonts w:ascii="Arial" w:hAnsi="Arial" w:cs="Arial"/>
+          <w:color w:val="EE0000"/>
+          <w:sz w:val="20"/>
+          <w:szCs w:val="20"/>
+        </w:rPr>
+        <w:t>Similarly, the</w:t>
+      </w:r>
+      <w:r>
+        <w:rPr>
+          <w:rStyle w:val="apple-converted-space"/>
+          <w:rFonts w:ascii="Arial" w:eastAsiaTheme="majorEastAsia" w:hAnsi="Arial" w:cs="Arial"/>
+          <w:color w:val="EE0000"/>
+          <w:sz w:val="20"/>
+          <w:szCs w:val="20"/>
+        </w:rPr>
+        <w:t> </w:t>
+      </w:r>
+      <w:r>
+        <w:rPr>
+          <w:rStyle w:val="Vurgu"/>
+          <w:rFonts w:ascii="Arial" w:eastAsiaTheme="majorEastAsia" w:hAnsi="Arial" w:cs="Arial"/>
+          <w:color w:val="EE0000"/>
+          <w:sz w:val="20"/>
+          <w:szCs w:val="20"/>
+        </w:rPr>
+        <w:t>number of rooms</w:t>
+      </w:r>
+      <w:r>
+        <w:rPr>
+          <w:rStyle w:val="apple-converted-space"/>
+          <w:rFonts w:ascii="Arial" w:eastAsiaTheme="majorEastAsia" w:hAnsi="Arial" w:cs="Arial"/>
+          <w:color w:val="EE0000"/>
+          <w:sz w:val="20"/>
+          <w:szCs w:val="20"/>
+        </w:rPr>
+        <w:t> </w:t>
+      </w:r>
+      <w:r>
+        <w:rPr>
+          <w:rFonts w:ascii="Arial" w:hAnsi="Arial" w:cs="Arial"/>
+          <w:color w:val="EE0000"/>
+          <w:sz w:val="20"/>
+          <w:szCs w:val="20"/>
+        </w:rPr>
+        <w:t xml:space="preserve">variable improved from being mostly missing in the initial dataset to only 63 </w:t>
+      </w:r>
+      <w:r>
+        <w:rPr>
+          <w:rFonts w:ascii="Arial" w:hAnsi="Arial" w:cs="Arial"/>
+          <w:color w:val="EE0000"/>
+          <w:sz w:val="20"/>
+          <w:szCs w:val="20"/>
+        </w:rPr>
+        <w:t>missing values in the final dataset (over 98% coverage). The</w:t>
+      </w:r>
+      <w:r>
+        <w:rPr>
+          <w:rStyle w:val="apple-converted-space"/>
+          <w:rFonts w:ascii="Arial" w:eastAsiaTheme="majorEastAsia" w:hAnsi="Arial" w:cs="Arial"/>
+          <w:color w:val="EE0000"/>
+          <w:sz w:val="20"/>
+          <w:szCs w:val="20"/>
+        </w:rPr>
+        <w:t> </w:t>
+      </w:r>
+      <w:r>
+        <w:rPr>
+          <w:rStyle w:val="Vurgu"/>
+          <w:rFonts w:ascii="Arial" w:eastAsiaTheme="majorEastAsia" w:hAnsi="Arial" w:cs="Arial"/>
+          <w:color w:val="EE0000"/>
+          <w:sz w:val="20"/>
+          <w:szCs w:val="20"/>
+        </w:rPr>
+        <w:t>location text</w:t>
+      </w:r>
+      <w:r>
+        <w:rPr>
+          <w:rStyle w:val="apple-converted-space"/>
+          <w:rFonts w:ascii="Arial" w:eastAsiaTheme="majorEastAsia" w:hAnsi="Arial" w:cs="Arial"/>
+          <w:color w:val="EE0000"/>
+          <w:sz w:val="20"/>
+          <w:szCs w:val="20"/>
+        </w:rPr>
+        <w:t> </w:t>
+      </w:r>
+      <w:r>
+        <w:rPr>
+          <w:rFonts w:ascii="Arial" w:hAnsi="Arial" w:cs="Arial"/>
+          <w:color w:val="EE0000"/>
+          <w:sz w:val="20"/>
+          <w:szCs w:val="20"/>
+        </w:rPr>
+        <w:t>field showed comparable improvement, with missing values reduced to 49, corresponding to over 95% completeness.</w:t>
+      </w:r>
+      <w:r>
+        <w:rPr>
+          <w:rFonts w:ascii="Arial" w:hAnsi="Arial" w:cs="Arial"/>
+          <w:color w:val="EE0000"/>
+          <w:sz w:val="20"/>
+          <w:szCs w:val="20"/>
+        </w:rPr>
+        <w:t xml:space="preserve"> </w:t>
+      </w:r>
+    </w:p>
+    <w:p>
+      <w:pPr>
+        <w:pStyle w:val="NormalWeb"/>
+        <w:spacing w:after="0" w:afterAutospacing="0"/>
+        <w:jc w:val="both"/>
+        <w:rPr>
+          <w:rStyle w:val="normaltextrun"/>
+          <w:rFonts w:ascii="Arial" w:hAnsi="Arial" w:cs="Arial"/>
+          <w:color w:val="000000"/>
+          <w:sz w:val="20"/>
+          <w:szCs w:val="20"/>
+        </w:rPr>
+      </w:pPr>
+      <w:r>
+        <w:rPr>
+          <w:rFonts w:ascii="Arial" w:hAnsi="Arial" w:cs="Arial"/>
+          <w:color w:val="000000"/>
+          <w:sz w:val="20"/>
+          <w:szCs w:val="20"/>
+        </w:rPr>
+        <w:t>Building on these improvements, once we understood the behavior of the code for one page, we proceeded to expand it to all cantons.</w:t>
+      </w:r>
+      <w:r>
+        <w:rPr>
+          <w:rFonts w:ascii="Arial" w:hAnsi="Arial" w:cs="Arial"/>
+          <w:color w:val="000000"/>
+          <w:sz w:val="20"/>
+          <w:szCs w:val="20"/>
+        </w:rPr>
+        <w:t xml:space="preserve"> </w:t>
+      </w:r>
+      <w:r>
+        <w:rPr>
+          <w:rStyle w:val="normaltextrun"/>
+          <w:rFonts w:ascii="Arial" w:hAnsi="Arial" w:cs="Arial"/>
+          <w:color w:val="000000"/>
+          <w:sz w:val="20"/>
+          <w:szCs w:val="20"/>
+        </w:rPr>
+        <w:t>We achieved this by creating a nested loop, where the outer loop scrapes each canton’s webpage and the inner loop extracts the housing variables for each listing. The first challenge we encountered for the outer loop was that naming conventions for each canton were inconsistent in terms of capitalization and use of special characters. We therefore created a dictionary to ensure the canton name matched exactly the pattern used on the immobilier.ch website.</w:t>
+      </w:r>
+      <w:r>
+        <w:rPr>
+          <w:rStyle w:val="normaltextrun"/>
+          <w:rFonts w:ascii="Arial" w:hAnsi="Arial" w:cs="Arial"/>
+          <w:color w:val="000000"/>
+          <w:sz w:val="20"/>
+          <w:szCs w:val="20"/>
+        </w:rPr>
+        <w:t xml:space="preserve"> Additionally</w:t>
+      </w:r>
+      <w:r>
+        <w:rPr>
+          <w:rStyle w:val="normaltextrun"/>
+          <w:rFonts w:ascii="Arial" w:hAnsi="Arial" w:cs="Arial"/>
+          <w:color w:val="000000"/>
+          <w:sz w:val="20"/>
+          <w:szCs w:val="20"/>
+        </w:rPr>
+        <w:t xml:space="preserve"> listing availability</w:t>
+      </w:r>
+      <w:r>
+        <w:rPr>
+          <w:rStyle w:val="normaltextrun"/>
+          <w:rFonts w:ascii="Arial" w:hAnsi="Arial" w:cs="Arial"/>
+          <w:color w:val="000000"/>
+          <w:sz w:val="20"/>
+          <w:szCs w:val="20"/>
+        </w:rPr>
+        <w:t xml:space="preserve"> differed among regions</w:t>
+      </w:r>
+      <w:r>
+        <w:rPr>
+          <w:rStyle w:val="normaltextrun"/>
+          <w:rFonts w:ascii="Arial" w:hAnsi="Arial" w:cs="Arial"/>
+          <w:color w:val="000000"/>
+          <w:sz w:val="20"/>
+          <w:szCs w:val="20"/>
+        </w:rPr>
+        <w:t>. While some cantons had multiple pages, each containing 23 listings, others had only a few</w:t>
+      </w:r>
+      <w:r>
+        <w:rPr>
+          <w:rStyle w:val="normaltextrun"/>
+          <w:rFonts w:ascii="Arial" w:hAnsi="Arial" w:cs="Arial"/>
+          <w:color w:val="000000"/>
+          <w:sz w:val="20"/>
+          <w:szCs w:val="20"/>
+        </w:rPr>
+        <w:t xml:space="preserve"> listings</w:t>
+      </w:r>
+      <w:r>
+        <w:rPr>
+          <w:rStyle w:val="normaltextrun"/>
+          <w:rFonts w:ascii="Arial" w:hAnsi="Arial" w:cs="Arial"/>
+          <w:color w:val="000000"/>
+          <w:sz w:val="20"/>
+          <w:szCs w:val="20"/>
+        </w:rPr>
+        <w:t xml:space="preserve"> or none. This required us to implement contingency steps so the scraping process could handle missing pages </w:t>
+      </w:r>
+      <w:r>
+        <w:rPr>
+          <w:rStyle w:val="normaltextrun"/>
+          <w:rFonts w:ascii="Arial" w:hAnsi="Arial" w:cs="Arial"/>
+          <w:color w:val="000000"/>
+          <w:sz w:val="20"/>
+          <w:szCs w:val="20"/>
+        </w:rPr>
+        <w:t>or limit excessive scrapping</w:t>
+      </w:r>
+      <w:r>
+        <w:rPr>
+          <w:rStyle w:val="normaltextrun"/>
+          <w:rFonts w:ascii="Arial" w:hAnsi="Arial" w:cs="Arial"/>
+          <w:color w:val="000000"/>
+          <w:sz w:val="20"/>
+          <w:szCs w:val="20"/>
+        </w:rPr>
+        <w:t xml:space="preserve">. To address this, we ensured that if no listings were found on a page, the </w:t>
+      </w:r>
+      <w:r>
+        <w:rPr>
+          <w:rStyle w:val="normaltextrun"/>
+          <w:rFonts w:ascii="Arial" w:hAnsi="Arial" w:cs="Arial"/>
+          <w:color w:val="000000"/>
+          <w:sz w:val="20"/>
+          <w:szCs w:val="20"/>
+        </w:rPr>
+        <w:t>inner loop is bypassed,</w:t>
+      </w:r>
+      <w:r>
+        <w:rPr>
+          <w:rStyle w:val="normaltextrun"/>
+          <w:rFonts w:ascii="Arial" w:hAnsi="Arial" w:cs="Arial"/>
+          <w:color w:val="000000"/>
+          <w:sz w:val="20"/>
+          <w:szCs w:val="20"/>
+        </w:rPr>
+        <w:t xml:space="preserve"> and</w:t>
+      </w:r>
+      <w:r>
+        <w:rPr>
+          <w:rStyle w:val="normaltextrun"/>
+          <w:rFonts w:ascii="Arial" w:hAnsi="Arial" w:cs="Arial"/>
+          <w:color w:val="000000"/>
+          <w:sz w:val="20"/>
+          <w:szCs w:val="20"/>
+        </w:rPr>
+        <w:t xml:space="preserve"> the code </w:t>
+      </w:r>
+      <w:r>
+        <w:rPr>
+          <w:rStyle w:val="normaltextrun"/>
+          <w:rFonts w:ascii="Arial" w:hAnsi="Arial" w:cs="Arial"/>
+          <w:color w:val="000000"/>
+          <w:sz w:val="20"/>
+          <w:szCs w:val="20"/>
+        </w:rPr>
+        <w:t>continue</w:t>
+      </w:r>
+      <w:r>
+        <w:rPr>
+          <w:rStyle w:val="normaltextrun"/>
+          <w:rFonts w:ascii="Arial" w:hAnsi="Arial" w:cs="Arial"/>
+          <w:color w:val="000000"/>
+          <w:sz w:val="20"/>
+          <w:szCs w:val="20"/>
+        </w:rPr>
+        <w:t>s</w:t>
+      </w:r>
+      <w:r>
+        <w:rPr>
+          <w:rStyle w:val="normaltextrun"/>
+          <w:rFonts w:ascii="Arial" w:hAnsi="Arial" w:cs="Arial"/>
+          <w:color w:val="000000"/>
+          <w:sz w:val="20"/>
+          <w:szCs w:val="20"/>
+        </w:rPr>
+        <w:t xml:space="preserve"> to the next canton.</w:t>
+      </w:r>
+      <w:r>
+        <w:rPr>
+          <w:rStyle w:val="normaltextrun"/>
+          <w:rFonts w:ascii="Arial" w:hAnsi="Arial" w:cs="Arial"/>
+          <w:color w:val="000000"/>
+          <w:sz w:val="20"/>
+          <w:szCs w:val="20"/>
+        </w:rPr>
+        <w:t xml:space="preserve"> Excessive</w:t>
+      </w:r>
+      <w:r>
+        <w:rPr>
+          <w:rStyle w:val="normaltextrun"/>
+          <w:rFonts w:ascii="Arial" w:hAnsi="Arial" w:cs="Arial"/>
+          <w:color w:val="000000"/>
+          <w:sz w:val="20"/>
+          <w:szCs w:val="20"/>
+        </w:rPr>
+        <w:t xml:space="preserve"> scraping</w:t>
+      </w:r>
+      <w:r>
+        <w:rPr>
+          <w:rStyle w:val="normaltextrun"/>
+          <w:rFonts w:ascii="Arial" w:hAnsi="Arial" w:cs="Arial"/>
+          <w:color w:val="000000"/>
+          <w:sz w:val="20"/>
+          <w:szCs w:val="20"/>
+        </w:rPr>
+        <w:t xml:space="preserve"> was prevented</w:t>
+      </w:r>
+      <w:r>
+        <w:rPr>
+          <w:rStyle w:val="normaltextrun"/>
+          <w:rFonts w:ascii="Arial" w:hAnsi="Arial" w:cs="Arial"/>
+          <w:color w:val="000000"/>
+          <w:sz w:val="20"/>
+          <w:szCs w:val="20"/>
+        </w:rPr>
+        <w:t xml:space="preserve">, </w:t>
+      </w:r>
+      <w:r>
+        <w:rPr>
+          <w:rStyle w:val="normaltextrun"/>
+          <w:rFonts w:ascii="Arial" w:hAnsi="Arial" w:cs="Arial"/>
+          <w:color w:val="000000"/>
+          <w:sz w:val="20"/>
+          <w:szCs w:val="20"/>
+        </w:rPr>
+        <w:t>by adding a</w:t>
+      </w:r>
+      <w:r>
+        <w:rPr>
+          <w:rStyle w:val="normaltextrun"/>
+          <w:rFonts w:ascii="Arial" w:hAnsi="Arial" w:cs="Arial"/>
+          <w:color w:val="000000"/>
+          <w:sz w:val="20"/>
+          <w:szCs w:val="20"/>
+        </w:rPr>
+        <w:t xml:space="preserve"> cap </w:t>
+      </w:r>
+      <w:r>
+        <w:rPr>
+          <w:rStyle w:val="normaltextrun"/>
+          <w:rFonts w:ascii="Arial" w:hAnsi="Arial" w:cs="Arial"/>
+          <w:color w:val="000000"/>
+          <w:sz w:val="20"/>
+          <w:szCs w:val="20"/>
+        </w:rPr>
+        <w:t>of</w:t>
+      </w:r>
+      <w:r>
+        <w:rPr>
+          <w:rStyle w:val="normaltextrun"/>
+          <w:rFonts w:ascii="Arial" w:hAnsi="Arial" w:cs="Arial"/>
+          <w:color w:val="000000"/>
+          <w:sz w:val="20"/>
+          <w:szCs w:val="20"/>
+        </w:rPr>
+        <w:t xml:space="preserve"> 20 </w:t>
+      </w:r>
+      <w:r>
+        <w:rPr>
+          <w:rStyle w:val="normaltextrun"/>
+          <w:rFonts w:ascii="Arial" w:hAnsi="Arial" w:cs="Arial"/>
+          <w:color w:val="000000"/>
+          <w:sz w:val="20"/>
+          <w:szCs w:val="20"/>
+        </w:rPr>
+        <w:t xml:space="preserve">pages scrapped </w:t>
+      </w:r>
+      <w:r>
+        <w:rPr>
+          <w:rStyle w:val="normaltextrun"/>
+          <w:rFonts w:ascii="Arial" w:hAnsi="Arial" w:cs="Arial"/>
+          <w:color w:val="000000"/>
+          <w:sz w:val="20"/>
+          <w:szCs w:val="20"/>
+        </w:rPr>
+        <w:t>per canton, as beyond this point it appeared that no new listings were being provided. This allowed us to balance data coverage with computational efficiency.</w:t>
+      </w:r>
+    </w:p>
+    <w:p>
+      <w:pPr>
         <w:pStyle w:val="paragraph"/>
         <w:spacing w:before="0" w:beforeAutospacing="0" w:after="0" w:afterAutospacing="0"/>
         <w:jc w:val="both"/>
@@ -616,124 +1232,88 @@
     </w:p>
     <w:p>
       <w:pPr>
-        <w:pStyle w:val="paragraph"/>
-        <w:spacing w:before="0" w:beforeAutospacing="0" w:after="0" w:afterAutospacing="0"/>
+        <w:pStyle w:val="NormalWeb"/>
         <w:jc w:val="both"/>
-        <w:textAlignment w:val="baseline"/>
-        <w:rPr>
-          <w:rStyle w:val="normaltextrun"/>
-          <w:rFonts w:ascii="Arial" w:hAnsi="Arial" w:cs="Arial"/>
-          <w:color w:val="000000"/>
-          <w:sz w:val="20"/>
-          <w:szCs w:val="20"/>
-        </w:rPr>
-      </w:pPr>
-      <w:r>
-        <w:rPr>
-          <w:rStyle w:val="normaltextrun"/>
-          <w:rFonts w:ascii="Arial" w:hAnsi="Arial" w:cs="Arial"/>
-          <w:color w:val="000000"/>
-          <w:sz w:val="20"/>
-          <w:szCs w:val="20"/>
-        </w:rPr>
-        <w:t xml:space="preserve">Before covering all cantons, we used a subset of the data (Zurich’s first page) to create reusable functions </w:t>
-      </w:r>
-      <w:r>
-        <w:rPr>
-          <w:rStyle w:val="normaltextrun"/>
-          <w:rFonts w:ascii="Arial" w:hAnsi="Arial" w:cs="Arial"/>
-          <w:color w:val="000000"/>
-          <w:sz w:val="20"/>
-          <w:szCs w:val="20"/>
-        </w:rPr>
-        <w:t>to</w:t>
-      </w:r>
-      <w:r>
-        <w:rPr>
-          <w:rStyle w:val="normaltextrun"/>
-          <w:rFonts w:ascii="Arial" w:hAnsi="Arial" w:cs="Arial"/>
-          <w:color w:val="000000"/>
-          <w:sz w:val="20"/>
-          <w:szCs w:val="20"/>
-        </w:rPr>
-        <w:t xml:space="preserve"> process the scraped data and </w:t>
-      </w:r>
-      <w:r>
-        <w:rPr>
-          <w:rStyle w:val="normaltextrun"/>
-          <w:rFonts w:ascii="Arial" w:hAnsi="Arial" w:cs="Arial"/>
-          <w:color w:val="000000"/>
-          <w:sz w:val="20"/>
-          <w:szCs w:val="20"/>
-        </w:rPr>
-        <w:t>ensure a</w:t>
-      </w:r>
-      <w:r>
-        <w:rPr>
-          <w:rStyle w:val="normaltextrun"/>
-          <w:rFonts w:ascii="Arial" w:hAnsi="Arial" w:cs="Arial"/>
-          <w:color w:val="000000"/>
-          <w:sz w:val="20"/>
-          <w:szCs w:val="20"/>
-        </w:rPr>
-        <w:t xml:space="preserve"> concise script when expanding </w:t>
-      </w:r>
-      <w:r>
-        <w:rPr>
-          <w:rStyle w:val="normaltextrun"/>
-          <w:rFonts w:ascii="Arial" w:hAnsi="Arial" w:cs="Arial"/>
-          <w:color w:val="000000"/>
-          <w:sz w:val="20"/>
-          <w:szCs w:val="20"/>
-        </w:rPr>
-        <w:t>the code to all cantons</w:t>
-      </w:r>
-      <w:r>
-        <w:rPr>
-          <w:rStyle w:val="normaltextrun"/>
-          <w:rFonts w:ascii="Arial" w:hAnsi="Arial" w:cs="Arial"/>
-          <w:color w:val="000000"/>
-          <w:sz w:val="20"/>
-          <w:szCs w:val="20"/>
-        </w:rPr>
-        <w:t xml:space="preserve">. These functions </w:t>
-      </w:r>
-      <w:r>
-        <w:rPr>
-          <w:rStyle w:val="normaltextrun"/>
-          <w:rFonts w:ascii="Arial" w:hAnsi="Arial" w:cs="Arial"/>
-          <w:color w:val="000000"/>
-          <w:sz w:val="20"/>
-          <w:szCs w:val="20"/>
-        </w:rPr>
-        <w:t>serve to</w:t>
-      </w:r>
-      <w:r>
-        <w:rPr>
-          <w:rStyle w:val="normaltextrun"/>
-          <w:rFonts w:ascii="Arial" w:hAnsi="Arial" w:cs="Arial"/>
-          <w:color w:val="000000"/>
-          <w:sz w:val="20"/>
-          <w:szCs w:val="20"/>
-        </w:rPr>
-        <w:t xml:space="preserve"> extract the relevant housing variables (price, living area, number of rooms, and location) </w:t>
-      </w:r>
-      <w:r>
-        <w:rPr>
-          <w:rStyle w:val="normaltextrun"/>
-          <w:rFonts w:ascii="Arial" w:hAnsi="Arial" w:cs="Arial"/>
-          <w:color w:val="000000"/>
-          <w:sz w:val="20"/>
-          <w:szCs w:val="20"/>
-        </w:rPr>
-        <w:lastRenderedPageBreak/>
-        <w:t>for each listing and ensure consistency across all records.</w:t>
-      </w:r>
-      <w:r>
-        <w:rPr>
-          <w:rStyle w:val="normaltextrun"/>
-          <w:rFonts w:ascii="Arial" w:hAnsi="Arial" w:cs="Arial"/>
-          <w:color w:val="000000"/>
+        <w:rPr>
+          <w:rStyle w:val="normaltextrun"/>
+          <w:rFonts w:ascii="Arial" w:hAnsi="Arial" w:cs="Arial"/>
+          <w:color w:val="EE0000"/>
+          <w:sz w:val="20"/>
+          <w:szCs w:val="20"/>
+        </w:rPr>
+      </w:pPr>
+      <w:r>
+        <w:rPr>
+          <w:rStyle w:val="normaltextrun"/>
+          <w:rFonts w:ascii="Arial" w:hAnsi="Arial" w:cs="Arial"/>
+          <w:color w:val="000000"/>
+          <w:sz w:val="20"/>
+          <w:szCs w:val="20"/>
+        </w:rPr>
+        <w:t>After validating the scraping logic</w:t>
+      </w:r>
+      <w:r>
+        <w:rPr>
+          <w:rStyle w:val="normaltextrun"/>
+          <w:rFonts w:ascii="Arial" w:hAnsi="Arial" w:cs="Arial"/>
+          <w:color w:val="000000"/>
+          <w:sz w:val="20"/>
+          <w:szCs w:val="20"/>
+        </w:rPr>
+        <w:t>, the nested loop was fully implemented.</w:t>
+      </w:r>
+      <w:r>
+        <w:rPr>
+          <w:rStyle w:val="normaltextrun"/>
+          <w:rFonts w:ascii="Arial" w:hAnsi="Arial" w:cs="Arial"/>
+          <w:color w:val="000000"/>
+          <w:sz w:val="20"/>
+          <w:szCs w:val="20"/>
+        </w:rPr>
+        <w:t xml:space="preserve"> T</w:t>
+      </w:r>
+      <w:r>
+        <w:rPr>
+          <w:rStyle w:val="normaltextrun"/>
+          <w:rFonts w:ascii="Arial" w:hAnsi="Arial" w:cs="Arial"/>
+          <w:color w:val="000000"/>
+          <w:sz w:val="20"/>
+          <w:szCs w:val="20"/>
+        </w:rPr>
+        <w:t>he</w:t>
+      </w:r>
+      <w:r>
+        <w:rPr>
+          <w:rStyle w:val="normaltextrun"/>
+          <w:rFonts w:ascii="Arial" w:hAnsi="Arial" w:cs="Arial"/>
+          <w:color w:val="000000"/>
+          <w:sz w:val="20"/>
+          <w:szCs w:val="20"/>
+        </w:rPr>
+        <w:t xml:space="preserve"> outer loop iterates through the canton mapping dictionary, while the inner loop processes each listing. </w:t>
+      </w:r>
+      <w:r>
+        <w:rPr>
+          <w:rFonts w:ascii="Arial" w:hAnsi="Arial" w:cs="Arial"/>
+          <w:color w:val="EE0000"/>
+          <w:sz w:val="20"/>
+          <w:szCs w:val="20"/>
+        </w:rPr>
+        <w:t xml:space="preserve">Listings were identified using anchor elements within each listing card, which consistently contained the unique listing URLs and served as a stable reference point across </w:t>
+      </w:r>
+      <w:r>
+        <w:rPr>
+          <w:rFonts w:ascii="Arial" w:hAnsi="Arial" w:cs="Arial"/>
+          <w:color w:val="EE0000"/>
+          <w:sz w:val="20"/>
+          <w:szCs w:val="20"/>
+        </w:rPr>
+        <w:t>pages.</w:t>
+      </w:r>
+      <w:r>
+        <w:rPr>
+          <w:rFonts w:ascii="Arial" w:hAnsi="Arial" w:cs="Arial"/>
+          <w:color w:val="EE0000"/>
           <w:sz w:val="20"/>
           <w:szCs w:val="20"/>
         </w:rPr>
@@ -741,113 +1321,26 @@
       </w:r>
       <w:r>
         <w:rPr>
-          <w:rStyle w:val="normaltextrun"/>
-          <w:rFonts w:ascii="Arial" w:hAnsi="Arial" w:cs="Arial"/>
-          <w:color w:val="000000"/>
-          <w:sz w:val="20"/>
-          <w:szCs w:val="20"/>
-        </w:rPr>
-        <w:t xml:space="preserve">Housing variables were embedded in unstructured text and required the use of the </w:t>
-      </w:r>
-      <w:r>
-        <w:rPr>
-          <w:rStyle w:val="normaltextrun"/>
-          <w:rFonts w:ascii="Courier New" w:hAnsi="Courier New" w:cs="Courier New"/>
-          <w:i/>
-          <w:iCs/>
-          <w:color w:val="000000"/>
-          <w:sz w:val="18"/>
-          <w:szCs w:val="18"/>
-        </w:rPr>
-        <w:t>re</w:t>
-      </w:r>
-      <w:r>
-        <w:rPr>
-          <w:rStyle w:val="normaltextrun"/>
-          <w:rFonts w:ascii="Arial" w:hAnsi="Arial" w:cs="Arial"/>
-          <w:color w:val="000000"/>
-          <w:sz w:val="20"/>
-          <w:szCs w:val="20"/>
-        </w:rPr>
-        <w:t xml:space="preserve"> package to apply regular expressions for extraction and cleaning. The initial parsing attempts contained a significant </w:t>
-      </w:r>
-      <w:r>
-        <w:rPr>
-          <w:rStyle w:val="normaltextrun"/>
-          <w:rFonts w:ascii="Arial" w:hAnsi="Arial" w:cs="Arial"/>
-          <w:color w:val="000000"/>
-          <w:sz w:val="20"/>
-          <w:szCs w:val="20"/>
-        </w:rPr>
-        <w:t>number</w:t>
-      </w:r>
-      <w:r>
-        <w:rPr>
-          <w:rStyle w:val="normaltextrun"/>
-          <w:rFonts w:ascii="Arial" w:hAnsi="Arial" w:cs="Arial"/>
-          <w:color w:val="000000"/>
-          <w:sz w:val="20"/>
-          <w:szCs w:val="20"/>
-        </w:rPr>
-        <w:t xml:space="preserve"> of</w:t>
-      </w:r>
-      <w:r>
-        <w:rPr>
-          <w:rStyle w:val="normaltextrun"/>
-          <w:rFonts w:ascii="Arial" w:hAnsi="Arial" w:cs="Arial"/>
-          <w:color w:val="000000"/>
-          <w:sz w:val="20"/>
-          <w:szCs w:val="20"/>
-        </w:rPr>
-        <w:t xml:space="preserve"> missing values, which led us to believe that some variables were stored differently across listings. For example, for price, we initially searched for text matching “CHF” followed by digits, commas, and periods. After extracting with this pattern only, we still had many missing prices, which led us to inspect the source code again with the support of </w:t>
-      </w:r>
-      <w:r>
-        <w:rPr>
-          <w:rStyle w:val="normaltextrun"/>
-          <w:rFonts w:ascii="Arial" w:hAnsi="Arial" w:cs="Arial"/>
-          <w:color w:val="000000"/>
-          <w:sz w:val="20"/>
-          <w:szCs w:val="20"/>
-        </w:rPr>
-        <w:t>AI</w:t>
-      </w:r>
-      <w:r>
-        <w:rPr>
-          <w:rStyle w:val="normaltextrun"/>
-          <w:rFonts w:ascii="Arial" w:hAnsi="Arial" w:cs="Arial"/>
-          <w:color w:val="000000"/>
-          <w:sz w:val="20"/>
-          <w:szCs w:val="20"/>
-        </w:rPr>
-        <w:t xml:space="preserve">. This helped us identify that some prices used single quotes (‘) as a thousand separator rather than commas. Adding this extra character increased our price coverage by </w:t>
-      </w:r>
-      <w:r>
-        <w:rPr>
-          <w:rStyle w:val="normaltextrun"/>
-          <w:rFonts w:ascii="Arial" w:hAnsi="Arial" w:cs="Arial"/>
-          <w:b/>
-          <w:bCs/>
+          <w:rFonts w:ascii="Arial" w:hAnsi="Arial" w:cs="Arial"/>
           <w:color w:val="EE0000"/>
           <w:sz w:val="20"/>
           <w:szCs w:val="20"/>
         </w:rPr>
-        <w:t>x%</w:t>
-      </w:r>
-      <w:r>
-        <w:rPr>
-          <w:rStyle w:val="normaltextrun"/>
-          <w:rFonts w:ascii="Arial" w:hAnsi="Arial" w:cs="Arial"/>
-          <w:color w:val="000000"/>
-          <w:sz w:val="20"/>
-          <w:szCs w:val="20"/>
-        </w:rPr>
-        <w:t>.</w:t>
-      </w:r>
-      <w:r>
-        <w:rPr>
-          <w:rStyle w:val="normaltextrun"/>
-          <w:rFonts w:ascii="Arial" w:hAnsi="Arial" w:cs="Arial"/>
-          <w:color w:val="000000"/>
+        <w:t xml:space="preserve">Once identified, the full text content of each listing card was </w:t>
+      </w:r>
+      <w:r>
+        <w:rPr>
+          <w:rFonts w:ascii="Arial" w:hAnsi="Arial" w:cs="Arial"/>
+          <w:color w:val="EE0000"/>
+          <w:sz w:val="20"/>
+          <w:szCs w:val="20"/>
+        </w:rPr>
+        <w:t>extracted and passed</w:t>
+      </w:r>
+      <w:r>
+        <w:rPr>
+          <w:rFonts w:ascii="Arial" w:hAnsi="Arial" w:cs="Arial"/>
+          <w:color w:val="EE0000"/>
           <w:sz w:val="20"/>
           <w:szCs w:val="20"/>
         </w:rPr>
@@ -855,443 +1348,57 @@
       </w:r>
       <w:r>
         <w:rPr>
-          <w:rStyle w:val="normaltextrun"/>
-          <w:rFonts w:ascii="Arial" w:hAnsi="Arial" w:cs="Arial"/>
-          <w:color w:val="000000"/>
-          <w:sz w:val="20"/>
-          <w:szCs w:val="20"/>
-        </w:rPr>
-        <w:t>The variable</w:t>
-      </w:r>
-      <w:r>
-        <w:rPr>
-          <w:rStyle w:val="normaltextrun"/>
-          <w:rFonts w:ascii="Arial" w:hAnsi="Arial" w:cs="Arial"/>
-          <w:color w:val="000000"/>
-          <w:sz w:val="20"/>
-          <w:szCs w:val="20"/>
-        </w:rPr>
-        <w:t xml:space="preserve">-extraction-functions </w:t>
-      </w:r>
-      <w:r>
-        <w:rPr>
-          <w:rStyle w:val="normaltextrun"/>
-          <w:rFonts w:ascii="Arial" w:hAnsi="Arial" w:cs="Arial"/>
-          <w:color w:val="000000"/>
-          <w:sz w:val="20"/>
-          <w:szCs w:val="20"/>
-        </w:rPr>
-        <w:t>were refined by</w:t>
-      </w:r>
-      <w:r>
-        <w:rPr>
-          <w:rStyle w:val="normaltextrun"/>
-          <w:rFonts w:ascii="Arial" w:hAnsi="Arial" w:cs="Arial"/>
-          <w:color w:val="000000"/>
-          <w:sz w:val="20"/>
-          <w:szCs w:val="20"/>
-        </w:rPr>
-        <w:t xml:space="preserve"> testing several iterations </w:t>
-      </w:r>
-      <w:r>
-        <w:rPr>
-          <w:rStyle w:val="normaltextrun"/>
-          <w:rFonts w:ascii="Arial" w:hAnsi="Arial" w:cs="Arial"/>
-          <w:color w:val="000000"/>
-          <w:sz w:val="20"/>
-          <w:szCs w:val="20"/>
-        </w:rPr>
-        <w:t>and evaluating the completeness of the results after each iteration.</w:t>
-      </w:r>
-      <w:r>
-        <w:rPr>
-          <w:rStyle w:val="normaltextrun"/>
-          <w:rFonts w:ascii="Arial" w:hAnsi="Arial" w:cs="Arial"/>
-          <w:color w:val="000000"/>
+          <w:rStyle w:val="Gl"/>
+          <w:rFonts w:ascii="Arial" w:eastAsiaTheme="majorEastAsia" w:hAnsi="Arial" w:cs="Arial"/>
+          <w:b w:val="0"/>
+          <w:bCs w:val="0"/>
+          <w:color w:val="EE0000"/>
+          <w:sz w:val="20"/>
+          <w:szCs w:val="20"/>
+        </w:rPr>
+        <w:t>through</w:t>
+      </w:r>
+      <w:r>
+        <w:rPr>
+          <w:rStyle w:val="apple-converted-space"/>
+          <w:rFonts w:ascii="Arial" w:eastAsiaTheme="majorEastAsia" w:hAnsi="Arial" w:cs="Arial"/>
+          <w:color w:val="EE0000"/>
+          <w:sz w:val="20"/>
+          <w:szCs w:val="20"/>
+        </w:rPr>
+        <w:t> </w:t>
+      </w:r>
+      <w:r>
+        <w:rPr>
+          <w:rFonts w:ascii="Arial" w:hAnsi="Arial" w:cs="Arial"/>
+          <w:color w:val="EE0000"/>
+          <w:sz w:val="20"/>
+          <w:szCs w:val="20"/>
+        </w:rPr>
+        <w:t>the parsing functions</w:t>
+      </w:r>
+      <w:r>
+        <w:rPr>
+          <w:rFonts w:ascii="Arial" w:hAnsi="Arial" w:cs="Arial"/>
+          <w:color w:val="EE0000"/>
           <w:sz w:val="20"/>
           <w:szCs w:val="20"/>
         </w:rPr>
         <w:t xml:space="preserve"> </w:t>
       </w:r>
-    </w:p>
-    <w:p>
-      <w:pPr>
-        <w:pStyle w:val="paragraph"/>
-        <w:spacing w:before="0" w:beforeAutospacing="0" w:after="0" w:afterAutospacing="0"/>
-        <w:jc w:val="both"/>
-        <w:textAlignment w:val="baseline"/>
-        <w:rPr>
-          <w:rStyle w:val="normaltextrun"/>
-          <w:rFonts w:ascii="Arial" w:hAnsi="Arial" w:cs="Arial"/>
-          <w:color w:val="000000"/>
-          <w:sz w:val="20"/>
-          <w:szCs w:val="20"/>
-        </w:rPr>
-      </w:pPr>
-    </w:p>
-    <w:p>
-      <w:pPr>
-        <w:pStyle w:val="paragraph"/>
-        <w:spacing w:before="0" w:beforeAutospacing="0" w:after="0" w:afterAutospacing="0"/>
-        <w:jc w:val="both"/>
-        <w:textAlignment w:val="baseline"/>
-        <w:rPr>
-          <w:rStyle w:val="normaltextrun"/>
-          <w:rFonts w:ascii="Arial" w:hAnsi="Arial" w:cs="Arial"/>
-          <w:color w:val="000000"/>
-          <w:sz w:val="20"/>
-          <w:szCs w:val="20"/>
-        </w:rPr>
-      </w:pPr>
-      <w:r>
-        <w:rPr>
-          <w:rStyle w:val="normaltextrun"/>
-          <w:rFonts w:ascii="Arial" w:hAnsi="Arial" w:cs="Arial"/>
-          <w:color w:val="000000"/>
-          <w:sz w:val="20"/>
-          <w:szCs w:val="20"/>
-        </w:rPr>
-        <w:t>Once we understood the behavior of the code for one page, we proceeded to expand it to all cantons. We achieved this by creating a nested loop, where the outer loop scrapes each canton’s webpage and the inner loop extracts the housing variables for each listing. The first challenge we encountered for the outer loop was that naming conventions for each canton were inconsistent in terms of capitalization and use of special characters. We therefore created a dictionary to ensure the canton name matched exactly the pattern used on the immobilier.ch website.</w:t>
-      </w:r>
-      <w:r>
-        <w:rPr>
-          <w:rStyle w:val="normaltextrun"/>
-          <w:rFonts w:ascii="Arial" w:hAnsi="Arial" w:cs="Arial"/>
-          <w:color w:val="000000"/>
-          <w:sz w:val="20"/>
-          <w:szCs w:val="20"/>
-        </w:rPr>
-        <w:t xml:space="preserve"> Additionally</w:t>
-      </w:r>
-      <w:r>
-        <w:rPr>
-          <w:rStyle w:val="normaltextrun"/>
-          <w:rFonts w:ascii="Arial" w:hAnsi="Arial" w:cs="Arial"/>
-          <w:color w:val="000000"/>
-          <w:sz w:val="20"/>
-          <w:szCs w:val="20"/>
-        </w:rPr>
-        <w:t xml:space="preserve"> listing availability</w:t>
-      </w:r>
-      <w:r>
-        <w:rPr>
-          <w:rStyle w:val="normaltextrun"/>
-          <w:rFonts w:ascii="Arial" w:hAnsi="Arial" w:cs="Arial"/>
-          <w:color w:val="000000"/>
-          <w:sz w:val="20"/>
-          <w:szCs w:val="20"/>
-        </w:rPr>
-        <w:t xml:space="preserve"> differed among regions</w:t>
-      </w:r>
-      <w:r>
-        <w:rPr>
-          <w:rStyle w:val="normaltextrun"/>
-          <w:rFonts w:ascii="Arial" w:hAnsi="Arial" w:cs="Arial"/>
-          <w:color w:val="000000"/>
-          <w:sz w:val="20"/>
-          <w:szCs w:val="20"/>
-        </w:rPr>
-        <w:t>. While some cantons had multiple pages, each containing 23 listings, others had only a few</w:t>
-      </w:r>
-      <w:r>
-        <w:rPr>
-          <w:rStyle w:val="normaltextrun"/>
-          <w:rFonts w:ascii="Arial" w:hAnsi="Arial" w:cs="Arial"/>
-          <w:color w:val="000000"/>
-          <w:sz w:val="20"/>
-          <w:szCs w:val="20"/>
-        </w:rPr>
-        <w:t xml:space="preserve"> listings</w:t>
-      </w:r>
-      <w:r>
-        <w:rPr>
-          <w:rStyle w:val="normaltextrun"/>
-          <w:rFonts w:ascii="Arial" w:hAnsi="Arial" w:cs="Arial"/>
-          <w:color w:val="000000"/>
-          <w:sz w:val="20"/>
-          <w:szCs w:val="20"/>
-        </w:rPr>
-        <w:t xml:space="preserve"> or none. This required us to implement contingency steps so the scraping process could handle missing pages </w:t>
-      </w:r>
-      <w:r>
-        <w:rPr>
-          <w:rStyle w:val="normaltextrun"/>
-          <w:rFonts w:ascii="Arial" w:hAnsi="Arial" w:cs="Arial"/>
-          <w:color w:val="000000"/>
-          <w:sz w:val="20"/>
-          <w:szCs w:val="20"/>
-        </w:rPr>
-        <w:t>or limit excessive scrapping</w:t>
-      </w:r>
-      <w:r>
-        <w:rPr>
-          <w:rStyle w:val="normaltextrun"/>
-          <w:rFonts w:ascii="Arial" w:hAnsi="Arial" w:cs="Arial"/>
-          <w:color w:val="000000"/>
-          <w:sz w:val="20"/>
-          <w:szCs w:val="20"/>
-        </w:rPr>
-        <w:t xml:space="preserve">. To address this, we ensured that if no listings were found on a page, the </w:t>
-      </w:r>
-      <w:r>
-        <w:rPr>
-          <w:rStyle w:val="normaltextrun"/>
-          <w:rFonts w:ascii="Arial" w:hAnsi="Arial" w:cs="Arial"/>
-          <w:color w:val="000000"/>
-          <w:sz w:val="20"/>
-          <w:szCs w:val="20"/>
-        </w:rPr>
-        <w:t>inner loop is bypassed,</w:t>
-      </w:r>
-      <w:r>
-        <w:rPr>
-          <w:rStyle w:val="normaltextrun"/>
-          <w:rFonts w:ascii="Arial" w:hAnsi="Arial" w:cs="Arial"/>
-          <w:color w:val="000000"/>
-          <w:sz w:val="20"/>
-          <w:szCs w:val="20"/>
-        </w:rPr>
-        <w:t xml:space="preserve"> and</w:t>
-      </w:r>
-      <w:r>
-        <w:rPr>
-          <w:rStyle w:val="normaltextrun"/>
-          <w:rFonts w:ascii="Arial" w:hAnsi="Arial" w:cs="Arial"/>
-          <w:color w:val="000000"/>
-          <w:sz w:val="20"/>
-          <w:szCs w:val="20"/>
-        </w:rPr>
-        <w:t xml:space="preserve"> the code </w:t>
-      </w:r>
-      <w:r>
-        <w:rPr>
-          <w:rStyle w:val="normaltextrun"/>
-          <w:rFonts w:ascii="Arial" w:hAnsi="Arial" w:cs="Arial"/>
-          <w:color w:val="000000"/>
-          <w:sz w:val="20"/>
-          <w:szCs w:val="20"/>
-        </w:rPr>
-        <w:t>continue</w:t>
-      </w:r>
-      <w:r>
-        <w:rPr>
-          <w:rStyle w:val="normaltextrun"/>
-          <w:rFonts w:ascii="Arial" w:hAnsi="Arial" w:cs="Arial"/>
-          <w:color w:val="000000"/>
-          <w:sz w:val="20"/>
-          <w:szCs w:val="20"/>
-        </w:rPr>
-        <w:t>s</w:t>
-      </w:r>
-      <w:r>
-        <w:rPr>
-          <w:rStyle w:val="normaltextrun"/>
-          <w:rFonts w:ascii="Arial" w:hAnsi="Arial" w:cs="Arial"/>
-          <w:color w:val="000000"/>
-          <w:sz w:val="20"/>
-          <w:szCs w:val="20"/>
-        </w:rPr>
-        <w:t xml:space="preserve"> to the next canton.</w:t>
-      </w:r>
-      <w:r>
-        <w:rPr>
-          <w:rStyle w:val="normaltextrun"/>
-          <w:rFonts w:ascii="Arial" w:hAnsi="Arial" w:cs="Arial"/>
-          <w:color w:val="000000"/>
-          <w:sz w:val="20"/>
-          <w:szCs w:val="20"/>
-        </w:rPr>
-        <w:t xml:space="preserve"> Excessive</w:t>
-      </w:r>
-      <w:r>
-        <w:rPr>
-          <w:rStyle w:val="normaltextrun"/>
-          <w:rFonts w:ascii="Arial" w:hAnsi="Arial" w:cs="Arial"/>
-          <w:color w:val="000000"/>
-          <w:sz w:val="20"/>
-          <w:szCs w:val="20"/>
-        </w:rPr>
-        <w:t xml:space="preserve"> scraping</w:t>
-      </w:r>
-      <w:r>
-        <w:rPr>
-          <w:rStyle w:val="normaltextrun"/>
-          <w:rFonts w:ascii="Arial" w:hAnsi="Arial" w:cs="Arial"/>
-          <w:color w:val="000000"/>
-          <w:sz w:val="20"/>
-          <w:szCs w:val="20"/>
-        </w:rPr>
-        <w:t xml:space="preserve"> was prevented</w:t>
-      </w:r>
-      <w:r>
-        <w:rPr>
-          <w:rStyle w:val="normaltextrun"/>
-          <w:rFonts w:ascii="Arial" w:hAnsi="Arial" w:cs="Arial"/>
-          <w:color w:val="000000"/>
-          <w:sz w:val="20"/>
-          <w:szCs w:val="20"/>
-        </w:rPr>
-        <w:t xml:space="preserve">, </w:t>
-      </w:r>
-      <w:r>
-        <w:rPr>
-          <w:rStyle w:val="normaltextrun"/>
-          <w:rFonts w:ascii="Arial" w:hAnsi="Arial" w:cs="Arial"/>
-          <w:color w:val="000000"/>
-          <w:sz w:val="20"/>
-          <w:szCs w:val="20"/>
-        </w:rPr>
-        <w:t>by adding a</w:t>
-      </w:r>
-      <w:r>
-        <w:rPr>
-          <w:rStyle w:val="normaltextrun"/>
-          <w:rFonts w:ascii="Arial" w:hAnsi="Arial" w:cs="Arial"/>
-          <w:color w:val="000000"/>
-          <w:sz w:val="20"/>
-          <w:szCs w:val="20"/>
-        </w:rPr>
-        <w:t xml:space="preserve"> cap </w:t>
-      </w:r>
-      <w:r>
-        <w:rPr>
-          <w:rStyle w:val="normaltextrun"/>
-          <w:rFonts w:ascii="Arial" w:hAnsi="Arial" w:cs="Arial"/>
-          <w:color w:val="000000"/>
-          <w:sz w:val="20"/>
-          <w:szCs w:val="20"/>
-        </w:rPr>
-        <w:t>of</w:t>
-      </w:r>
-      <w:r>
-        <w:rPr>
-          <w:rStyle w:val="normaltextrun"/>
-          <w:rFonts w:ascii="Arial" w:hAnsi="Arial" w:cs="Arial"/>
-          <w:color w:val="000000"/>
-          <w:sz w:val="20"/>
-          <w:szCs w:val="20"/>
-        </w:rPr>
-        <w:t xml:space="preserve"> 20 </w:t>
-      </w:r>
-      <w:r>
-        <w:rPr>
-          <w:rStyle w:val="normaltextrun"/>
-          <w:rFonts w:ascii="Arial" w:hAnsi="Arial" w:cs="Arial"/>
-          <w:color w:val="000000"/>
-          <w:sz w:val="20"/>
-          <w:szCs w:val="20"/>
-        </w:rPr>
-        <w:t xml:space="preserve">pages scrapped </w:t>
-      </w:r>
-      <w:r>
-        <w:rPr>
-          <w:rStyle w:val="normaltextrun"/>
-          <w:rFonts w:ascii="Arial" w:hAnsi="Arial" w:cs="Arial"/>
-          <w:color w:val="000000"/>
-          <w:sz w:val="20"/>
-          <w:szCs w:val="20"/>
-        </w:rPr>
-        <w:t>per canton, as beyond this point it appeared that no new listings were being provided. This allowed us to balance data coverage with computational efficiency.</w:t>
-      </w:r>
-    </w:p>
-    <w:p>
-      <w:pPr>
-        <w:pStyle w:val="paragraph"/>
-        <w:spacing w:before="0" w:beforeAutospacing="0" w:after="0" w:afterAutospacing="0"/>
-        <w:jc w:val="both"/>
-        <w:textAlignment w:val="baseline"/>
-        <w:rPr>
-          <w:rStyle w:val="normaltextrun"/>
-          <w:rFonts w:ascii="Arial" w:hAnsi="Arial" w:cs="Arial"/>
-          <w:color w:val="000000"/>
-          <w:sz w:val="20"/>
-          <w:szCs w:val="20"/>
-        </w:rPr>
-      </w:pPr>
-    </w:p>
-    <w:p>
-      <w:pPr>
-        <w:pStyle w:val="paragraph"/>
-        <w:spacing w:before="0" w:beforeAutospacing="0" w:after="0" w:afterAutospacing="0"/>
-        <w:jc w:val="both"/>
-        <w:textAlignment w:val="baseline"/>
-        <w:rPr>
-          <w:rStyle w:val="normaltextrun"/>
-          <w:rFonts w:ascii="Arial" w:hAnsi="Arial" w:cs="Arial"/>
-          <w:color w:val="000000"/>
-          <w:sz w:val="20"/>
-          <w:szCs w:val="20"/>
-        </w:rPr>
-      </w:pPr>
-      <w:r>
-        <w:rPr>
-          <w:rStyle w:val="normaltextrun"/>
-          <w:rFonts w:ascii="Arial" w:hAnsi="Arial" w:cs="Arial"/>
-          <w:color w:val="000000"/>
-          <w:sz w:val="20"/>
-          <w:szCs w:val="20"/>
-        </w:rPr>
-        <w:t>After validating the scrapping logic</w:t>
-      </w:r>
-      <w:r>
-        <w:rPr>
-          <w:rStyle w:val="normaltextrun"/>
-          <w:rFonts w:ascii="Arial" w:hAnsi="Arial" w:cs="Arial"/>
-          <w:color w:val="000000"/>
-          <w:sz w:val="20"/>
-          <w:szCs w:val="20"/>
-        </w:rPr>
-        <w:t xml:space="preserve">, the nested loop was fully implemented. </w:t>
-      </w:r>
-      <w:r>
-        <w:rPr>
-          <w:rStyle w:val="normaltextrun"/>
-          <w:rFonts w:ascii="Arial" w:hAnsi="Arial" w:cs="Arial"/>
-          <w:color w:val="000000"/>
-          <w:sz w:val="20"/>
-          <w:szCs w:val="20"/>
-        </w:rPr>
-        <w:t xml:space="preserve">Before running the loop, we initialized the WebDriver session using </w:t>
-      </w:r>
-      <w:proofErr w:type="spellStart"/>
-      <w:proofErr w:type="gramStart"/>
-      <w:r>
-        <w:rPr>
-          <w:rStyle w:val="normaltextrun"/>
-          <w:rFonts w:ascii="Courier New" w:hAnsi="Courier New" w:cs="Courier New"/>
-          <w:color w:val="000000"/>
-          <w:sz w:val="18"/>
-          <w:szCs w:val="18"/>
-        </w:rPr>
-        <w:t>webdriver.Chrome</w:t>
-      </w:r>
-      <w:proofErr w:type="spellEnd"/>
-      <w:proofErr w:type="gramEnd"/>
-      <w:r>
-        <w:rPr>
-          <w:rStyle w:val="normaltextrun"/>
-          <w:rFonts w:ascii="Courier New" w:hAnsi="Courier New" w:cs="Courier New"/>
-          <w:color w:val="000000"/>
-          <w:sz w:val="18"/>
-          <w:szCs w:val="18"/>
-        </w:rPr>
-        <w:t>()</w:t>
-      </w:r>
-      <w:r>
-        <w:rPr>
-          <w:rStyle w:val="normaltextrun"/>
-          <w:rFonts w:ascii="Arial" w:hAnsi="Arial" w:cs="Arial"/>
-          <w:color w:val="000000"/>
-          <w:sz w:val="20"/>
-          <w:szCs w:val="20"/>
-        </w:rPr>
-        <w:t>.</w:t>
-      </w:r>
-      <w:r>
-        <w:rPr>
-          <w:rStyle w:val="normaltextrun"/>
-          <w:rFonts w:ascii="Arial" w:hAnsi="Arial" w:cs="Arial"/>
-          <w:color w:val="000000"/>
+      <w:r>
+        <w:rPr>
+          <w:rFonts w:ascii="Arial" w:hAnsi="Arial" w:cs="Arial"/>
+          <w:color w:val="EE0000"/>
+          <w:sz w:val="20"/>
+          <w:szCs w:val="20"/>
+        </w:rPr>
+        <w:t>defined earlier.</w:t>
+      </w:r>
+      <w:r>
+        <w:rPr>
+          <w:rFonts w:ascii="Arial" w:hAnsi="Arial" w:cs="Arial"/>
+          <w:color w:val="EE0000"/>
           <w:sz w:val="20"/>
           <w:szCs w:val="20"/>
         </w:rPr>
@@ -1299,39 +1406,34 @@
       </w:r>
       <w:r>
         <w:rPr>
-          <w:rStyle w:val="normaltextrun"/>
-          <w:rFonts w:ascii="Arial" w:hAnsi="Arial" w:cs="Arial"/>
-          <w:color w:val="000000"/>
-          <w:sz w:val="20"/>
-          <w:szCs w:val="20"/>
-        </w:rPr>
-        <w:t>The</w:t>
-      </w:r>
-      <w:r>
-        <w:rPr>
-          <w:rStyle w:val="normaltextrun"/>
-          <w:rFonts w:ascii="Arial" w:hAnsi="Arial" w:cs="Arial"/>
-          <w:color w:val="000000"/>
-          <w:sz w:val="20"/>
-          <w:szCs w:val="20"/>
-        </w:rPr>
-        <w:t>n the</w:t>
-      </w:r>
-      <w:r>
-        <w:rPr>
-          <w:rStyle w:val="normaltextrun"/>
-          <w:rFonts w:ascii="Arial" w:hAnsi="Arial" w:cs="Arial"/>
-          <w:color w:val="000000"/>
-          <w:sz w:val="20"/>
-          <w:szCs w:val="20"/>
-        </w:rPr>
-        <w:t xml:space="preserve"> outer loop iterates through the canton mapping dictionary, while the inner loop processes each listing. We used the price title element to identify listings</w:t>
-      </w:r>
-      <w:r>
-        <w:rPr>
-          <w:rStyle w:val="normaltextrun"/>
-          <w:rFonts w:ascii="Arial" w:hAnsi="Arial" w:cs="Arial"/>
-          <w:color w:val="000000"/>
+          <w:rFonts w:ascii="Arial" w:hAnsi="Arial" w:cs="Arial"/>
+          <w:color w:val="EE0000"/>
+          <w:sz w:val="20"/>
+          <w:szCs w:val="20"/>
+        </w:rPr>
+        <w:t>To ensure data quality, a URL-based tracking mechanism (</w:t>
+      </w:r>
+      <w:r>
+        <w:rPr>
+          <w:rStyle w:val="HTMLKodu"/>
+          <w:rFonts w:ascii="Arial" w:eastAsiaTheme="majorEastAsia" w:hAnsi="Arial" w:cs="Arial"/>
+          <w:color w:val="EE0000"/>
+        </w:rPr>
+        <w:t>seen_urls</w:t>
+      </w:r>
+      <w:r>
+        <w:rPr>
+          <w:rFonts w:ascii="Arial" w:hAnsi="Arial" w:cs="Arial"/>
+          <w:color w:val="EE0000"/>
+          <w:sz w:val="20"/>
+          <w:szCs w:val="20"/>
+        </w:rPr>
+        <w:t>) was implemented to avoid duplicate entries. Additionally, the script detects repeated pages and stops the scraping process when no new listings are found, preventing infinite loops and redundant data collection.</w:t>
+      </w:r>
+      <w:r>
+        <w:rPr>
+          <w:rFonts w:ascii="Arial" w:hAnsi="Arial" w:cs="Arial"/>
+          <w:color w:val="EE0000"/>
           <w:sz w:val="20"/>
           <w:szCs w:val="20"/>
         </w:rPr>
@@ -1339,382 +1441,26 @@
       </w:r>
       <w:r>
         <w:rPr>
-          <w:rStyle w:val="normaltextrun"/>
-          <w:rFonts w:ascii="Arial" w:hAnsi="Arial" w:cs="Arial"/>
-          <w:b/>
-          <w:bCs/>
+          <w:rFonts w:ascii="Arial" w:hAnsi="Arial" w:cs="Arial"/>
           <w:color w:val="EE0000"/>
           <w:sz w:val="20"/>
           <w:szCs w:val="20"/>
         </w:rPr>
-        <w:t>(</w:t>
-      </w:r>
-      <w:r>
-        <w:rPr>
-          <w:rStyle w:val="normaltextrun"/>
-          <w:rFonts w:ascii="Arial" w:hAnsi="Arial" w:cs="Arial"/>
-          <w:b/>
-          <w:bCs/>
+        <w:t>All extracted records were appended to a list and converted into a pandas DataFrame. The final dataset was exported as a CSV file for subsequent analysi</w:t>
+      </w:r>
+      <w:r>
+        <w:rPr>
+          <w:rFonts w:ascii="Arial" w:hAnsi="Arial" w:cs="Arial"/>
           <w:color w:val="EE0000"/>
           <w:sz w:val="20"/>
           <w:szCs w:val="20"/>
         </w:rPr>
-        <w:t>SEDA TO ADD WHY</w:t>
-      </w:r>
-      <w:r>
-        <w:rPr>
-          <w:rStyle w:val="normaltextrun"/>
-          <w:rFonts w:ascii="Arial" w:hAnsi="Arial" w:cs="Arial"/>
-          <w:b/>
-          <w:bCs/>
-          <w:color w:val="EE0000"/>
-          <w:sz w:val="20"/>
-          <w:szCs w:val="20"/>
-        </w:rPr>
-        <w:t>)</w:t>
-      </w:r>
-      <w:r>
-        <w:rPr>
-          <w:rStyle w:val="normaltextrun"/>
-          <w:rFonts w:ascii="Arial" w:hAnsi="Arial" w:cs="Arial"/>
-          <w:color w:val="000000"/>
-          <w:sz w:val="20"/>
-          <w:szCs w:val="20"/>
-        </w:rPr>
-        <w:t>, and once identified, the script extract</w:t>
-      </w:r>
-      <w:r>
-        <w:rPr>
-          <w:rStyle w:val="normaltextrun"/>
-          <w:rFonts w:ascii="Arial" w:hAnsi="Arial" w:cs="Arial"/>
-          <w:color w:val="000000"/>
-          <w:sz w:val="20"/>
-          <w:szCs w:val="20"/>
-        </w:rPr>
-        <w:t>s</w:t>
-      </w:r>
-      <w:r>
-        <w:rPr>
-          <w:rStyle w:val="normaltextrun"/>
-          <w:rFonts w:ascii="Arial" w:hAnsi="Arial" w:cs="Arial"/>
-          <w:color w:val="000000"/>
-          <w:sz w:val="20"/>
-          <w:szCs w:val="20"/>
-        </w:rPr>
-        <w:t xml:space="preserve"> the full text content of the parent container (div). This text</w:t>
-      </w:r>
-      <w:r>
-        <w:rPr>
-          <w:rStyle w:val="normaltextrun"/>
-          <w:rFonts w:ascii="Arial" w:hAnsi="Arial" w:cs="Arial"/>
-          <w:color w:val="000000"/>
-          <w:sz w:val="20"/>
-          <w:szCs w:val="20"/>
-        </w:rPr>
-        <w:t xml:space="preserve"> is</w:t>
-      </w:r>
-      <w:r>
-        <w:rPr>
-          <w:rStyle w:val="normaltextrun"/>
-          <w:rFonts w:ascii="Arial" w:hAnsi="Arial" w:cs="Arial"/>
-          <w:color w:val="000000"/>
-          <w:sz w:val="20"/>
-          <w:szCs w:val="20"/>
-        </w:rPr>
-        <w:t xml:space="preserve"> passed through our parsing functions (</w:t>
-      </w:r>
-      <w:proofErr w:type="spellStart"/>
-      <w:r>
-        <w:rPr>
-          <w:rStyle w:val="normaltextrun"/>
-          <w:rFonts w:ascii="Courier New" w:hAnsi="Courier New" w:cs="Courier New"/>
-          <w:color w:val="000000"/>
-          <w:sz w:val="18"/>
-          <w:szCs w:val="18"/>
-        </w:rPr>
-        <w:t>parse_price</w:t>
-      </w:r>
-      <w:proofErr w:type="spellEnd"/>
-      <w:r>
-        <w:rPr>
-          <w:rStyle w:val="normaltextrun"/>
-          <w:rFonts w:ascii="Courier New" w:hAnsi="Courier New" w:cs="Courier New"/>
-          <w:color w:val="000000"/>
-          <w:sz w:val="18"/>
-          <w:szCs w:val="18"/>
-        </w:rPr>
-        <w:t xml:space="preserve">, </w:t>
-      </w:r>
-      <w:proofErr w:type="spellStart"/>
-      <w:r>
-        <w:rPr>
-          <w:rStyle w:val="normaltextrun"/>
-          <w:rFonts w:ascii="Courier New" w:hAnsi="Courier New" w:cs="Courier New"/>
-          <w:color w:val="000000"/>
-          <w:sz w:val="18"/>
-          <w:szCs w:val="18"/>
-        </w:rPr>
-        <w:t>parse_area</w:t>
-      </w:r>
-      <w:proofErr w:type="spellEnd"/>
-      <w:r>
-        <w:rPr>
-          <w:rStyle w:val="normaltextrun"/>
-          <w:rFonts w:ascii="Courier New" w:hAnsi="Courier New" w:cs="Courier New"/>
-          <w:color w:val="000000"/>
-          <w:sz w:val="18"/>
-          <w:szCs w:val="18"/>
-        </w:rPr>
-        <w:t xml:space="preserve">, </w:t>
-      </w:r>
-      <w:proofErr w:type="spellStart"/>
-      <w:r>
-        <w:rPr>
-          <w:rStyle w:val="normaltextrun"/>
-          <w:rFonts w:ascii="Courier New" w:hAnsi="Courier New" w:cs="Courier New"/>
-          <w:color w:val="000000"/>
-          <w:sz w:val="18"/>
-          <w:szCs w:val="18"/>
-        </w:rPr>
-        <w:t>parse_rooms</w:t>
-      </w:r>
-      <w:proofErr w:type="spellEnd"/>
-      <w:r>
-        <w:rPr>
-          <w:rStyle w:val="normaltextrun"/>
-          <w:rFonts w:ascii="Courier New" w:hAnsi="Courier New" w:cs="Courier New"/>
-          <w:color w:val="000000"/>
-          <w:sz w:val="18"/>
-          <w:szCs w:val="18"/>
-        </w:rPr>
-        <w:t xml:space="preserve">, </w:t>
-      </w:r>
-      <w:r>
-        <w:rPr>
-          <w:rStyle w:val="normaltextrun"/>
-          <w:rFonts w:ascii="Arial" w:hAnsi="Arial" w:cs="Arial"/>
-          <w:color w:val="000000"/>
-          <w:sz w:val="20"/>
-          <w:szCs w:val="20"/>
-        </w:rPr>
-        <w:t xml:space="preserve">and </w:t>
-      </w:r>
-      <w:proofErr w:type="spellStart"/>
-      <w:r>
-        <w:rPr>
-          <w:rStyle w:val="normaltextrun"/>
-          <w:rFonts w:ascii="Courier New" w:hAnsi="Courier New" w:cs="Courier New"/>
-          <w:color w:val="000000"/>
-          <w:sz w:val="18"/>
-          <w:szCs w:val="18"/>
-        </w:rPr>
-        <w:t>parse_location</w:t>
-      </w:r>
-      <w:proofErr w:type="spellEnd"/>
-      <w:r>
-        <w:rPr>
-          <w:rStyle w:val="normaltextrun"/>
-          <w:rFonts w:ascii="Arial" w:hAnsi="Arial" w:cs="Arial"/>
-          <w:color w:val="000000"/>
-          <w:sz w:val="20"/>
-          <w:szCs w:val="20"/>
-        </w:rPr>
-        <w:t xml:space="preserve">) created earlier. All extracted records </w:t>
-      </w:r>
-      <w:r>
-        <w:rPr>
-          <w:rStyle w:val="normaltextrun"/>
-          <w:rFonts w:ascii="Arial" w:hAnsi="Arial" w:cs="Arial"/>
-          <w:color w:val="000000"/>
-          <w:sz w:val="20"/>
-          <w:szCs w:val="20"/>
-        </w:rPr>
-        <w:t>are</w:t>
-      </w:r>
-      <w:r>
-        <w:rPr>
-          <w:rStyle w:val="normaltextrun"/>
-          <w:rFonts w:ascii="Arial" w:hAnsi="Arial" w:cs="Arial"/>
-          <w:color w:val="000000"/>
-          <w:sz w:val="20"/>
-          <w:szCs w:val="20"/>
-        </w:rPr>
-        <w:t xml:space="preserve"> appended to a list called “</w:t>
-      </w:r>
-      <w:proofErr w:type="spellStart"/>
-      <w:r>
-        <w:rPr>
-          <w:rStyle w:val="normaltextrun"/>
-          <w:rFonts w:ascii="Courier New" w:hAnsi="Courier New" w:cs="Courier New"/>
-          <w:color w:val="000000"/>
-          <w:sz w:val="18"/>
-          <w:szCs w:val="18"/>
-        </w:rPr>
-        <w:t>all_rows</w:t>
-      </w:r>
-      <w:proofErr w:type="spellEnd"/>
-      <w:r>
-        <w:rPr>
-          <w:rStyle w:val="normaltextrun"/>
-          <w:rFonts w:ascii="Arial" w:hAnsi="Arial" w:cs="Arial"/>
-          <w:color w:val="000000"/>
-          <w:sz w:val="20"/>
-          <w:szCs w:val="20"/>
-        </w:rPr>
-        <w:t>.”</w:t>
-      </w:r>
-      <w:r>
-        <w:rPr>
-          <w:rStyle w:val="normaltextrun"/>
-          <w:rFonts w:ascii="Arial" w:hAnsi="Arial" w:cs="Arial"/>
-          <w:color w:val="000000"/>
-          <w:sz w:val="20"/>
-          <w:szCs w:val="20"/>
-        </w:rPr>
-        <w:t xml:space="preserve"> Then</w:t>
-      </w:r>
-      <w:r>
-        <w:rPr>
-          <w:rStyle w:val="normaltextrun"/>
-          <w:rFonts w:ascii="Arial" w:hAnsi="Arial" w:cs="Arial"/>
-          <w:color w:val="000000"/>
-          <w:sz w:val="20"/>
-          <w:szCs w:val="20"/>
-        </w:rPr>
-        <w:t xml:space="preserve"> we closed the session using </w:t>
-      </w:r>
-      <w:proofErr w:type="spellStart"/>
-      <w:proofErr w:type="gramStart"/>
-      <w:r>
-        <w:rPr>
-          <w:rStyle w:val="normaltextrun"/>
-          <w:rFonts w:ascii="Courier New" w:hAnsi="Courier New" w:cs="Courier New"/>
-          <w:color w:val="000000"/>
-          <w:sz w:val="18"/>
-          <w:szCs w:val="18"/>
-        </w:rPr>
-        <w:t>driver.quit</w:t>
-      </w:r>
-      <w:proofErr w:type="spellEnd"/>
-      <w:proofErr w:type="gramEnd"/>
-      <w:r>
-        <w:rPr>
-          <w:rStyle w:val="normaltextrun"/>
-          <w:rFonts w:ascii="Courier New" w:hAnsi="Courier New" w:cs="Courier New"/>
-          <w:color w:val="000000"/>
-          <w:sz w:val="18"/>
-          <w:szCs w:val="18"/>
-        </w:rPr>
-        <w:t>()</w:t>
-      </w:r>
-      <w:r>
-        <w:rPr>
-          <w:rStyle w:val="normaltextrun"/>
-          <w:rFonts w:ascii="Arial" w:hAnsi="Arial" w:cs="Arial"/>
-          <w:color w:val="000000"/>
-          <w:sz w:val="20"/>
-          <w:szCs w:val="20"/>
-        </w:rPr>
-        <w:t xml:space="preserve">. </w:t>
-      </w:r>
-      <w:r>
-        <w:rPr>
-          <w:rStyle w:val="normaltextrun"/>
-          <w:rFonts w:ascii="Arial" w:hAnsi="Arial" w:cs="Arial"/>
-          <w:color w:val="000000"/>
-          <w:sz w:val="20"/>
-          <w:szCs w:val="20"/>
-        </w:rPr>
-        <w:t>And f</w:t>
-      </w:r>
-      <w:r>
-        <w:rPr>
-          <w:rStyle w:val="normaltextrun"/>
-          <w:rFonts w:ascii="Arial" w:hAnsi="Arial" w:cs="Arial"/>
-          <w:color w:val="000000"/>
-          <w:sz w:val="20"/>
-          <w:szCs w:val="20"/>
-        </w:rPr>
-        <w:t xml:space="preserve">inally, we convert the list of records into a </w:t>
-      </w:r>
-      <w:proofErr w:type="gramStart"/>
-      <w:r>
-        <w:rPr>
-          <w:rStyle w:val="normaltextrun"/>
-          <w:rFonts w:ascii="Arial" w:hAnsi="Arial" w:cs="Arial"/>
-          <w:color w:val="000000"/>
-          <w:sz w:val="20"/>
-          <w:szCs w:val="20"/>
-        </w:rPr>
-        <w:t xml:space="preserve">pandas </w:t>
-      </w:r>
-      <w:proofErr w:type="spellStart"/>
-      <w:r>
-        <w:rPr>
-          <w:rStyle w:val="normaltextrun"/>
-          <w:rFonts w:ascii="Arial" w:hAnsi="Arial" w:cs="Arial"/>
-          <w:color w:val="000000"/>
-          <w:sz w:val="20"/>
-          <w:szCs w:val="20"/>
-        </w:rPr>
-        <w:t>DataFrame</w:t>
-      </w:r>
-      <w:proofErr w:type="spellEnd"/>
-      <w:proofErr w:type="gramEnd"/>
-      <w:r>
-        <w:rPr>
-          <w:rStyle w:val="normaltextrun"/>
-          <w:rFonts w:ascii="Arial" w:hAnsi="Arial" w:cs="Arial"/>
-          <w:color w:val="000000"/>
-          <w:sz w:val="20"/>
-          <w:szCs w:val="20"/>
-        </w:rPr>
-        <w:t>, remov</w:t>
-      </w:r>
-      <w:r>
-        <w:rPr>
-          <w:rStyle w:val="normaltextrun"/>
-          <w:rFonts w:ascii="Arial" w:hAnsi="Arial" w:cs="Arial"/>
-          <w:color w:val="000000"/>
-          <w:sz w:val="20"/>
-          <w:szCs w:val="20"/>
-        </w:rPr>
-        <w:t>ing</w:t>
-      </w:r>
-      <w:r>
-        <w:rPr>
-          <w:rStyle w:val="normaltextrun"/>
-          <w:rFonts w:ascii="Arial" w:hAnsi="Arial" w:cs="Arial"/>
-          <w:color w:val="000000"/>
-          <w:sz w:val="20"/>
-          <w:szCs w:val="20"/>
-        </w:rPr>
-        <w:t xml:space="preserve"> duplicates to ensure data quality, and save the result as a CSV </w:t>
-      </w:r>
-      <w:r>
-        <w:rPr>
-          <w:rStyle w:val="normaltextrun"/>
-          <w:rFonts w:ascii="Arial" w:hAnsi="Arial" w:cs="Arial"/>
-          <w:color w:val="000000"/>
-          <w:sz w:val="20"/>
-          <w:szCs w:val="20"/>
-        </w:rPr>
-        <w:t>file to use for later analysis</w:t>
-      </w:r>
-      <w:r>
-        <w:rPr>
-          <w:rStyle w:val="normaltextrun"/>
-          <w:rFonts w:ascii="Arial" w:hAnsi="Arial" w:cs="Arial"/>
-          <w:color w:val="000000"/>
-          <w:sz w:val="20"/>
-          <w:szCs w:val="20"/>
-        </w:rPr>
-        <w:t>.</w:t>
-      </w:r>
-    </w:p>
-    <w:p>
-      <w:pPr>
-        <w:pStyle w:val="berschrift1"/>
+        <w:t>s.</w:t>
+      </w:r>
+    </w:p>
+    <w:p>
+      <w:pPr>
+        <w:pStyle w:val="Balk1"/>
         <w:numPr>
           <w:ilvl w:val="1"/>
           <w:numId w:val="4"/>
@@ -1776,7 +1522,7 @@
     </w:p>
     <w:p>
       <w:pPr>
-        <w:pStyle w:val="berschrift1"/>
+        <w:pStyle w:val="Balk1"/>
         <w:numPr>
           <w:ilvl w:val="1"/>
           <w:numId w:val="4"/>
@@ -1845,7 +1591,6 @@
         </w:rPr>
         <w:t xml:space="preserve"> After merging, the variable </w:t>
       </w:r>
-      <w:proofErr w:type="spellStart"/>
       <w:r>
         <w:rPr>
           <w:rStyle w:val="normaltextrun"/>
@@ -1856,7 +1601,6 @@
         </w:rPr>
         <w:t>date_scraped</w:t>
       </w:r>
-      <w:proofErr w:type="spellEnd"/>
       <w:r>
         <w:rPr>
           <w:rStyle w:val="normaltextrun"/>
@@ -1877,7 +1621,6 @@
         </w:rPr>
         <w:t xml:space="preserve">was converted from string to a datetime format to ensure consistent handling of dates. Finally, all variable types were checked to ensure that numeric variables such as </w:t>
       </w:r>
-      <w:proofErr w:type="spellStart"/>
       <w:r>
         <w:rPr>
           <w:rStyle w:val="normaltextrun"/>
@@ -1886,18 +1629,7 @@
           <w:sz w:val="20"/>
           <w:szCs w:val="20"/>
         </w:rPr>
-        <w:t>price_chf</w:t>
-      </w:r>
-      <w:proofErr w:type="spellEnd"/>
-      <w:r>
-        <w:rPr>
-          <w:rStyle w:val="normaltextrun"/>
-          <w:rFonts w:ascii="Courier New" w:hAnsi="Courier New" w:cs="Courier New"/>
-          <w:color w:val="000000"/>
-          <w:sz w:val="20"/>
-          <w:szCs w:val="20"/>
-        </w:rPr>
-        <w:t>,</w:t>
+        <w:t>price_chf,</w:t>
       </w:r>
       <w:r>
         <w:rPr>
@@ -1991,6 +1723,26 @@
         </w:rPr>
         <w:t xml:space="preserve">Before further analysis, we first checked missing values. No missing values were found in the key variables canton, </w:t>
       </w:r>
+      <w:r>
+        <w:rPr>
+          <w:rStyle w:val="normaltextrun"/>
+          <w:rFonts w:ascii="Courier New" w:hAnsi="Courier New" w:cs="Courier New"/>
+          <w:color w:val="000000"/>
+          <w:sz w:val="20"/>
+          <w:szCs w:val="20"/>
+        </w:rPr>
+        <w:t>price_chf,</w:t>
+      </w:r>
+      <w:r>
+        <w:rPr>
+          <w:rStyle w:val="normaltextrun"/>
+          <w:rFonts w:ascii="Arial" w:hAnsi="Arial" w:cs="Arial"/>
+          <w:color w:val="000000"/>
+          <w:sz w:val="21"/>
+          <w:szCs w:val="21"/>
+        </w:rPr>
+        <w:t xml:space="preserve"> and </w:t>
+      </w:r>
       <w:proofErr w:type="spellStart"/>
       <w:r>
         <w:rPr>
@@ -2000,7 +1752,7 @@
           <w:sz w:val="20"/>
           <w:szCs w:val="20"/>
         </w:rPr>
-        <w:t>price_chf</w:t>
+        <w:t>canton_gdp</w:t>
       </w:r>
       <w:proofErr w:type="spellEnd"/>
       <w:r>
@@ -2021,9 +1773,8 @@
           <w:sz w:val="21"/>
           <w:szCs w:val="21"/>
         </w:rPr>
-        <w:t xml:space="preserve"> and </w:t>
-      </w:r>
-      <w:proofErr w:type="spellStart"/>
+        <w:t xml:space="preserve"> so no observations had to be removed. Missing values in </w:t>
+      </w:r>
       <w:r>
         <w:rPr>
           <w:rStyle w:val="normaltextrun"/>
@@ -2032,9 +1783,39 @@
           <w:sz w:val="20"/>
           <w:szCs w:val="20"/>
         </w:rPr>
-        <w:t>canton_gdp</w:t>
-      </w:r>
-      <w:proofErr w:type="spellEnd"/>
+        <w:t>living_area_m2</w:t>
+      </w:r>
+      <w:r>
+        <w:rPr>
+          <w:rStyle w:val="normaltextrun"/>
+          <w:rFonts w:ascii="Arial" w:hAnsi="Arial" w:cs="Arial"/>
+          <w:color w:val="000000"/>
+          <w:sz w:val="20"/>
+          <w:szCs w:val="20"/>
+        </w:rPr>
+        <w:t xml:space="preserve"> </w:t>
+      </w:r>
+      <w:r>
+        <w:rPr>
+          <w:rStyle w:val="normaltextrun"/>
+          <w:rFonts w:ascii="Arial" w:hAnsi="Arial" w:cs="Arial"/>
+          <w:color w:val="000000"/>
+          <w:sz w:val="21"/>
+          <w:szCs w:val="21"/>
+        </w:rPr>
+        <w:t xml:space="preserve">and rooms were imputed using the median per canton to account for </w:t>
+      </w:r>
+      <w:r>
+        <w:rPr>
+          <w:rStyle w:val="normaltextrun"/>
+          <w:rFonts w:ascii="Arial" w:hAnsi="Arial" w:cs="Arial"/>
+          <w:color w:val="000000"/>
+          <w:sz w:val="21"/>
+          <w:szCs w:val="21"/>
+        </w:rPr>
+        <w:lastRenderedPageBreak/>
+        <w:t xml:space="preserve">regional differences. If missing values remained after this step, they were replaced with the overall median of the respective variable. Missing values in </w:t>
+      </w:r>
       <w:r>
         <w:rPr>
           <w:rStyle w:val="normaltextrun"/>
@@ -2043,71 +1824,8 @@
           <w:sz w:val="20"/>
           <w:szCs w:val="20"/>
         </w:rPr>
-        <w:t>,</w:t>
-      </w:r>
-      <w:r>
-        <w:rPr>
-          <w:rStyle w:val="normaltextrun"/>
-          <w:rFonts w:ascii="Arial" w:hAnsi="Arial" w:cs="Arial"/>
-          <w:color w:val="000000"/>
-          <w:sz w:val="21"/>
-          <w:szCs w:val="21"/>
-        </w:rPr>
-        <w:t xml:space="preserve"> so no observations had to be removed. Missing values in </w:t>
-      </w:r>
-      <w:r>
-        <w:rPr>
-          <w:rStyle w:val="normaltextrun"/>
-          <w:rFonts w:ascii="Courier New" w:hAnsi="Courier New" w:cs="Courier New"/>
-          <w:color w:val="000000"/>
-          <w:sz w:val="20"/>
-          <w:szCs w:val="20"/>
-        </w:rPr>
-        <w:t>living_area_m2</w:t>
-      </w:r>
-      <w:r>
-        <w:rPr>
-          <w:rStyle w:val="normaltextrun"/>
-          <w:rFonts w:ascii="Arial" w:hAnsi="Arial" w:cs="Arial"/>
-          <w:color w:val="000000"/>
-          <w:sz w:val="20"/>
-          <w:szCs w:val="20"/>
-        </w:rPr>
-        <w:t xml:space="preserve"> </w:t>
-      </w:r>
-      <w:r>
-        <w:rPr>
-          <w:rStyle w:val="normaltextrun"/>
-          <w:rFonts w:ascii="Arial" w:hAnsi="Arial" w:cs="Arial"/>
-          <w:color w:val="000000"/>
-          <w:sz w:val="21"/>
-          <w:szCs w:val="21"/>
-        </w:rPr>
-        <w:t xml:space="preserve">and rooms were imputed using the median per canton to account for regional differences. If missing values remained after this step, they were replaced with the overall </w:t>
-      </w:r>
-      <w:r>
-        <w:rPr>
-          <w:rStyle w:val="normaltextrun"/>
-          <w:rFonts w:ascii="Arial" w:hAnsi="Arial" w:cs="Arial"/>
-          <w:color w:val="000000"/>
-          <w:sz w:val="21"/>
-          <w:szCs w:val="21"/>
-        </w:rPr>
-        <w:lastRenderedPageBreak/>
-        <w:t xml:space="preserve">median of the respective variable. Missing values in </w:t>
-      </w:r>
-      <w:proofErr w:type="spellStart"/>
-      <w:r>
-        <w:rPr>
-          <w:rStyle w:val="normaltextrun"/>
-          <w:rFonts w:ascii="Courier New" w:hAnsi="Courier New" w:cs="Courier New"/>
-          <w:color w:val="000000"/>
-          <w:sz w:val="20"/>
-          <w:szCs w:val="20"/>
-        </w:rPr>
         <w:t>location_text</w:t>
       </w:r>
-      <w:proofErr w:type="spellEnd"/>
       <w:r>
         <w:rPr>
           <w:rStyle w:val="normaltextrun"/>
@@ -2157,7 +1875,6 @@
         </w:rPr>
         <w:t xml:space="preserve">Outliers were inspected for the variable </w:t>
       </w:r>
-      <w:proofErr w:type="spellStart"/>
       <w:r>
         <w:rPr>
           <w:rStyle w:val="normaltextrun"/>
@@ -2166,18 +1883,7 @@
           <w:sz w:val="20"/>
           <w:szCs w:val="20"/>
         </w:rPr>
-        <w:t>price_chf</w:t>
-      </w:r>
-      <w:proofErr w:type="spellEnd"/>
-      <w:r>
-        <w:rPr>
-          <w:rStyle w:val="normaltextrun"/>
-          <w:rFonts w:ascii="Courier New" w:hAnsi="Courier New" w:cs="Courier New"/>
-          <w:color w:val="000000"/>
-          <w:sz w:val="20"/>
-          <w:szCs w:val="20"/>
-        </w:rPr>
-        <w:t>, living_are_m2,</w:t>
+        <w:t>price_chf, living_are_m2,</w:t>
       </w:r>
       <w:r>
         <w:rPr>
@@ -2234,7 +1940,7 @@
     </w:p>
     <w:p>
       <w:pPr>
-        <w:pStyle w:val="berschrift1"/>
+        <w:pStyle w:val="Balk1"/>
         <w:rPr>
           <w:sz w:val="21"/>
           <w:szCs w:val="21"/>
@@ -2246,7 +1952,7 @@
     </w:p>
     <w:p>
       <w:pPr>
-        <w:pStyle w:val="berschrift1"/>
+        <w:pStyle w:val="Balk1"/>
         <w:numPr>
           <w:ilvl w:val="1"/>
           <w:numId w:val="4"/>
@@ -2546,7 +2252,7 @@
       </w:r>
       <w:r>
         <w:rPr>
-          <w:rStyle w:val="Funotenzeichen"/>
+          <w:rStyle w:val="DipnotBavurusu"/>
           <w:rFonts w:ascii="Arial" w:hAnsi="Arial" w:cs="Arial"/>
           <w:color w:val="000000"/>
           <w:sz w:val="21"/>
@@ -3101,7 +2807,7 @@
       </w:r>
       <w:r>
         <w:rPr>
-          <w:rStyle w:val="Funotenzeichen"/>
+          <w:rStyle w:val="DipnotBavurusu"/>
           <w:rFonts w:ascii="Arial" w:hAnsi="Arial" w:cs="Arial"/>
           <w:color w:val="000000"/>
           <w:sz w:val="21"/>
@@ -3582,7 +3288,7 @@
       </w:r>
       <w:r>
         <w:rPr>
-          <w:rStyle w:val="Funotenzeichen"/>
+          <w:rStyle w:val="DipnotBavurusu"/>
           <w:rFonts w:ascii="Arial" w:hAnsi="Arial" w:cs="Arial"/>
           <w:color w:val="000000"/>
           <w:sz w:val="21"/>
@@ -3863,7 +3569,7 @@
     </w:p>
     <w:p>
       <w:pPr>
-        <w:pStyle w:val="berschrift1"/>
+        <w:pStyle w:val="Balk1"/>
         <w:numPr>
           <w:ilvl w:val="1"/>
           <w:numId w:val="4"/>
@@ -3911,7 +3617,7 @@
     </w:p>
     <w:p>
       <w:pPr>
-        <w:pStyle w:val="berschrift1"/>
+        <w:pStyle w:val="Balk1"/>
         <w:numPr>
           <w:ilvl w:val="1"/>
           <w:numId w:val="4"/>
@@ -3984,7 +3690,7 @@
     </w:p>
     <w:p>
       <w:pPr>
-        <w:pStyle w:val="Listenabsatz"/>
+        <w:pStyle w:val="ListeParagraf"/>
         <w:numPr>
           <w:ilvl w:val="0"/>
           <w:numId w:val="6"/>
@@ -4009,7 +3715,7 @@
     </w:p>
     <w:p>
       <w:pPr>
-        <w:pStyle w:val="Listenabsatz"/>
+        <w:pStyle w:val="ListeParagraf"/>
         <w:numPr>
           <w:ilvl w:val="1"/>
           <w:numId w:val="2"/>
@@ -4048,34 +3754,14 @@
           <w:sz w:val="20"/>
           <w:szCs w:val="20"/>
         </w:rPr>
-        <w:t xml:space="preserve">shows that there is a positive but weak relationship between </w:t>
-      </w:r>
-      <w:proofErr w:type="gramStart"/>
+        <w:t>shows that there is a positive but weak relationship between GDP per capita and rental prices per square meter</w:t>
+      </w:r>
       <w:r>
         <w:rPr>
           <w:rFonts w:ascii="Arial" w:hAnsi="Arial" w:cs="Arial"/>
           <w:color w:val="000000" w:themeColor="text1"/>
           <w:sz w:val="20"/>
           <w:szCs w:val="20"/>
-        </w:rPr>
-        <w:t>GDP</w:t>
-      </w:r>
-      <w:proofErr w:type="gramEnd"/>
-      <w:r>
-        <w:rPr>
-          <w:rFonts w:ascii="Arial" w:hAnsi="Arial" w:cs="Arial"/>
-          <w:color w:val="000000" w:themeColor="text1"/>
-          <w:sz w:val="20"/>
-          <w:szCs w:val="20"/>
-        </w:rPr>
-        <w:t xml:space="preserve"> per capita and rental prices per square meter</w:t>
-      </w:r>
-      <w:r>
-        <w:rPr>
-          <w:rFonts w:ascii="Arial" w:hAnsi="Arial" w:cs="Arial"/>
-          <w:color w:val="000000" w:themeColor="text1"/>
-          <w:sz w:val="20"/>
-          <w:szCs w:val="20"/>
           <w:vertAlign w:val="superscript"/>
         </w:rPr>
         <w:t xml:space="preserve"> </w:t>
@@ -4083,7 +3769,7 @@
     </w:p>
     <w:p>
       <w:pPr>
-        <w:pStyle w:val="Listenabsatz"/>
+        <w:pStyle w:val="ListeParagraf"/>
         <w:jc w:val="both"/>
         <w:rPr>
           <w:rFonts w:ascii="Arial" w:hAnsi="Arial" w:cs="Arial"/>
@@ -4095,7 +3781,7 @@
     </w:p>
     <w:p>
       <w:pPr>
-        <w:pStyle w:val="Listenabsatz"/>
+        <w:pStyle w:val="ListeParagraf"/>
         <w:numPr>
           <w:ilvl w:val="0"/>
           <w:numId w:val="6"/>
@@ -4120,7 +3806,7 @@
     </w:p>
     <w:p>
       <w:pPr>
-        <w:pStyle w:val="Listenabsatz"/>
+        <w:pStyle w:val="ListeParagraf"/>
         <w:numPr>
           <w:ilvl w:val="1"/>
           <w:numId w:val="2"/>
@@ -4145,7 +3831,7 @@
     </w:p>
     <w:p>
       <w:pPr>
-        <w:pStyle w:val="Listenabsatz"/>
+        <w:pStyle w:val="ListeParagraf"/>
         <w:numPr>
           <w:ilvl w:val="1"/>
           <w:numId w:val="2"/>
@@ -4190,7 +3876,7 @@
     </w:p>
     <w:p>
       <w:pPr>
-        <w:pStyle w:val="Listenabsatz"/>
+        <w:pStyle w:val="ListeParagraf"/>
         <w:numPr>
           <w:ilvl w:val="1"/>
           <w:numId w:val="2"/>
@@ -4215,7 +3901,7 @@
     </w:p>
     <w:p>
       <w:pPr>
-        <w:pStyle w:val="Listenabsatz"/>
+        <w:pStyle w:val="ListeParagraf"/>
         <w:numPr>
           <w:ilvl w:val="0"/>
           <w:numId w:val="6"/>
@@ -4240,7 +3926,7 @@
     </w:p>
     <w:p>
       <w:pPr>
-        <w:pStyle w:val="Listenabsatz"/>
+        <w:pStyle w:val="ListeParagraf"/>
         <w:numPr>
           <w:ilvl w:val="1"/>
           <w:numId w:val="2"/>
@@ -4297,7 +3983,7 @@
     </w:p>
     <w:p>
       <w:pPr>
-        <w:pStyle w:val="berschrift1"/>
+        <w:pStyle w:val="Balk1"/>
         <w:rPr>
           <w:color w:val="EE0000"/>
         </w:rPr>
@@ -4409,11 +4095,11 @@
   <w:footnote w:id="1">
     <w:p>
       <w:pPr>
-        <w:pStyle w:val="Funotentext"/>
-      </w:pPr>
-      <w:r>
-        <w:rPr>
-          <w:rStyle w:val="Funotenzeichen"/>
+        <w:pStyle w:val="DipnotMetni"/>
+      </w:pPr>
+      <w:r>
+        <w:rPr>
+          <w:rStyle w:val="DipnotBavurusu"/>
         </w:rPr>
         <w:footnoteRef/>
       </w:r>
@@ -4425,11 +4111,11 @@
   <w:footnote w:id="2">
     <w:p>
       <w:pPr>
-        <w:pStyle w:val="Funotentext"/>
-      </w:pPr>
-      <w:r>
-        <w:rPr>
-          <w:rStyle w:val="Funotenzeichen"/>
+        <w:pStyle w:val="DipnotMetni"/>
+      </w:pPr>
+      <w:r>
+        <w:rPr>
+          <w:rStyle w:val="DipnotBavurusu"/>
         </w:rPr>
         <w:footnoteRef/>
       </w:r>
@@ -4441,11 +4127,11 @@
   <w:footnote w:id="3">
     <w:p>
       <w:pPr>
-        <w:pStyle w:val="Funotentext"/>
-      </w:pPr>
-      <w:r>
-        <w:rPr>
-          <w:rStyle w:val="Funotenzeichen"/>
+        <w:pStyle w:val="DipnotMetni"/>
+      </w:pPr>
+      <w:r>
+        <w:rPr>
+          <w:rStyle w:val="DipnotBavurusu"/>
         </w:rPr>
         <w:footnoteRef/>
       </w:r>
@@ -4669,7 +4355,7 @@
     <w:lvl w:ilvl="0">
       <w:start w:val="1"/>
       <w:numFmt w:val="decimal"/>
-      <w:pStyle w:val="berschrift1"/>
+      <w:pStyle w:val="Balk1"/>
       <w:lvlText w:val="%1."/>
       <w:lvlJc w:val="left"/>
       <w:pPr>
@@ -4761,6 +4447,155 @@
     </w:lvl>
   </w:abstractNum>
   <w:abstractNum w:abstractNumId="3" w15:restartNumberingAfterBreak="0">
+    <w:nsid w:val="2F0A4C18"/>
+    <w:multiLevelType w:val="multilevel"/>
+    <w:tmpl w:val="D80E1172"/>
+    <w:lvl w:ilvl="0">
+      <w:start w:val="1"/>
+      <w:numFmt w:val="bullet"/>
+      <w:lvlText w:val=""/>
+      <w:lvlJc w:val="left"/>
+      <w:pPr>
+        <w:tabs>
+          <w:tab w:val="num" w:pos="720"/>
+        </w:tabs>
+        <w:ind w:left="720" w:hanging="360"/>
+      </w:pPr>
+      <w:rPr>
+        <w:rFonts w:ascii="Symbol" w:hAnsi="Symbol" w:hint="default"/>
+        <w:sz w:val="20"/>
+      </w:rPr>
+    </w:lvl>
+    <w:lvl w:ilvl="1" w:tentative="1">
+      <w:start w:val="1"/>
+      <w:numFmt w:val="bullet"/>
+      <w:lvlText w:val="o"/>
+      <w:lvlJc w:val="left"/>
+      <w:pPr>
+        <w:tabs>
+          <w:tab w:val="num" w:pos="1440"/>
+        </w:tabs>
+        <w:ind w:left="1440" w:hanging="360"/>
+      </w:pPr>
+      <w:rPr>
+        <w:rFonts w:ascii="Courier New" w:hAnsi="Courier New" w:hint="default"/>
+        <w:sz w:val="20"/>
+      </w:rPr>
+    </w:lvl>
+    <w:lvl w:ilvl="2" w:tentative="1">
+      <w:start w:val="1"/>
+      <w:numFmt w:val="bullet"/>
+      <w:lvlText w:val=""/>
+      <w:lvlJc w:val="left"/>
+      <w:pPr>
+        <w:tabs>
+          <w:tab w:val="num" w:pos="2160"/>
+        </w:tabs>
+        <w:ind w:left="2160" w:hanging="360"/>
+      </w:pPr>
+      <w:rPr>
+        <w:rFonts w:ascii="Wingdings" w:hAnsi="Wingdings" w:hint="default"/>
+        <w:sz w:val="20"/>
+      </w:rPr>
+    </w:lvl>
+    <w:lvl w:ilvl="3" w:tentative="1">
+      <w:start w:val="1"/>
+      <w:numFmt w:val="bullet"/>
+      <w:lvlText w:val=""/>
+      <w:lvlJc w:val="left"/>
+      <w:pPr>
+        <w:tabs>
+          <w:tab w:val="num" w:pos="2880"/>
+        </w:tabs>
+        <w:ind w:left="2880" w:hanging="360"/>
+      </w:pPr>
+      <w:rPr>
+        <w:rFonts w:ascii="Wingdings" w:hAnsi="Wingdings" w:hint="default"/>
+        <w:sz w:val="20"/>
+      </w:rPr>
+    </w:lvl>
+    <w:lvl w:ilvl="4" w:tentative="1">
+      <w:start w:val="1"/>
+      <w:numFmt w:val="bullet"/>
+      <w:lvlText w:val=""/>
+      <w:lvlJc w:val="left"/>
+      <w:pPr>
+        <w:tabs>
+          <w:tab w:val="num" w:pos="3600"/>
+        </w:tabs>
+        <w:ind w:left="3600" w:hanging="360"/>
+      </w:pPr>
+      <w:rPr>
+        <w:rFonts w:ascii="Wingdings" w:hAnsi="Wingdings" w:hint="default"/>
+        <w:sz w:val="20"/>
+      </w:rPr>
+    </w:lvl>
+    <w:lvl w:ilvl="5" w:tentative="1">
+      <w:start w:val="1"/>
+      <w:numFmt w:val="bullet"/>
+      <w:lvlText w:val=""/>
+      <w:lvlJc w:val="left"/>
+      <w:pPr>
+        <w:tabs>
+          <w:tab w:val="num" w:pos="4320"/>
+        </w:tabs>
+        <w:ind w:left="4320" w:hanging="360"/>
+      </w:pPr>
+      <w:rPr>
+        <w:rFonts w:ascii="Wingdings" w:hAnsi="Wingdings" w:hint="default"/>
+        <w:sz w:val="20"/>
+      </w:rPr>
+    </w:lvl>
+    <w:lvl w:ilvl="6" w:tentative="1">
+      <w:start w:val="1"/>
+      <w:numFmt w:val="bullet"/>
+      <w:lvlText w:val=""/>
+      <w:lvlJc w:val="left"/>
+      <w:pPr>
+        <w:tabs>
+          <w:tab w:val="num" w:pos="5040"/>
+        </w:tabs>
+        <w:ind w:left="5040" w:hanging="360"/>
+      </w:pPr>
+      <w:rPr>
+        <w:rFonts w:ascii="Wingdings" w:hAnsi="Wingdings" w:hint="default"/>
+        <w:sz w:val="20"/>
+      </w:rPr>
+    </w:lvl>
+    <w:lvl w:ilvl="7" w:tentative="1">
+      <w:start w:val="1"/>
+      <w:numFmt w:val="bullet"/>
+      <w:lvlText w:val=""/>
+      <w:lvlJc w:val="left"/>
+      <w:pPr>
+        <w:tabs>
+          <w:tab w:val="num" w:pos="5760"/>
+        </w:tabs>
+        <w:ind w:left="5760" w:hanging="360"/>
+      </w:pPr>
+      <w:rPr>
+        <w:rFonts w:ascii="Wingdings" w:hAnsi="Wingdings" w:hint="default"/>
+        <w:sz w:val="20"/>
+      </w:rPr>
+    </w:lvl>
+    <w:lvl w:ilvl="8" w:tentative="1">
+      <w:start w:val="1"/>
+      <w:numFmt w:val="bullet"/>
+      <w:lvlText w:val=""/>
+      <w:lvlJc w:val="left"/>
+      <w:pPr>
+        <w:tabs>
+          <w:tab w:val="num" w:pos="6480"/>
+        </w:tabs>
+        <w:ind w:left="6480" w:hanging="360"/>
+      </w:pPr>
+      <w:rPr>
+        <w:rFonts w:ascii="Wingdings" w:hAnsi="Wingdings" w:hint="default"/>
+        <w:sz w:val="20"/>
+      </w:rPr>
+    </w:lvl>
+  </w:abstractNum>
+  <w:abstractNum w:abstractNumId="4" w15:restartNumberingAfterBreak="0">
     <w:nsid w:val="3C610880"/>
     <w:multiLevelType w:val="hybridMultilevel"/>
     <w:tmpl w:val="3C62CE10"/>
@@ -4873,7 +4708,7 @@
       </w:rPr>
     </w:lvl>
   </w:abstractNum>
-  <w:abstractNum w:abstractNumId="4" w15:restartNumberingAfterBreak="0">
+  <w:abstractNum w:abstractNumId="5" w15:restartNumberingAfterBreak="0">
     <w:nsid w:val="3CB123A7"/>
     <w:multiLevelType w:val="multilevel"/>
     <w:tmpl w:val="F672F630"/>
@@ -4986,7 +4821,7 @@
       </w:pPr>
     </w:lvl>
   </w:abstractNum>
-  <w:abstractNum w:abstractNumId="5" w15:restartNumberingAfterBreak="0">
+  <w:abstractNum w:abstractNumId="6" w15:restartNumberingAfterBreak="0">
     <w:nsid w:val="5AEC5A00"/>
     <w:multiLevelType w:val="multilevel"/>
     <w:tmpl w:val="F80A22B2"/>
@@ -5100,22 +4935,25 @@
     </w:lvl>
   </w:abstractNum>
   <w:num w:numId="1" w16cid:durableId="701249916">
-    <w:abstractNumId w:val="5"/>
+    <w:abstractNumId w:val="6"/>
   </w:num>
   <w:num w:numId="2" w16cid:durableId="524710100">
     <w:abstractNumId w:val="0"/>
   </w:num>
   <w:num w:numId="3" w16cid:durableId="665665569">
-    <w:abstractNumId w:val="4"/>
+    <w:abstractNumId w:val="5"/>
   </w:num>
   <w:num w:numId="4" w16cid:durableId="830485210">
     <w:abstractNumId w:val="2"/>
   </w:num>
   <w:num w:numId="5" w16cid:durableId="597061144">
-    <w:abstractNumId w:val="3"/>
+    <w:abstractNumId w:val="4"/>
   </w:num>
   <w:num w:numId="6" w16cid:durableId="679817417">
     <w:abstractNumId w:val="1"/>
+  </w:num>
+  <w:num w:numId="7" w16cid:durableId="1150751369">
+    <w:abstractNumId w:val="3"/>
   </w:num>
 </w:numbering>
 </file>
@@ -5517,15 +5355,15 @@
     <w:lsdException w:name="Unresolved Mention" w:semiHidden="1" w:unhideWhenUsed="1"/>
     <w:lsdException w:name="Smart Link" w:semiHidden="1" w:unhideWhenUsed="1"/>
   </w:latentStyles>
-  <w:style w:type="paragraph" w:default="1" w:styleId="Standard">
+  <w:style w:type="paragraph" w:default="1" w:styleId="Normal">
     <w:name w:val="Normal"/>
     <w:qFormat/>
   </w:style>
-  <w:style w:type="paragraph" w:styleId="berschrift1">
+  <w:style w:type="paragraph" w:styleId="Balk1">
     <w:name w:val="heading 1"/>
-    <w:basedOn w:val="Listenabsatz"/>
-    <w:next w:val="Standard"/>
-    <w:link w:val="berschrift1Zchn"/>
+    <w:basedOn w:val="ListeParagraf"/>
+    <w:next w:val="Normal"/>
+    <w:link w:val="Balk1Char"/>
     <w:uiPriority w:val="9"/>
     <w:qFormat/>
     <w:rsid w:val="00980492"/>
@@ -5547,11 +5385,11 @@
       <w:szCs w:val="22"/>
     </w:rPr>
   </w:style>
-  <w:style w:type="paragraph" w:styleId="berschrift2">
+  <w:style w:type="paragraph" w:styleId="Balk2">
     <w:name w:val="heading 2"/>
-    <w:basedOn w:val="Standard"/>
-    <w:next w:val="Standard"/>
-    <w:link w:val="berschrift2Zchn"/>
+    <w:basedOn w:val="Normal"/>
+    <w:next w:val="Normal"/>
+    <w:link w:val="Balk2Char"/>
     <w:uiPriority w:val="9"/>
     <w:semiHidden/>
     <w:unhideWhenUsed/>
@@ -5570,11 +5408,11 @@
       <w:szCs w:val="32"/>
     </w:rPr>
   </w:style>
-  <w:style w:type="paragraph" w:styleId="berschrift3">
+  <w:style w:type="paragraph" w:styleId="Balk3">
     <w:name w:val="heading 3"/>
-    <w:basedOn w:val="Standard"/>
-    <w:next w:val="Standard"/>
-    <w:link w:val="berschrift3Zchn"/>
+    <w:basedOn w:val="Normal"/>
+    <w:next w:val="Normal"/>
+    <w:link w:val="Balk3Char"/>
     <w:uiPriority w:val="9"/>
     <w:semiHidden/>
     <w:unhideWhenUsed/>
@@ -5593,11 +5431,11 @@
       <w:szCs w:val="28"/>
     </w:rPr>
   </w:style>
-  <w:style w:type="paragraph" w:styleId="berschrift4">
+  <w:style w:type="paragraph" w:styleId="Balk4">
     <w:name w:val="heading 4"/>
-    <w:basedOn w:val="Standard"/>
-    <w:next w:val="Standard"/>
-    <w:link w:val="berschrift4Zchn"/>
+    <w:basedOn w:val="Normal"/>
+    <w:next w:val="Normal"/>
+    <w:link w:val="Balk4Char"/>
     <w:uiPriority w:val="9"/>
     <w:semiHidden/>
     <w:unhideWhenUsed/>
@@ -5616,11 +5454,11 @@
       <w:color w:val="0F4761" w:themeColor="accent1" w:themeShade="BF"/>
     </w:rPr>
   </w:style>
-  <w:style w:type="paragraph" w:styleId="berschrift5">
+  <w:style w:type="paragraph" w:styleId="Balk5">
     <w:name w:val="heading 5"/>
-    <w:basedOn w:val="Standard"/>
-    <w:next w:val="Standard"/>
-    <w:link w:val="berschrift5Zchn"/>
+    <w:basedOn w:val="Normal"/>
+    <w:next w:val="Normal"/>
+    <w:link w:val="Balk5Char"/>
     <w:uiPriority w:val="9"/>
     <w:semiHidden/>
     <w:unhideWhenUsed/>
@@ -5637,11 +5475,11 @@
       <w:color w:val="0F4761" w:themeColor="accent1" w:themeShade="BF"/>
     </w:rPr>
   </w:style>
-  <w:style w:type="paragraph" w:styleId="berschrift6">
+  <w:style w:type="paragraph" w:styleId="Balk6">
     <w:name w:val="heading 6"/>
-    <w:basedOn w:val="Standard"/>
-    <w:next w:val="Standard"/>
-    <w:link w:val="berschrift6Zchn"/>
+    <w:basedOn w:val="Normal"/>
+    <w:next w:val="Normal"/>
+    <w:link w:val="Balk6Char"/>
     <w:uiPriority w:val="9"/>
     <w:semiHidden/>
     <w:unhideWhenUsed/>
@@ -5660,11 +5498,11 @@
       <w:color w:val="595959" w:themeColor="text1" w:themeTint="A6"/>
     </w:rPr>
   </w:style>
-  <w:style w:type="paragraph" w:styleId="berschrift7">
+  <w:style w:type="paragraph" w:styleId="Balk7">
     <w:name w:val="heading 7"/>
-    <w:basedOn w:val="Standard"/>
-    <w:next w:val="Standard"/>
-    <w:link w:val="berschrift7Zchn"/>
+    <w:basedOn w:val="Normal"/>
+    <w:next w:val="Normal"/>
+    <w:link w:val="Balk7Char"/>
     <w:uiPriority w:val="9"/>
     <w:semiHidden/>
     <w:unhideWhenUsed/>
@@ -5681,11 +5519,11 @@
       <w:color w:val="595959" w:themeColor="text1" w:themeTint="A6"/>
     </w:rPr>
   </w:style>
-  <w:style w:type="paragraph" w:styleId="berschrift8">
+  <w:style w:type="paragraph" w:styleId="Balk8">
     <w:name w:val="heading 8"/>
-    <w:basedOn w:val="Standard"/>
-    <w:next w:val="Standard"/>
-    <w:link w:val="berschrift8Zchn"/>
+    <w:basedOn w:val="Normal"/>
+    <w:next w:val="Normal"/>
+    <w:link w:val="Balk8Char"/>
     <w:uiPriority w:val="9"/>
     <w:semiHidden/>
     <w:unhideWhenUsed/>
@@ -5704,11 +5542,11 @@
       <w:color w:val="272727" w:themeColor="text1" w:themeTint="D8"/>
     </w:rPr>
   </w:style>
-  <w:style w:type="paragraph" w:styleId="berschrift9">
+  <w:style w:type="paragraph" w:styleId="Balk9">
     <w:name w:val="heading 9"/>
-    <w:basedOn w:val="Standard"/>
-    <w:next w:val="Standard"/>
-    <w:link w:val="berschrift9Zchn"/>
+    <w:basedOn w:val="Normal"/>
+    <w:next w:val="Normal"/>
+    <w:link w:val="Balk9Char"/>
     <w:uiPriority w:val="9"/>
     <w:semiHidden/>
     <w:unhideWhenUsed/>
@@ -5725,13 +5563,13 @@
       <w:color w:val="272727" w:themeColor="text1" w:themeTint="D8"/>
     </w:rPr>
   </w:style>
-  <w:style w:type="character" w:default="1" w:styleId="Absatz-Standardschriftart">
+  <w:style w:type="character" w:default="1" w:styleId="VarsaylanParagrafYazTipi">
     <w:name w:val="Default Paragraph Font"/>
     <w:uiPriority w:val="1"/>
     <w:semiHidden/>
     <w:unhideWhenUsed/>
   </w:style>
-  <w:style w:type="table" w:default="1" w:styleId="NormaleTabelle">
+  <w:style w:type="table" w:default="1" w:styleId="NormalTablo">
     <w:name w:val="Normal Table"/>
     <w:uiPriority w:val="99"/>
     <w:semiHidden/>
@@ -5746,16 +5584,16 @@
       </w:tblCellMar>
     </w:tblPr>
   </w:style>
-  <w:style w:type="numbering" w:default="1" w:styleId="KeineListe">
+  <w:style w:type="numbering" w:default="1" w:styleId="ListeYok">
     <w:name w:val="No List"/>
     <w:uiPriority w:val="99"/>
     <w:semiHidden/>
     <w:unhideWhenUsed/>
   </w:style>
-  <w:style w:type="character" w:customStyle="1" w:styleId="berschrift1Zchn">
-    <w:name w:val="Überschrift 1 Zchn"/>
-    <w:basedOn w:val="Absatz-Standardschriftart"/>
-    <w:link w:val="berschrift1"/>
+  <w:style w:type="character" w:customStyle="1" w:styleId="Balk1Char">
+    <w:name w:val="Başlık 1 Char"/>
+    <w:basedOn w:val="VarsaylanParagrafYazTipi"/>
+    <w:link w:val="Balk1"/>
     <w:uiPriority w:val="9"/>
     <w:rsid w:val="00980492"/>
     <w:rPr>
@@ -5767,10 +5605,10 @@
       <w:szCs w:val="22"/>
     </w:rPr>
   </w:style>
-  <w:style w:type="character" w:customStyle="1" w:styleId="berschrift2Zchn">
-    <w:name w:val="Überschrift 2 Zchn"/>
-    <w:basedOn w:val="Absatz-Standardschriftart"/>
-    <w:link w:val="berschrift2"/>
+  <w:style w:type="character" w:customStyle="1" w:styleId="Balk2Char">
+    <w:name w:val="Başlık 2 Char"/>
+    <w:basedOn w:val="VarsaylanParagrafYazTipi"/>
+    <w:link w:val="Balk2"/>
     <w:uiPriority w:val="9"/>
     <w:semiHidden/>
     <w:rsid w:val="00F83180"/>
@@ -5781,10 +5619,10 @@
       <w:szCs w:val="32"/>
     </w:rPr>
   </w:style>
-  <w:style w:type="character" w:customStyle="1" w:styleId="berschrift3Zchn">
-    <w:name w:val="Überschrift 3 Zchn"/>
-    <w:basedOn w:val="Absatz-Standardschriftart"/>
-    <w:link w:val="berschrift3"/>
+  <w:style w:type="character" w:customStyle="1" w:styleId="Balk3Char">
+    <w:name w:val="Başlık 3 Char"/>
+    <w:basedOn w:val="VarsaylanParagrafYazTipi"/>
+    <w:link w:val="Balk3"/>
     <w:uiPriority w:val="9"/>
     <w:semiHidden/>
     <w:rsid w:val="00F83180"/>
@@ -5795,10 +5633,10 @@
       <w:szCs w:val="28"/>
     </w:rPr>
   </w:style>
-  <w:style w:type="character" w:customStyle="1" w:styleId="berschrift4Zchn">
-    <w:name w:val="Überschrift 4 Zchn"/>
-    <w:basedOn w:val="Absatz-Standardschriftart"/>
-    <w:link w:val="berschrift4"/>
+  <w:style w:type="character" w:customStyle="1" w:styleId="Balk4Char">
+    <w:name w:val="Başlık 4 Char"/>
+    <w:basedOn w:val="VarsaylanParagrafYazTipi"/>
+    <w:link w:val="Balk4"/>
     <w:uiPriority w:val="9"/>
     <w:semiHidden/>
     <w:rsid w:val="00F83180"/>
@@ -5809,10 +5647,10 @@
       <w:color w:val="0F4761" w:themeColor="accent1" w:themeShade="BF"/>
     </w:rPr>
   </w:style>
-  <w:style w:type="character" w:customStyle="1" w:styleId="berschrift5Zchn">
-    <w:name w:val="Überschrift 5 Zchn"/>
-    <w:basedOn w:val="Absatz-Standardschriftart"/>
-    <w:link w:val="berschrift5"/>
+  <w:style w:type="character" w:customStyle="1" w:styleId="Balk5Char">
+    <w:name w:val="Başlık 5 Char"/>
+    <w:basedOn w:val="VarsaylanParagrafYazTipi"/>
+    <w:link w:val="Balk5"/>
     <w:uiPriority w:val="9"/>
     <w:semiHidden/>
     <w:rsid w:val="00F83180"/>
@@ -5821,10 +5659,10 @@
       <w:color w:val="0F4761" w:themeColor="accent1" w:themeShade="BF"/>
     </w:rPr>
   </w:style>
-  <w:style w:type="character" w:customStyle="1" w:styleId="berschrift6Zchn">
-    <w:name w:val="Überschrift 6 Zchn"/>
-    <w:basedOn w:val="Absatz-Standardschriftart"/>
-    <w:link w:val="berschrift6"/>
+  <w:style w:type="character" w:customStyle="1" w:styleId="Balk6Char">
+    <w:name w:val="Başlık 6 Char"/>
+    <w:basedOn w:val="VarsaylanParagrafYazTipi"/>
+    <w:link w:val="Balk6"/>
     <w:uiPriority w:val="9"/>
     <w:semiHidden/>
     <w:rsid w:val="00F83180"/>
@@ -5835,10 +5673,10 @@
       <w:color w:val="595959" w:themeColor="text1" w:themeTint="A6"/>
     </w:rPr>
   </w:style>
-  <w:style w:type="character" w:customStyle="1" w:styleId="berschrift7Zchn">
-    <w:name w:val="Überschrift 7 Zchn"/>
-    <w:basedOn w:val="Absatz-Standardschriftart"/>
-    <w:link w:val="berschrift7"/>
+  <w:style w:type="character" w:customStyle="1" w:styleId="Balk7Char">
+    <w:name w:val="Başlık 7 Char"/>
+    <w:basedOn w:val="VarsaylanParagrafYazTipi"/>
+    <w:link w:val="Balk7"/>
     <w:uiPriority w:val="9"/>
     <w:semiHidden/>
     <w:rsid w:val="00F83180"/>
@@ -5847,10 +5685,10 @@
       <w:color w:val="595959" w:themeColor="text1" w:themeTint="A6"/>
     </w:rPr>
   </w:style>
-  <w:style w:type="character" w:customStyle="1" w:styleId="berschrift8Zchn">
-    <w:name w:val="Überschrift 8 Zchn"/>
-    <w:basedOn w:val="Absatz-Standardschriftart"/>
-    <w:link w:val="berschrift8"/>
+  <w:style w:type="character" w:customStyle="1" w:styleId="Balk8Char">
+    <w:name w:val="Başlık 8 Char"/>
+    <w:basedOn w:val="VarsaylanParagrafYazTipi"/>
+    <w:link w:val="Balk8"/>
     <w:uiPriority w:val="9"/>
     <w:semiHidden/>
     <w:rsid w:val="00F83180"/>
@@ -5861,10 +5699,10 @@
       <w:color w:val="272727" w:themeColor="text1" w:themeTint="D8"/>
     </w:rPr>
   </w:style>
-  <w:style w:type="character" w:customStyle="1" w:styleId="berschrift9Zchn">
-    <w:name w:val="Überschrift 9 Zchn"/>
-    <w:basedOn w:val="Absatz-Standardschriftart"/>
-    <w:link w:val="berschrift9"/>
+  <w:style w:type="character" w:customStyle="1" w:styleId="Balk9Char">
+    <w:name w:val="Başlık 9 Char"/>
+    <w:basedOn w:val="VarsaylanParagrafYazTipi"/>
+    <w:link w:val="Balk9"/>
     <w:uiPriority w:val="9"/>
     <w:semiHidden/>
     <w:rsid w:val="00F83180"/>
@@ -5873,11 +5711,11 @@
       <w:color w:val="272727" w:themeColor="text1" w:themeTint="D8"/>
     </w:rPr>
   </w:style>
-  <w:style w:type="paragraph" w:styleId="Titel">
+  <w:style w:type="paragraph" w:styleId="KonuBal">
     <w:name w:val="Title"/>
-    <w:basedOn w:val="Standard"/>
-    <w:next w:val="Standard"/>
-    <w:link w:val="TitelZchn"/>
+    <w:basedOn w:val="Normal"/>
+    <w:next w:val="Normal"/>
+    <w:link w:val="KonuBalChar"/>
     <w:uiPriority w:val="10"/>
     <w:qFormat/>
     <w:rsid w:val="00F83180"/>
@@ -5893,10 +5731,10 @@
       <w:szCs w:val="56"/>
     </w:rPr>
   </w:style>
-  <w:style w:type="character" w:customStyle="1" w:styleId="TitelZchn">
-    <w:name w:val="Titel Zchn"/>
-    <w:basedOn w:val="Absatz-Standardschriftart"/>
-    <w:link w:val="Titel"/>
+  <w:style w:type="character" w:customStyle="1" w:styleId="KonuBalChar">
+    <w:name w:val="Konu Başlığı Char"/>
+    <w:basedOn w:val="VarsaylanParagrafYazTipi"/>
+    <w:link w:val="KonuBal"/>
     <w:uiPriority w:val="10"/>
     <w:rsid w:val="00F83180"/>
     <w:rPr>
@@ -5907,11 +5745,11 @@
       <w:szCs w:val="56"/>
     </w:rPr>
   </w:style>
-  <w:style w:type="paragraph" w:styleId="Untertitel">
+  <w:style w:type="paragraph" w:styleId="Altyaz">
     <w:name w:val="Subtitle"/>
-    <w:basedOn w:val="Standard"/>
-    <w:next w:val="Standard"/>
-    <w:link w:val="UntertitelZchn"/>
+    <w:basedOn w:val="Normal"/>
+    <w:next w:val="Normal"/>
+    <w:link w:val="AltyazChar"/>
     <w:uiPriority w:val="11"/>
     <w:qFormat/>
     <w:rsid w:val="00F83180"/>
@@ -5928,10 +5766,10 @@
       <w:szCs w:val="28"/>
     </w:rPr>
   </w:style>
-  <w:style w:type="character" w:customStyle="1" w:styleId="UntertitelZchn">
-    <w:name w:val="Untertitel Zchn"/>
-    <w:basedOn w:val="Absatz-Standardschriftart"/>
-    <w:link w:val="Untertitel"/>
+  <w:style w:type="character" w:customStyle="1" w:styleId="AltyazChar">
+    <w:name w:val="Altyazı Char"/>
+    <w:basedOn w:val="VarsaylanParagrafYazTipi"/>
+    <w:link w:val="Altyaz"/>
     <w:uiPriority w:val="11"/>
     <w:rsid w:val="00F83180"/>
     <w:rPr>
@@ -5942,11 +5780,11 @@
       <w:szCs w:val="28"/>
     </w:rPr>
   </w:style>
-  <w:style w:type="paragraph" w:styleId="Zitat">
+  <w:style w:type="paragraph" w:styleId="Alnt">
     <w:name w:val="Quote"/>
-    <w:basedOn w:val="Standard"/>
-    <w:next w:val="Standard"/>
-    <w:link w:val="ZitatZchn"/>
+    <w:basedOn w:val="Normal"/>
+    <w:next w:val="Normal"/>
+    <w:link w:val="AlntChar"/>
     <w:uiPriority w:val="29"/>
     <w:qFormat/>
     <w:rsid w:val="00F83180"/>
@@ -5960,10 +5798,10 @@
       <w:color w:val="404040" w:themeColor="text1" w:themeTint="BF"/>
     </w:rPr>
   </w:style>
-  <w:style w:type="character" w:customStyle="1" w:styleId="ZitatZchn">
-    <w:name w:val="Zitat Zchn"/>
-    <w:basedOn w:val="Absatz-Standardschriftart"/>
-    <w:link w:val="Zitat"/>
+  <w:style w:type="character" w:customStyle="1" w:styleId="AlntChar">
+    <w:name w:val="Alıntı Char"/>
+    <w:basedOn w:val="VarsaylanParagrafYazTipi"/>
+    <w:link w:val="Alnt"/>
     <w:uiPriority w:val="29"/>
     <w:rsid w:val="00F83180"/>
     <w:rPr>
@@ -5972,9 +5810,9 @@
       <w:color w:val="404040" w:themeColor="text1" w:themeTint="BF"/>
     </w:rPr>
   </w:style>
-  <w:style w:type="paragraph" w:styleId="Listenabsatz">
+  <w:style w:type="paragraph" w:styleId="ListeParagraf">
     <w:name w:val="List Paragraph"/>
-    <w:basedOn w:val="Standard"/>
+    <w:basedOn w:val="Normal"/>
     <w:uiPriority w:val="34"/>
     <w:qFormat/>
     <w:rsid w:val="00F83180"/>
@@ -5983,9 +5821,9 @@
       <w:contextualSpacing/>
     </w:pPr>
   </w:style>
-  <w:style w:type="character" w:styleId="IntensiveHervorhebung">
+  <w:style w:type="character" w:styleId="GlVurgulama">
     <w:name w:val="Intense Emphasis"/>
-    <w:basedOn w:val="Absatz-Standardschriftart"/>
+    <w:basedOn w:val="VarsaylanParagrafYazTipi"/>
     <w:uiPriority w:val="21"/>
     <w:qFormat/>
     <w:rsid w:val="00F83180"/>
@@ -5995,11 +5833,11 @@
       <w:color w:val="0F4761" w:themeColor="accent1" w:themeShade="BF"/>
     </w:rPr>
   </w:style>
-  <w:style w:type="paragraph" w:styleId="IntensivesZitat">
+  <w:style w:type="paragraph" w:styleId="GlAlnt">
     <w:name w:val="Intense Quote"/>
-    <w:basedOn w:val="Standard"/>
-    <w:next w:val="Standard"/>
-    <w:link w:val="IntensivesZitatZchn"/>
+    <w:basedOn w:val="Normal"/>
+    <w:next w:val="Normal"/>
+    <w:link w:val="GlAlntChar"/>
     <w:uiPriority w:val="30"/>
     <w:qFormat/>
     <w:rsid w:val="00F83180"/>
@@ -6018,10 +5856,10 @@
       <w:color w:val="0F4761" w:themeColor="accent1" w:themeShade="BF"/>
     </w:rPr>
   </w:style>
-  <w:style w:type="character" w:customStyle="1" w:styleId="IntensivesZitatZchn">
-    <w:name w:val="Intensives Zitat Zchn"/>
-    <w:basedOn w:val="Absatz-Standardschriftart"/>
-    <w:link w:val="IntensivesZitat"/>
+  <w:style w:type="character" w:customStyle="1" w:styleId="GlAlntChar">
+    <w:name w:val="Güçlü Alıntı Char"/>
+    <w:basedOn w:val="VarsaylanParagrafYazTipi"/>
+    <w:link w:val="GlAlnt"/>
     <w:uiPriority w:val="30"/>
     <w:rsid w:val="00F83180"/>
     <w:rPr>
@@ -6030,9 +5868,9 @@
       <w:color w:val="0F4761" w:themeColor="accent1" w:themeShade="BF"/>
     </w:rPr>
   </w:style>
-  <w:style w:type="character" w:styleId="IntensiverVerweis">
+  <w:style w:type="character" w:styleId="GlBavuru">
     <w:name w:val="Intense Reference"/>
-    <w:basedOn w:val="Absatz-Standardschriftart"/>
+    <w:basedOn w:val="VarsaylanParagrafYazTipi"/>
     <w:uiPriority w:val="32"/>
     <w:qFormat/>
     <w:rsid w:val="00F83180"/>
@@ -6046,17 +5884,17 @@
   </w:style>
   <w:style w:type="character" w:customStyle="1" w:styleId="normaltextrun">
     <w:name w:val="normaltextrun"/>
-    <w:basedOn w:val="Absatz-Standardschriftart"/>
+    <w:basedOn w:val="VarsaylanParagrafYazTipi"/>
     <w:rsid w:val="009E7348"/>
   </w:style>
   <w:style w:type="character" w:customStyle="1" w:styleId="eop">
     <w:name w:val="eop"/>
-    <w:basedOn w:val="Absatz-Standardschriftart"/>
+    <w:basedOn w:val="VarsaylanParagrafYazTipi"/>
     <w:rsid w:val="009E7348"/>
   </w:style>
   <w:style w:type="paragraph" w:customStyle="1" w:styleId="paragraph">
     <w:name w:val="paragraph"/>
-    <w:basedOn w:val="Standard"/>
+    <w:basedOn w:val="Normal"/>
     <w:rsid w:val="00074AA3"/>
     <w:pPr>
       <w:spacing w:before="100" w:beforeAutospacing="1" w:after="100" w:afterAutospacing="1" w:line="240" w:lineRule="auto"/>
@@ -6069,12 +5907,12 @@
   </w:style>
   <w:style w:type="character" w:customStyle="1" w:styleId="scxw47173885">
     <w:name w:val="scxw47173885"/>
-    <w:basedOn w:val="Absatz-Standardschriftart"/>
+    <w:basedOn w:val="VarsaylanParagrafYazTipi"/>
     <w:rsid w:val="00074AA3"/>
   </w:style>
   <w:style w:type="paragraph" w:customStyle="1" w:styleId="p1">
     <w:name w:val="p1"/>
-    <w:basedOn w:val="Standard"/>
+    <w:basedOn w:val="Normal"/>
     <w:rsid w:val="000B2823"/>
     <w:pPr>
       <w:spacing w:after="0" w:line="240" w:lineRule="auto"/>
@@ -6091,13 +5929,13 @@
   </w:style>
   <w:style w:type="character" w:customStyle="1" w:styleId="apple-converted-space">
     <w:name w:val="apple-converted-space"/>
-    <w:basedOn w:val="Absatz-Standardschriftart"/>
+    <w:basedOn w:val="VarsaylanParagrafYazTipi"/>
     <w:rsid w:val="000B2823"/>
   </w:style>
-  <w:style w:type="paragraph" w:styleId="Funotentext">
+  <w:style w:type="paragraph" w:styleId="DipnotMetni">
     <w:name w:val="footnote text"/>
-    <w:basedOn w:val="Standard"/>
-    <w:link w:val="FunotentextZchn"/>
+    <w:basedOn w:val="Normal"/>
+    <w:link w:val="DipnotMetniChar"/>
     <w:uiPriority w:val="99"/>
     <w:semiHidden/>
     <w:unhideWhenUsed/>
@@ -6110,10 +5948,10 @@
       <w:szCs w:val="20"/>
     </w:rPr>
   </w:style>
-  <w:style w:type="character" w:customStyle="1" w:styleId="FunotentextZchn">
-    <w:name w:val="Fußnotentext Zchn"/>
-    <w:basedOn w:val="Absatz-Standardschriftart"/>
-    <w:link w:val="Funotentext"/>
+  <w:style w:type="character" w:customStyle="1" w:styleId="DipnotMetniChar">
+    <w:name w:val="Dipnot Metni Char"/>
+    <w:basedOn w:val="VarsaylanParagrafYazTipi"/>
+    <w:link w:val="DipnotMetni"/>
     <w:uiPriority w:val="99"/>
     <w:semiHidden/>
     <w:rsid w:val="00A14097"/>
@@ -6122,15 +5960,66 @@
       <w:szCs w:val="20"/>
     </w:rPr>
   </w:style>
-  <w:style w:type="character" w:styleId="Funotenzeichen">
+  <w:style w:type="character" w:styleId="DipnotBavurusu">
     <w:name w:val="footnote reference"/>
-    <w:basedOn w:val="Absatz-Standardschriftart"/>
+    <w:basedOn w:val="VarsaylanParagrafYazTipi"/>
     <w:uiPriority w:val="99"/>
     <w:semiHidden/>
     <w:unhideWhenUsed/>
     <w:rsid w:val="00A14097"/>
     <w:rPr>
       <w:vertAlign w:val="superscript"/>
+    </w:rPr>
+  </w:style>
+  <w:style w:type="paragraph" w:styleId="NormalWeb">
+    <w:name w:val="Normal (Web)"/>
+    <w:basedOn w:val="Normal"/>
+    <w:uiPriority w:val="99"/>
+    <w:unhideWhenUsed/>
+    <w:rsid w:val="00A26B23"/>
+    <w:pPr>
+      <w:spacing w:before="100" w:beforeAutospacing="1" w:after="100" w:afterAutospacing="1" w:line="240" w:lineRule="auto"/>
+    </w:pPr>
+    <w:rPr>
+      <w:rFonts w:ascii="Times New Roman" w:eastAsia="Times New Roman" w:hAnsi="Times New Roman" w:cs="Times New Roman"/>
+      <w:kern w:val="0"/>
+      <w:lang w:val="tr-CH" w:eastAsia="tr-TR"/>
+      <w14:ligatures w14:val="none"/>
+    </w:rPr>
+  </w:style>
+  <w:style w:type="character" w:styleId="Vurgu">
+    <w:name w:val="Emphasis"/>
+    <w:basedOn w:val="VarsaylanParagrafYazTipi"/>
+    <w:uiPriority w:val="20"/>
+    <w:qFormat/>
+    <w:rsid w:val="00A26B23"/>
+    <w:rPr>
+      <w:i/>
+      <w:iCs/>
+    </w:rPr>
+  </w:style>
+  <w:style w:type="character" w:styleId="HTMLKodu">
+    <w:name w:val="HTML Code"/>
+    <w:basedOn w:val="VarsaylanParagrafYazTipi"/>
+    <w:uiPriority w:val="99"/>
+    <w:semiHidden/>
+    <w:unhideWhenUsed/>
+    <w:rsid w:val="00A26B23"/>
+    <w:rPr>
+      <w:rFonts w:ascii="Courier New" w:eastAsia="Times New Roman" w:hAnsi="Courier New" w:cs="Courier New"/>
+      <w:sz w:val="20"/>
+      <w:szCs w:val="20"/>
+    </w:rPr>
+  </w:style>
+  <w:style w:type="character" w:styleId="Gl">
+    <w:name w:val="Strong"/>
+    <w:basedOn w:val="VarsaylanParagrafYazTipi"/>
+    <w:uiPriority w:val="22"/>
+    <w:qFormat/>
+    <w:rsid w:val="0052453B"/>
+    <w:rPr>
+      <w:b/>
+      <w:bCs/>
     </w:rPr>
   </w:style>
 </w:styles>

</xml_diff>

<commit_message>
Update documentation: Seda – Latest Version
</commit_message>
<xml_diff>
--- a/documentation/CIP_FS2026_104_Project_Documentation.docx
+++ b/documentation/CIP_FS2026_104_Project_Documentation.docx
@@ -21,7 +21,27 @@
           <w:sz w:val="20"/>
           <w:szCs w:val="20"/>
         </w:rPr>
-        <w:t>Group 104 – Margarita Arias, Seda Dülger, Michael Ryan, Svenja Ryf</w:t>
+        <w:t xml:space="preserve">Group 104 – Margarita Arias, </w:t>
+      </w:r>
+      <w:r>
+        <w:rPr>
+          <w:rFonts w:ascii="Arial" w:hAnsi="Arial" w:cs="Arial"/>
+          <w:b/>
+          <w:bCs/>
+          <w:sz w:val="20"/>
+          <w:szCs w:val="20"/>
+        </w:rPr>
+        <w:t xml:space="preserve"> Havva </w:t>
+      </w:r>
+      <w:r>
+        <w:rPr>
+          <w:rFonts w:ascii="Arial" w:hAnsi="Arial" w:cs="Arial"/>
+          <w:b/>
+          <w:bCs/>
+          <w:sz w:val="20"/>
+          <w:szCs w:val="20"/>
+        </w:rPr>
+        <w:t>Seda Dülger, Michael Ryan, Svenja Ryf</w:t>
       </w:r>
     </w:p>
     <w:p>
@@ -921,16 +941,7 @@
           <w:sz w:val="20"/>
           <w:szCs w:val="20"/>
         </w:rPr>
-        <w:t>field showed comparable improvement, with missing values reduced to 49, corresponding to over 95% completeness.</w:t>
-      </w:r>
-      <w:r>
-        <w:rPr>
-          <w:rFonts w:ascii="Arial" w:hAnsi="Arial" w:cs="Arial"/>
-          <w:color w:val="EE0000"/>
-          <w:sz w:val="20"/>
-          <w:szCs w:val="20"/>
-        </w:rPr>
-        <w:t xml:space="preserve"> </w:t>
+        <w:t xml:space="preserve">field showed comparable improvement, with missing values reduced to 49, corresponding to over 95% completeness. </w:t>
       </w:r>
     </w:p>
     <w:p>
@@ -1308,7 +1319,7 @@
           <w:sz w:val="20"/>
           <w:szCs w:val="20"/>
         </w:rPr>
-        <w:t>pages.</w:t>
+        <w:t xml:space="preserve">pages. </w:t>
       </w:r>
       <w:r>
         <w:rPr>
@@ -1317,7 +1328,7 @@
           <w:sz w:val="20"/>
           <w:szCs w:val="20"/>
         </w:rPr>
-        <w:t xml:space="preserve"> </w:t>
+        <w:t xml:space="preserve">Once identified, the full text content of each listing card was </w:t>
       </w:r>
       <w:r>
         <w:rPr>
@@ -1326,25 +1337,7 @@
           <w:sz w:val="20"/>
           <w:szCs w:val="20"/>
         </w:rPr>
-        <w:t xml:space="preserve">Once identified, the full text content of each listing card was </w:t>
-      </w:r>
-      <w:r>
-        <w:rPr>
-          <w:rFonts w:ascii="Arial" w:hAnsi="Arial" w:cs="Arial"/>
-          <w:color w:val="EE0000"/>
-          <w:sz w:val="20"/>
-          <w:szCs w:val="20"/>
-        </w:rPr>
-        <w:t>extracted and passed</w:t>
-      </w:r>
-      <w:r>
-        <w:rPr>
-          <w:rFonts w:ascii="Arial" w:hAnsi="Arial" w:cs="Arial"/>
-          <w:color w:val="EE0000"/>
-          <w:sz w:val="20"/>
-          <w:szCs w:val="20"/>
-        </w:rPr>
-        <w:t xml:space="preserve"> </w:t>
+        <w:t xml:space="preserve">extracted and passed </w:t>
       </w:r>
       <w:r>
         <w:rPr>
@@ -1375,16 +1368,7 @@
           <w:sz w:val="20"/>
           <w:szCs w:val="20"/>
         </w:rPr>
-        <w:t>the parsing functions</w:t>
-      </w:r>
-      <w:r>
-        <w:rPr>
-          <w:rFonts w:ascii="Arial" w:hAnsi="Arial" w:cs="Arial"/>
-          <w:color w:val="EE0000"/>
-          <w:sz w:val="20"/>
-          <w:szCs w:val="20"/>
-        </w:rPr>
-        <w:t xml:space="preserve"> </w:t>
+        <w:t xml:space="preserve">the parsing functions </w:t>
       </w:r>
       <w:r>
         <w:rPr>
@@ -1437,16 +1421,7 @@
           <w:sz w:val="20"/>
           <w:szCs w:val="20"/>
         </w:rPr>
-        <w:t xml:space="preserve"> </w:t>
-      </w:r>
-      <w:r>
-        <w:rPr>
-          <w:rFonts w:ascii="Arial" w:hAnsi="Arial" w:cs="Arial"/>
-          <w:color w:val="EE0000"/>
-          <w:sz w:val="20"/>
-          <w:szCs w:val="20"/>
-        </w:rPr>
-        <w:t>All extracted records were appended to a list and converted into a pandas DataFrame. The final dataset was exported as a CSV file for subsequent analysi</w:t>
+        <w:t xml:space="preserve"> All extracted records were appended to a list and converted into a pandas DataFrame. The final dataset was exported as a CSV file for subsequent analysi</w:t>
       </w:r>
       <w:r>
         <w:rPr>

</xml_diff>

<commit_message>
Adding model documentation + grammar changes
</commit_message>
<xml_diff>
--- a/documentation/CIP_FS2026_104_Project_Documentation.docx
+++ b/documentation/CIP_FS2026_104_Project_Documentation.docx
@@ -66,7 +66,7 @@
     </w:p>
     <w:p>
       <w:pPr>
-        <w:pStyle w:val="Balk1"/>
+        <w:pStyle w:val="Heading1"/>
       </w:pPr>
       <w:r>
         <w:t>Overview and Motivation of our project</w:t>
@@ -171,7 +171,7 @@
     </w:p>
     <w:p>
       <w:pPr>
-        <w:pStyle w:val="Balk1"/>
+        <w:pStyle w:val="Heading1"/>
         <w:numPr>
           <w:ilvl w:val="1"/>
           <w:numId w:val="4"/>
@@ -332,7 +332,7 @@
     </w:p>
     <w:p>
       <w:pPr>
-        <w:pStyle w:val="Balk1"/>
+        <w:pStyle w:val="Heading1"/>
       </w:pPr>
       <w:r>
         <w:t>Met</w:t>
@@ -343,7 +343,7 @@
     </w:p>
     <w:p>
       <w:pPr>
-        <w:pStyle w:val="Balk1"/>
+        <w:pStyle w:val="Heading1"/>
         <w:numPr>
           <w:ilvl w:val="1"/>
           <w:numId w:val="4"/>
@@ -434,7 +434,7 @@
     </w:p>
     <w:p>
       <w:pPr>
-        <w:pStyle w:val="Balk1"/>
+        <w:pStyle w:val="Heading1"/>
         <w:numPr>
           <w:ilvl w:val="1"/>
           <w:numId w:val="4"/>
@@ -811,7 +811,7 @@
       </w:r>
       <w:r>
         <w:rPr>
-          <w:rStyle w:val="Vurgu"/>
+          <w:rStyle w:val="Emphasis"/>
           <w:rFonts w:ascii="Arial" w:eastAsiaTheme="majorEastAsia" w:hAnsi="Arial" w:cs="Arial"/>
           <w:color w:val="EE0000"/>
           <w:sz w:val="20"/>
@@ -821,7 +821,7 @@
       </w:r>
       <w:r>
         <w:rPr>
-          <w:rStyle w:val="Vurgu"/>
+          <w:rStyle w:val="Emphasis"/>
           <w:rFonts w:ascii="Arial" w:eastAsiaTheme="majorEastAsia" w:hAnsi="Arial" w:cs="Arial"/>
           <w:color w:val="EE0000"/>
           <w:sz w:val="20"/>
@@ -868,7 +868,7 @@
       </w:r>
       <w:r>
         <w:rPr>
-          <w:rStyle w:val="Vurgu"/>
+          <w:rStyle w:val="Emphasis"/>
           <w:rFonts w:ascii="Arial" w:eastAsiaTheme="majorEastAsia" w:hAnsi="Arial" w:cs="Arial"/>
           <w:color w:val="EE0000"/>
           <w:sz w:val="20"/>
@@ -916,7 +916,7 @@
       </w:r>
       <w:r>
         <w:rPr>
-          <w:rStyle w:val="Vurgu"/>
+          <w:rStyle w:val="Emphasis"/>
           <w:rFonts w:ascii="Arial" w:eastAsiaTheme="majorEastAsia" w:hAnsi="Arial" w:cs="Arial"/>
           <w:color w:val="EE0000"/>
           <w:sz w:val="20"/>
@@ -1341,7 +1341,7 @@
       </w:r>
       <w:r>
         <w:rPr>
-          <w:rStyle w:val="Gl"/>
+          <w:rStyle w:val="Strong"/>
           <w:rFonts w:ascii="Arial" w:eastAsiaTheme="majorEastAsia" w:hAnsi="Arial" w:cs="Arial"/>
           <w:b w:val="0"/>
           <w:bCs w:val="0"/>
@@ -1399,7 +1399,7 @@
       </w:r>
       <w:r>
         <w:rPr>
-          <w:rStyle w:val="HTMLKodu"/>
+          <w:rStyle w:val="HTMLCode"/>
           <w:rFonts w:ascii="Arial" w:eastAsiaTheme="majorEastAsia" w:hAnsi="Arial" w:cs="Arial"/>
           <w:color w:val="EE0000"/>
         </w:rPr>
@@ -1435,7 +1435,7 @@
     </w:p>
     <w:p>
       <w:pPr>
-        <w:pStyle w:val="Balk1"/>
+        <w:pStyle w:val="Heading1"/>
         <w:numPr>
           <w:ilvl w:val="1"/>
           <w:numId w:val="4"/>
@@ -1497,7 +1497,7 @@
     </w:p>
     <w:p>
       <w:pPr>
-        <w:pStyle w:val="Balk1"/>
+        <w:pStyle w:val="Heading1"/>
         <w:numPr>
           <w:ilvl w:val="1"/>
           <w:numId w:val="4"/>
@@ -1698,6 +1698,7 @@
         </w:rPr>
         <w:t xml:space="preserve">Before further analysis, we first checked missing values. No missing values were found in the key variables canton, </w:t>
       </w:r>
+      <w:proofErr w:type="spellStart"/>
       <w:r>
         <w:rPr>
           <w:rStyle w:val="normaltextrun"/>
@@ -1706,7 +1707,18 @@
           <w:sz w:val="20"/>
           <w:szCs w:val="20"/>
         </w:rPr>
-        <w:t>price_chf,</w:t>
+        <w:t>price_chf</w:t>
+      </w:r>
+      <w:proofErr w:type="spellEnd"/>
+      <w:r>
+        <w:rPr>
+          <w:rStyle w:val="normaltextrun"/>
+          <w:rFonts w:ascii="Courier New" w:hAnsi="Courier New" w:cs="Courier New"/>
+          <w:color w:val="000000"/>
+          <w:sz w:val="20"/>
+          <w:szCs w:val="20"/>
+        </w:rPr>
+        <w:t>,</w:t>
       </w:r>
       <w:r>
         <w:rPr>
@@ -1915,7 +1927,7 @@
     </w:p>
     <w:p>
       <w:pPr>
-        <w:pStyle w:val="Balk1"/>
+        <w:pStyle w:val="Heading1"/>
         <w:rPr>
           <w:sz w:val="21"/>
           <w:szCs w:val="21"/>
@@ -1927,7 +1939,7 @@
     </w:p>
     <w:p>
       <w:pPr>
-        <w:pStyle w:val="Balk1"/>
+        <w:pStyle w:val="Heading1"/>
         <w:numPr>
           <w:ilvl w:val="1"/>
           <w:numId w:val="4"/>
@@ -2227,7 +2239,7 @@
       </w:r>
       <w:r>
         <w:rPr>
-          <w:rStyle w:val="DipnotBavurusu"/>
+          <w:rStyle w:val="FootnoteReference"/>
           <w:rFonts w:ascii="Arial" w:hAnsi="Arial" w:cs="Arial"/>
           <w:color w:val="000000"/>
           <w:sz w:val="21"/>
@@ -2782,7 +2794,7 @@
       </w:r>
       <w:r>
         <w:rPr>
-          <w:rStyle w:val="DipnotBavurusu"/>
+          <w:rStyle w:val="FootnoteReference"/>
           <w:rFonts w:ascii="Arial" w:hAnsi="Arial" w:cs="Arial"/>
           <w:color w:val="000000"/>
           <w:sz w:val="21"/>
@@ -3263,7 +3275,7 @@
       </w:r>
       <w:r>
         <w:rPr>
-          <w:rStyle w:val="DipnotBavurusu"/>
+          <w:rStyle w:val="FootnoteReference"/>
           <w:rFonts w:ascii="Arial" w:hAnsi="Arial" w:cs="Arial"/>
           <w:color w:val="000000"/>
           <w:sz w:val="21"/>
@@ -3544,7 +3556,7 @@
     </w:p>
     <w:p>
       <w:pPr>
-        <w:pStyle w:val="Balk1"/>
+        <w:pStyle w:val="Heading1"/>
         <w:numPr>
           <w:ilvl w:val="1"/>
           <w:numId w:val="4"/>
@@ -3557,42 +3569,375 @@
     </w:p>
     <w:p>
       <w:pPr>
-        <w:jc w:val="both"/>
-        <w:rPr>
-          <w:rFonts w:ascii="Arial" w:hAnsi="Arial" w:cs="Arial"/>
-          <w:b/>
-          <w:bCs/>
-          <w:color w:val="EE0000"/>
-          <w:sz w:val="21"/>
-          <w:szCs w:val="21"/>
-        </w:rPr>
-      </w:pPr>
-      <w:r>
-        <w:rPr>
-          <w:rFonts w:ascii="Arial" w:hAnsi="Arial" w:cs="Arial"/>
-          <w:b/>
-          <w:bCs/>
-          <w:color w:val="EE0000"/>
-          <w:sz w:val="21"/>
-          <w:szCs w:val="21"/>
-        </w:rPr>
-        <w:t>SEDA</w:t>
-      </w:r>
-      <w:r>
-        <w:rPr>
-          <w:rFonts w:ascii="Arial" w:hAnsi="Arial" w:cs="Arial"/>
-          <w:b/>
-          <w:bCs/>
-          <w:color w:val="EE0000"/>
-          <w:sz w:val="21"/>
-          <w:szCs w:val="21"/>
-        </w:rPr>
-        <w:t xml:space="preserve"> AND MICHAEL</w:t>
-      </w:r>
-    </w:p>
-    <w:p>
-      <w:pPr>
-        <w:pStyle w:val="Balk1"/>
+        <w:rPr>
+          <w:rFonts w:ascii="Arial" w:hAnsi="Arial" w:cs="Arial"/>
+          <w:sz w:val="21"/>
+          <w:szCs w:val="21"/>
+        </w:rPr>
+      </w:pPr>
+      <w:r>
+        <w:rPr>
+          <w:rFonts w:ascii="Arial" w:hAnsi="Arial" w:cs="Arial"/>
+          <w:sz w:val="21"/>
+          <w:szCs w:val="21"/>
+        </w:rPr>
+        <w:t xml:space="preserve">Two models were </w:t>
+      </w:r>
+      <w:r>
+        <w:rPr>
+          <w:rFonts w:ascii="Arial" w:hAnsi="Arial" w:cs="Arial"/>
+          <w:sz w:val="21"/>
+          <w:szCs w:val="21"/>
+        </w:rPr>
+        <w:t>constructed</w:t>
+      </w:r>
+      <w:r>
+        <w:rPr>
+          <w:rFonts w:ascii="Arial" w:hAnsi="Arial" w:cs="Arial"/>
+          <w:sz w:val="21"/>
+          <w:szCs w:val="21"/>
+        </w:rPr>
+        <w:t xml:space="preserve"> to predict monthly rental prices for apartments and houses across Swiss cantons</w:t>
+      </w:r>
+      <w:r>
+        <w:rPr>
+          <w:rFonts w:ascii="Arial" w:hAnsi="Arial" w:cs="Arial"/>
+          <w:sz w:val="21"/>
+          <w:szCs w:val="21"/>
+        </w:rPr>
+        <w:t xml:space="preserve">: </w:t>
+      </w:r>
+      <w:proofErr w:type="spellStart"/>
+      <w:r>
+        <w:rPr>
+          <w:rFonts w:ascii="Arial" w:hAnsi="Arial" w:cs="Arial"/>
+          <w:sz w:val="21"/>
+          <w:szCs w:val="21"/>
+        </w:rPr>
+        <w:t>LightGBM</w:t>
+      </w:r>
+      <w:proofErr w:type="spellEnd"/>
+      <w:r>
+        <w:rPr>
+          <w:rFonts w:ascii="Arial" w:hAnsi="Arial" w:cs="Arial"/>
+          <w:sz w:val="21"/>
+          <w:szCs w:val="21"/>
+        </w:rPr>
+        <w:t xml:space="preserve"> and </w:t>
+      </w:r>
+      <w:proofErr w:type="spellStart"/>
+      <w:r>
+        <w:rPr>
+          <w:rFonts w:ascii="Arial" w:hAnsi="Arial" w:cs="Arial"/>
+          <w:sz w:val="21"/>
+          <w:szCs w:val="21"/>
+        </w:rPr>
+        <w:t>CatBoost</w:t>
+      </w:r>
+      <w:proofErr w:type="spellEnd"/>
+      <w:r>
+        <w:rPr>
+          <w:rFonts w:ascii="Arial" w:hAnsi="Arial" w:cs="Arial"/>
+          <w:sz w:val="21"/>
+          <w:szCs w:val="21"/>
+        </w:rPr>
+        <w:t xml:space="preserve"> (model.py)</w:t>
+      </w:r>
+      <w:r>
+        <w:rPr>
+          <w:rFonts w:ascii="Arial" w:hAnsi="Arial" w:cs="Arial"/>
+          <w:sz w:val="21"/>
+          <w:szCs w:val="21"/>
+        </w:rPr>
+        <w:t xml:space="preserve">. Several features </w:t>
+      </w:r>
+      <w:r>
+        <w:rPr>
+          <w:rFonts w:ascii="Arial" w:hAnsi="Arial" w:cs="Arial"/>
+          <w:sz w:val="21"/>
+          <w:szCs w:val="21"/>
+        </w:rPr>
+        <w:t>were</w:t>
+      </w:r>
+      <w:r>
+        <w:rPr>
+          <w:rFonts w:ascii="Arial" w:hAnsi="Arial" w:cs="Arial"/>
+          <w:sz w:val="21"/>
+          <w:szCs w:val="21"/>
+        </w:rPr>
+        <w:t xml:space="preserve"> engineered, including a derived price-per-m² metric, city extraction from location text, and a binary flag indicating whether a listing is in its canton's capital. A</w:t>
+      </w:r>
+      <w:r>
+        <w:rPr>
+          <w:rFonts w:ascii="Arial" w:hAnsi="Arial" w:cs="Arial"/>
+          <w:sz w:val="21"/>
+          <w:szCs w:val="21"/>
+        </w:rPr>
+        <w:t xml:space="preserve">dditionally, we’ve filtered out </w:t>
+      </w:r>
+      <w:r>
+        <w:rPr>
+          <w:rFonts w:ascii="Arial" w:hAnsi="Arial" w:cs="Arial"/>
+          <w:sz w:val="21"/>
+          <w:szCs w:val="21"/>
+        </w:rPr>
+        <w:t>luxury properties above 5,000 CHF/month</w:t>
+      </w:r>
+      <w:r>
+        <w:rPr>
+          <w:rFonts w:ascii="Arial" w:hAnsi="Arial" w:cs="Arial"/>
+          <w:sz w:val="21"/>
+          <w:szCs w:val="21"/>
+        </w:rPr>
+        <w:t xml:space="preserve"> (top </w:t>
+      </w:r>
+      <w:r>
+        <w:rPr>
+          <w:rFonts w:ascii="Arial" w:hAnsi="Arial" w:cs="Arial"/>
+          <w:sz w:val="21"/>
+          <w:szCs w:val="21"/>
+        </w:rPr>
+        <w:t>4% of listings</w:t>
+      </w:r>
+      <w:r>
+        <w:rPr>
+          <w:rFonts w:ascii="Arial" w:hAnsi="Arial" w:cs="Arial"/>
+          <w:sz w:val="21"/>
+          <w:szCs w:val="21"/>
+        </w:rPr>
+        <w:t>)</w:t>
+      </w:r>
+      <w:r>
+        <w:rPr>
+          <w:rFonts w:ascii="Arial" w:hAnsi="Arial" w:cs="Arial"/>
+          <w:sz w:val="21"/>
+          <w:szCs w:val="21"/>
+        </w:rPr>
+        <w:t xml:space="preserve"> </w:t>
+      </w:r>
+      <w:r>
+        <w:rPr>
+          <w:rFonts w:ascii="Arial" w:hAnsi="Arial" w:cs="Arial"/>
+          <w:sz w:val="21"/>
+          <w:szCs w:val="21"/>
+        </w:rPr>
+        <w:t>to adjust model performance</w:t>
+      </w:r>
+      <w:r>
+        <w:rPr>
+          <w:rFonts w:ascii="Arial" w:hAnsi="Arial" w:cs="Arial"/>
+          <w:sz w:val="21"/>
+          <w:szCs w:val="21"/>
+        </w:rPr>
+        <w:t>. Cities with fewer than 20 listings are grouped into an "Other" category to reduce noise from 994 unique cities down to a manageable set. Both models are trained on four features</w:t>
+      </w:r>
+      <w:r>
+        <w:rPr>
+          <w:rFonts w:ascii="Arial" w:hAnsi="Arial" w:cs="Arial"/>
+          <w:sz w:val="21"/>
+          <w:szCs w:val="21"/>
+        </w:rPr>
+        <w:t xml:space="preserve">: </w:t>
+      </w:r>
+      <w:r>
+        <w:rPr>
+          <w:rFonts w:ascii="Arial" w:hAnsi="Arial" w:cs="Arial"/>
+          <w:sz w:val="21"/>
+          <w:szCs w:val="21"/>
+        </w:rPr>
+        <w:t>canton, city, living area, and number of rooms</w:t>
+      </w:r>
+      <w:r>
+        <w:rPr>
+          <w:rFonts w:ascii="Arial" w:hAnsi="Arial" w:cs="Arial"/>
+          <w:sz w:val="21"/>
+          <w:szCs w:val="21"/>
+        </w:rPr>
+        <w:t xml:space="preserve">, </w:t>
+      </w:r>
+      <w:r>
+        <w:rPr>
+          <w:rFonts w:ascii="Arial" w:hAnsi="Arial" w:cs="Arial"/>
+          <w:sz w:val="21"/>
+          <w:szCs w:val="21"/>
+        </w:rPr>
+        <w:t xml:space="preserve">with </w:t>
+      </w:r>
+      <w:proofErr w:type="spellStart"/>
+      <w:r>
+        <w:rPr>
+          <w:rFonts w:ascii="Arial" w:hAnsi="Arial" w:cs="Arial"/>
+          <w:sz w:val="21"/>
+          <w:szCs w:val="21"/>
+        </w:rPr>
+        <w:t>CatBoost</w:t>
+      </w:r>
+      <w:proofErr w:type="spellEnd"/>
+      <w:r>
+        <w:rPr>
+          <w:rFonts w:ascii="Arial" w:hAnsi="Arial" w:cs="Arial"/>
+          <w:sz w:val="21"/>
+          <w:szCs w:val="21"/>
+        </w:rPr>
+        <w:t xml:space="preserve"> handling the categorical variables natively and </w:t>
+      </w:r>
+      <w:proofErr w:type="spellStart"/>
+      <w:r>
+        <w:rPr>
+          <w:rFonts w:ascii="Arial" w:hAnsi="Arial" w:cs="Arial"/>
+          <w:sz w:val="21"/>
+          <w:szCs w:val="21"/>
+        </w:rPr>
+        <w:t>LightGBM</w:t>
+      </w:r>
+      <w:proofErr w:type="spellEnd"/>
+      <w:r>
+        <w:rPr>
+          <w:rFonts w:ascii="Arial" w:hAnsi="Arial" w:cs="Arial"/>
+          <w:sz w:val="21"/>
+          <w:szCs w:val="21"/>
+        </w:rPr>
+        <w:t xml:space="preserve"> requiring explicit category encoding. Model performance is evaluated using MAE, RMSE, and R², and results are compared </w:t>
+      </w:r>
+      <w:r>
+        <w:rPr>
+          <w:rFonts w:ascii="Arial" w:hAnsi="Arial" w:cs="Arial"/>
+          <w:sz w:val="21"/>
+          <w:szCs w:val="21"/>
+        </w:rPr>
+        <w:t>for app selection, with</w:t>
+      </w:r>
+      <w:r>
+        <w:rPr>
+          <w:rFonts w:ascii="Arial" w:hAnsi="Arial" w:cs="Arial"/>
+          <w:sz w:val="21"/>
+          <w:szCs w:val="21"/>
+        </w:rPr>
+        <w:t xml:space="preserve"> </w:t>
+      </w:r>
+      <w:proofErr w:type="spellStart"/>
+      <w:r>
+        <w:rPr>
+          <w:rFonts w:ascii="Arial" w:hAnsi="Arial" w:cs="Arial"/>
+          <w:sz w:val="21"/>
+          <w:szCs w:val="21"/>
+        </w:rPr>
+        <w:t>CatBoost</w:t>
+      </w:r>
+      <w:proofErr w:type="spellEnd"/>
+      <w:r>
+        <w:rPr>
+          <w:rFonts w:ascii="Arial" w:hAnsi="Arial" w:cs="Arial"/>
+          <w:sz w:val="21"/>
+          <w:szCs w:val="21"/>
+        </w:rPr>
+        <w:t xml:space="preserve"> </w:t>
+      </w:r>
+      <w:r>
+        <w:rPr>
+          <w:rFonts w:ascii="Arial" w:hAnsi="Arial" w:cs="Arial"/>
+          <w:sz w:val="21"/>
+          <w:szCs w:val="21"/>
+        </w:rPr>
+        <w:t>being</w:t>
+      </w:r>
+      <w:r>
+        <w:rPr>
+          <w:rFonts w:ascii="Arial" w:hAnsi="Arial" w:cs="Arial"/>
+          <w:sz w:val="21"/>
+          <w:szCs w:val="21"/>
+        </w:rPr>
+        <w:t xml:space="preserve"> selected as the final model based on superior metrics. </w:t>
+      </w:r>
+    </w:p>
+    <w:p>
+      <w:pPr>
+        <w:rPr>
+          <w:rFonts w:ascii="Arial" w:hAnsi="Arial" w:cs="Arial"/>
+          <w:sz w:val="21"/>
+          <w:szCs w:val="21"/>
+        </w:rPr>
+      </w:pPr>
+      <w:r>
+        <w:rPr>
+          <w:rFonts w:ascii="Arial" w:hAnsi="Arial" w:cs="Arial"/>
+          <w:sz w:val="21"/>
+          <w:szCs w:val="21"/>
+        </w:rPr>
+        <w:t xml:space="preserve">A </w:t>
+      </w:r>
+      <w:proofErr w:type="spellStart"/>
+      <w:r>
+        <w:rPr>
+          <w:rFonts w:ascii="Arial" w:hAnsi="Arial" w:cs="Arial"/>
+          <w:sz w:val="21"/>
+          <w:szCs w:val="21"/>
+        </w:rPr>
+        <w:t>Streamlit</w:t>
+      </w:r>
+      <w:proofErr w:type="spellEnd"/>
+      <w:r>
+        <w:rPr>
+          <w:rFonts w:ascii="Arial" w:hAnsi="Arial" w:cs="Arial"/>
+          <w:sz w:val="21"/>
+          <w:szCs w:val="21"/>
+        </w:rPr>
+        <w:t>-based web application is then constructed (app.py)</w:t>
+      </w:r>
+      <w:r>
+        <w:rPr>
+          <w:rFonts w:ascii="Arial" w:hAnsi="Arial" w:cs="Arial"/>
+          <w:sz w:val="21"/>
+          <w:szCs w:val="21"/>
+        </w:rPr>
+        <w:t xml:space="preserve"> </w:t>
+      </w:r>
+      <w:r>
+        <w:rPr>
+          <w:rFonts w:ascii="Arial" w:hAnsi="Arial" w:cs="Arial"/>
+          <w:sz w:val="21"/>
+          <w:szCs w:val="21"/>
+        </w:rPr>
+        <w:t>for widespread application given the tool were to be rolled out to the public. Selection of canton, living area (</w:t>
+      </w:r>
+      <w:r>
+        <w:rPr>
+          <w:rFonts w:ascii="Arial" w:hAnsi="Arial" w:cs="Arial"/>
+          <w:sz w:val="21"/>
+          <w:szCs w:val="21"/>
+        </w:rPr>
+        <w:t>m²</w:t>
+      </w:r>
+      <w:r>
+        <w:rPr>
+          <w:rFonts w:ascii="Arial" w:hAnsi="Arial" w:cs="Arial"/>
+          <w:sz w:val="21"/>
+          <w:szCs w:val="21"/>
+        </w:rPr>
+        <w:t xml:space="preserve">) and room count are allowed to run against the </w:t>
+      </w:r>
+      <w:proofErr w:type="spellStart"/>
+      <w:r>
+        <w:rPr>
+          <w:rFonts w:ascii="Arial" w:hAnsi="Arial" w:cs="Arial"/>
+          <w:sz w:val="21"/>
+          <w:szCs w:val="21"/>
+        </w:rPr>
+        <w:t>CatBoost</w:t>
+      </w:r>
+      <w:proofErr w:type="spellEnd"/>
+      <w:r>
+        <w:rPr>
+          <w:rFonts w:ascii="Arial" w:hAnsi="Arial" w:cs="Arial"/>
+          <w:sz w:val="21"/>
+          <w:szCs w:val="21"/>
+        </w:rPr>
+        <w:t xml:space="preserve"> model and offer a prediction of rental prices for the user. </w:t>
+      </w:r>
+    </w:p>
+    <w:p>
+      <w:pPr>
+        <w:pStyle w:val="Heading1"/>
         <w:numPr>
           <w:ilvl w:val="1"/>
           <w:numId w:val="4"/>
@@ -3665,7 +4010,7 @@
     </w:p>
     <w:p>
       <w:pPr>
-        <w:pStyle w:val="ListeParagraf"/>
+        <w:pStyle w:val="ListParagraph"/>
         <w:numPr>
           <w:ilvl w:val="0"/>
           <w:numId w:val="6"/>
@@ -3690,7 +4035,7 @@
     </w:p>
     <w:p>
       <w:pPr>
-        <w:pStyle w:val="ListeParagraf"/>
+        <w:pStyle w:val="ListParagraph"/>
         <w:numPr>
           <w:ilvl w:val="1"/>
           <w:numId w:val="2"/>
@@ -3744,7 +4089,7 @@
     </w:p>
     <w:p>
       <w:pPr>
-        <w:pStyle w:val="ListeParagraf"/>
+        <w:pStyle w:val="ListParagraph"/>
         <w:jc w:val="both"/>
         <w:rPr>
           <w:rFonts w:ascii="Arial" w:hAnsi="Arial" w:cs="Arial"/>
@@ -3756,7 +4101,7 @@
     </w:p>
     <w:p>
       <w:pPr>
-        <w:pStyle w:val="ListeParagraf"/>
+        <w:pStyle w:val="ListParagraph"/>
         <w:numPr>
           <w:ilvl w:val="0"/>
           <w:numId w:val="6"/>
@@ -3781,7 +4126,7 @@
     </w:p>
     <w:p>
       <w:pPr>
-        <w:pStyle w:val="ListeParagraf"/>
+        <w:pStyle w:val="ListParagraph"/>
         <w:numPr>
           <w:ilvl w:val="1"/>
           <w:numId w:val="2"/>
@@ -3801,12 +4146,13 @@
           <w:sz w:val="20"/>
           <w:szCs w:val="20"/>
         </w:rPr>
+        <w:lastRenderedPageBreak/>
         <w:t>Housing characteristics do add some explanatory power, with living area standing out as the most informative variable</w:t>
       </w:r>
     </w:p>
     <w:p>
       <w:pPr>
-        <w:pStyle w:val="ListeParagraf"/>
+        <w:pStyle w:val="ListParagraph"/>
         <w:numPr>
           <w:ilvl w:val="1"/>
           <w:numId w:val="2"/>
@@ -3851,7 +4197,7 @@
     </w:p>
     <w:p>
       <w:pPr>
-        <w:pStyle w:val="ListeParagraf"/>
+        <w:pStyle w:val="ListParagraph"/>
         <w:numPr>
           <w:ilvl w:val="1"/>
           <w:numId w:val="2"/>
@@ -3876,7 +4222,7 @@
     </w:p>
     <w:p>
       <w:pPr>
-        <w:pStyle w:val="ListeParagraf"/>
+        <w:pStyle w:val="ListParagraph"/>
         <w:numPr>
           <w:ilvl w:val="0"/>
           <w:numId w:val="6"/>
@@ -3901,7 +4247,7 @@
     </w:p>
     <w:p>
       <w:pPr>
-        <w:pStyle w:val="ListeParagraf"/>
+        <w:pStyle w:val="ListParagraph"/>
         <w:numPr>
           <w:ilvl w:val="1"/>
           <w:numId w:val="2"/>
@@ -3958,13 +4304,12 @@
     </w:p>
     <w:p>
       <w:pPr>
-        <w:pStyle w:val="Balk1"/>
+        <w:pStyle w:val="Heading1"/>
         <w:rPr>
           <w:color w:val="EE0000"/>
         </w:rPr>
       </w:pPr>
       <w:r>
-        <w:lastRenderedPageBreak/>
         <w:t>Conclusions</w:t>
       </w:r>
     </w:p>
@@ -4070,11 +4415,11 @@
   <w:footnote w:id="1">
     <w:p>
       <w:pPr>
-        <w:pStyle w:val="DipnotMetni"/>
-      </w:pPr>
-      <w:r>
-        <w:rPr>
-          <w:rStyle w:val="DipnotBavurusu"/>
+        <w:pStyle w:val="FootnoteText"/>
+      </w:pPr>
+      <w:r>
+        <w:rPr>
+          <w:rStyle w:val="FootnoteReference"/>
         </w:rPr>
         <w:footnoteRef/>
       </w:r>
@@ -4086,11 +4431,11 @@
   <w:footnote w:id="2">
     <w:p>
       <w:pPr>
-        <w:pStyle w:val="DipnotMetni"/>
-      </w:pPr>
-      <w:r>
-        <w:rPr>
-          <w:rStyle w:val="DipnotBavurusu"/>
+        <w:pStyle w:val="FootnoteText"/>
+      </w:pPr>
+      <w:r>
+        <w:rPr>
+          <w:rStyle w:val="FootnoteReference"/>
         </w:rPr>
         <w:footnoteRef/>
       </w:r>
@@ -4102,11 +4447,11 @@
   <w:footnote w:id="3">
     <w:p>
       <w:pPr>
-        <w:pStyle w:val="DipnotMetni"/>
-      </w:pPr>
-      <w:r>
-        <w:rPr>
-          <w:rStyle w:val="DipnotBavurusu"/>
+        <w:pStyle w:val="FootnoteText"/>
+      </w:pPr>
+      <w:r>
+        <w:rPr>
+          <w:rStyle w:val="FootnoteReference"/>
         </w:rPr>
         <w:footnoteRef/>
       </w:r>
@@ -4330,7 +4675,7 @@
     <w:lvl w:ilvl="0">
       <w:start w:val="1"/>
       <w:numFmt w:val="decimal"/>
-      <w:pStyle w:val="Balk1"/>
+      <w:pStyle w:val="Heading1"/>
       <w:lvlText w:val="%1."/>
       <w:lvlJc w:val="left"/>
       <w:pPr>
@@ -5334,11 +5679,11 @@
     <w:name w:val="Normal"/>
     <w:qFormat/>
   </w:style>
-  <w:style w:type="paragraph" w:styleId="Balk1">
+  <w:style w:type="paragraph" w:styleId="Heading1">
     <w:name w:val="heading 1"/>
-    <w:basedOn w:val="ListeParagraf"/>
+    <w:basedOn w:val="ListParagraph"/>
     <w:next w:val="Normal"/>
-    <w:link w:val="Balk1Char"/>
+    <w:link w:val="Heading1Char"/>
     <w:uiPriority w:val="9"/>
     <w:qFormat/>
     <w:rsid w:val="00980492"/>
@@ -5360,11 +5705,11 @@
       <w:szCs w:val="22"/>
     </w:rPr>
   </w:style>
-  <w:style w:type="paragraph" w:styleId="Balk2">
+  <w:style w:type="paragraph" w:styleId="Heading2">
     <w:name w:val="heading 2"/>
     <w:basedOn w:val="Normal"/>
     <w:next w:val="Normal"/>
-    <w:link w:val="Balk2Char"/>
+    <w:link w:val="Heading2Char"/>
     <w:uiPriority w:val="9"/>
     <w:semiHidden/>
     <w:unhideWhenUsed/>
@@ -5383,11 +5728,11 @@
       <w:szCs w:val="32"/>
     </w:rPr>
   </w:style>
-  <w:style w:type="paragraph" w:styleId="Balk3">
+  <w:style w:type="paragraph" w:styleId="Heading3">
     <w:name w:val="heading 3"/>
     <w:basedOn w:val="Normal"/>
     <w:next w:val="Normal"/>
-    <w:link w:val="Balk3Char"/>
+    <w:link w:val="Heading3Char"/>
     <w:uiPriority w:val="9"/>
     <w:semiHidden/>
     <w:unhideWhenUsed/>
@@ -5406,11 +5751,11 @@
       <w:szCs w:val="28"/>
     </w:rPr>
   </w:style>
-  <w:style w:type="paragraph" w:styleId="Balk4">
+  <w:style w:type="paragraph" w:styleId="Heading4">
     <w:name w:val="heading 4"/>
     <w:basedOn w:val="Normal"/>
     <w:next w:val="Normal"/>
-    <w:link w:val="Balk4Char"/>
+    <w:link w:val="Heading4Char"/>
     <w:uiPriority w:val="9"/>
     <w:semiHidden/>
     <w:unhideWhenUsed/>
@@ -5429,11 +5774,11 @@
       <w:color w:val="0F4761" w:themeColor="accent1" w:themeShade="BF"/>
     </w:rPr>
   </w:style>
-  <w:style w:type="paragraph" w:styleId="Balk5">
+  <w:style w:type="paragraph" w:styleId="Heading5">
     <w:name w:val="heading 5"/>
     <w:basedOn w:val="Normal"/>
     <w:next w:val="Normal"/>
-    <w:link w:val="Balk5Char"/>
+    <w:link w:val="Heading5Char"/>
     <w:uiPriority w:val="9"/>
     <w:semiHidden/>
     <w:unhideWhenUsed/>
@@ -5450,11 +5795,11 @@
       <w:color w:val="0F4761" w:themeColor="accent1" w:themeShade="BF"/>
     </w:rPr>
   </w:style>
-  <w:style w:type="paragraph" w:styleId="Balk6">
+  <w:style w:type="paragraph" w:styleId="Heading6">
     <w:name w:val="heading 6"/>
     <w:basedOn w:val="Normal"/>
     <w:next w:val="Normal"/>
-    <w:link w:val="Balk6Char"/>
+    <w:link w:val="Heading6Char"/>
     <w:uiPriority w:val="9"/>
     <w:semiHidden/>
     <w:unhideWhenUsed/>
@@ -5473,11 +5818,11 @@
       <w:color w:val="595959" w:themeColor="text1" w:themeTint="A6"/>
     </w:rPr>
   </w:style>
-  <w:style w:type="paragraph" w:styleId="Balk7">
+  <w:style w:type="paragraph" w:styleId="Heading7">
     <w:name w:val="heading 7"/>
     <w:basedOn w:val="Normal"/>
     <w:next w:val="Normal"/>
-    <w:link w:val="Balk7Char"/>
+    <w:link w:val="Heading7Char"/>
     <w:uiPriority w:val="9"/>
     <w:semiHidden/>
     <w:unhideWhenUsed/>
@@ -5494,11 +5839,11 @@
       <w:color w:val="595959" w:themeColor="text1" w:themeTint="A6"/>
     </w:rPr>
   </w:style>
-  <w:style w:type="paragraph" w:styleId="Balk8">
+  <w:style w:type="paragraph" w:styleId="Heading8">
     <w:name w:val="heading 8"/>
     <w:basedOn w:val="Normal"/>
     <w:next w:val="Normal"/>
-    <w:link w:val="Balk8Char"/>
+    <w:link w:val="Heading8Char"/>
     <w:uiPriority w:val="9"/>
     <w:semiHidden/>
     <w:unhideWhenUsed/>
@@ -5517,11 +5862,11 @@
       <w:color w:val="272727" w:themeColor="text1" w:themeTint="D8"/>
     </w:rPr>
   </w:style>
-  <w:style w:type="paragraph" w:styleId="Balk9">
+  <w:style w:type="paragraph" w:styleId="Heading9">
     <w:name w:val="heading 9"/>
     <w:basedOn w:val="Normal"/>
     <w:next w:val="Normal"/>
-    <w:link w:val="Balk9Char"/>
+    <w:link w:val="Heading9Char"/>
     <w:uiPriority w:val="9"/>
     <w:semiHidden/>
     <w:unhideWhenUsed/>
@@ -5538,13 +5883,13 @@
       <w:color w:val="272727" w:themeColor="text1" w:themeTint="D8"/>
     </w:rPr>
   </w:style>
-  <w:style w:type="character" w:default="1" w:styleId="VarsaylanParagrafYazTipi">
+  <w:style w:type="character" w:default="1" w:styleId="DefaultParagraphFont">
     <w:name w:val="Default Paragraph Font"/>
     <w:uiPriority w:val="1"/>
     <w:semiHidden/>
     <w:unhideWhenUsed/>
   </w:style>
-  <w:style w:type="table" w:default="1" w:styleId="NormalTablo">
+  <w:style w:type="table" w:default="1" w:styleId="TableNormal">
     <w:name w:val="Normal Table"/>
     <w:uiPriority w:val="99"/>
     <w:semiHidden/>
@@ -5559,16 +5904,16 @@
       </w:tblCellMar>
     </w:tblPr>
   </w:style>
-  <w:style w:type="numbering" w:default="1" w:styleId="ListeYok">
+  <w:style w:type="numbering" w:default="1" w:styleId="NoList">
     <w:name w:val="No List"/>
     <w:uiPriority w:val="99"/>
     <w:semiHidden/>
     <w:unhideWhenUsed/>
   </w:style>
-  <w:style w:type="character" w:customStyle="1" w:styleId="Balk1Char">
-    <w:name w:val="Başlık 1 Char"/>
-    <w:basedOn w:val="VarsaylanParagrafYazTipi"/>
-    <w:link w:val="Balk1"/>
+  <w:style w:type="character" w:customStyle="1" w:styleId="Heading1Char">
+    <w:name w:val="Heading 1 Char"/>
+    <w:basedOn w:val="DefaultParagraphFont"/>
+    <w:link w:val="Heading1"/>
     <w:uiPriority w:val="9"/>
     <w:rsid w:val="00980492"/>
     <w:rPr>
@@ -5580,10 +5925,10 @@
       <w:szCs w:val="22"/>
     </w:rPr>
   </w:style>
-  <w:style w:type="character" w:customStyle="1" w:styleId="Balk2Char">
-    <w:name w:val="Başlık 2 Char"/>
-    <w:basedOn w:val="VarsaylanParagrafYazTipi"/>
-    <w:link w:val="Balk2"/>
+  <w:style w:type="character" w:customStyle="1" w:styleId="Heading2Char">
+    <w:name w:val="Heading 2 Char"/>
+    <w:basedOn w:val="DefaultParagraphFont"/>
+    <w:link w:val="Heading2"/>
     <w:uiPriority w:val="9"/>
     <w:semiHidden/>
     <w:rsid w:val="00F83180"/>
@@ -5594,10 +5939,10 @@
       <w:szCs w:val="32"/>
     </w:rPr>
   </w:style>
-  <w:style w:type="character" w:customStyle="1" w:styleId="Balk3Char">
-    <w:name w:val="Başlık 3 Char"/>
-    <w:basedOn w:val="VarsaylanParagrafYazTipi"/>
-    <w:link w:val="Balk3"/>
+  <w:style w:type="character" w:customStyle="1" w:styleId="Heading3Char">
+    <w:name w:val="Heading 3 Char"/>
+    <w:basedOn w:val="DefaultParagraphFont"/>
+    <w:link w:val="Heading3"/>
     <w:uiPriority w:val="9"/>
     <w:semiHidden/>
     <w:rsid w:val="00F83180"/>
@@ -5608,10 +5953,10 @@
       <w:szCs w:val="28"/>
     </w:rPr>
   </w:style>
-  <w:style w:type="character" w:customStyle="1" w:styleId="Balk4Char">
-    <w:name w:val="Başlık 4 Char"/>
-    <w:basedOn w:val="VarsaylanParagrafYazTipi"/>
-    <w:link w:val="Balk4"/>
+  <w:style w:type="character" w:customStyle="1" w:styleId="Heading4Char">
+    <w:name w:val="Heading 4 Char"/>
+    <w:basedOn w:val="DefaultParagraphFont"/>
+    <w:link w:val="Heading4"/>
     <w:uiPriority w:val="9"/>
     <w:semiHidden/>
     <w:rsid w:val="00F83180"/>
@@ -5622,10 +5967,10 @@
       <w:color w:val="0F4761" w:themeColor="accent1" w:themeShade="BF"/>
     </w:rPr>
   </w:style>
-  <w:style w:type="character" w:customStyle="1" w:styleId="Balk5Char">
-    <w:name w:val="Başlık 5 Char"/>
-    <w:basedOn w:val="VarsaylanParagrafYazTipi"/>
-    <w:link w:val="Balk5"/>
+  <w:style w:type="character" w:customStyle="1" w:styleId="Heading5Char">
+    <w:name w:val="Heading 5 Char"/>
+    <w:basedOn w:val="DefaultParagraphFont"/>
+    <w:link w:val="Heading5"/>
     <w:uiPriority w:val="9"/>
     <w:semiHidden/>
     <w:rsid w:val="00F83180"/>
@@ -5634,10 +5979,10 @@
       <w:color w:val="0F4761" w:themeColor="accent1" w:themeShade="BF"/>
     </w:rPr>
   </w:style>
-  <w:style w:type="character" w:customStyle="1" w:styleId="Balk6Char">
-    <w:name w:val="Başlık 6 Char"/>
-    <w:basedOn w:val="VarsaylanParagrafYazTipi"/>
-    <w:link w:val="Balk6"/>
+  <w:style w:type="character" w:customStyle="1" w:styleId="Heading6Char">
+    <w:name w:val="Heading 6 Char"/>
+    <w:basedOn w:val="DefaultParagraphFont"/>
+    <w:link w:val="Heading6"/>
     <w:uiPriority w:val="9"/>
     <w:semiHidden/>
     <w:rsid w:val="00F83180"/>
@@ -5648,10 +5993,10 @@
       <w:color w:val="595959" w:themeColor="text1" w:themeTint="A6"/>
     </w:rPr>
   </w:style>
-  <w:style w:type="character" w:customStyle="1" w:styleId="Balk7Char">
-    <w:name w:val="Başlık 7 Char"/>
-    <w:basedOn w:val="VarsaylanParagrafYazTipi"/>
-    <w:link w:val="Balk7"/>
+  <w:style w:type="character" w:customStyle="1" w:styleId="Heading7Char">
+    <w:name w:val="Heading 7 Char"/>
+    <w:basedOn w:val="DefaultParagraphFont"/>
+    <w:link w:val="Heading7"/>
     <w:uiPriority w:val="9"/>
     <w:semiHidden/>
     <w:rsid w:val="00F83180"/>
@@ -5660,10 +6005,10 @@
       <w:color w:val="595959" w:themeColor="text1" w:themeTint="A6"/>
     </w:rPr>
   </w:style>
-  <w:style w:type="character" w:customStyle="1" w:styleId="Balk8Char">
-    <w:name w:val="Başlık 8 Char"/>
-    <w:basedOn w:val="VarsaylanParagrafYazTipi"/>
-    <w:link w:val="Balk8"/>
+  <w:style w:type="character" w:customStyle="1" w:styleId="Heading8Char">
+    <w:name w:val="Heading 8 Char"/>
+    <w:basedOn w:val="DefaultParagraphFont"/>
+    <w:link w:val="Heading8"/>
     <w:uiPriority w:val="9"/>
     <w:semiHidden/>
     <w:rsid w:val="00F83180"/>
@@ -5674,10 +6019,10 @@
       <w:color w:val="272727" w:themeColor="text1" w:themeTint="D8"/>
     </w:rPr>
   </w:style>
-  <w:style w:type="character" w:customStyle="1" w:styleId="Balk9Char">
-    <w:name w:val="Başlık 9 Char"/>
-    <w:basedOn w:val="VarsaylanParagrafYazTipi"/>
-    <w:link w:val="Balk9"/>
+  <w:style w:type="character" w:customStyle="1" w:styleId="Heading9Char">
+    <w:name w:val="Heading 9 Char"/>
+    <w:basedOn w:val="DefaultParagraphFont"/>
+    <w:link w:val="Heading9"/>
     <w:uiPriority w:val="9"/>
     <w:semiHidden/>
     <w:rsid w:val="00F83180"/>
@@ -5686,11 +6031,11 @@
       <w:color w:val="272727" w:themeColor="text1" w:themeTint="D8"/>
     </w:rPr>
   </w:style>
-  <w:style w:type="paragraph" w:styleId="KonuBal">
+  <w:style w:type="paragraph" w:styleId="Title">
     <w:name w:val="Title"/>
     <w:basedOn w:val="Normal"/>
     <w:next w:val="Normal"/>
-    <w:link w:val="KonuBalChar"/>
+    <w:link w:val="TitleChar"/>
     <w:uiPriority w:val="10"/>
     <w:qFormat/>
     <w:rsid w:val="00F83180"/>
@@ -5706,10 +6051,10 @@
       <w:szCs w:val="56"/>
     </w:rPr>
   </w:style>
-  <w:style w:type="character" w:customStyle="1" w:styleId="KonuBalChar">
-    <w:name w:val="Konu Başlığı Char"/>
-    <w:basedOn w:val="VarsaylanParagrafYazTipi"/>
-    <w:link w:val="KonuBal"/>
+  <w:style w:type="character" w:customStyle="1" w:styleId="TitleChar">
+    <w:name w:val="Title Char"/>
+    <w:basedOn w:val="DefaultParagraphFont"/>
+    <w:link w:val="Title"/>
     <w:uiPriority w:val="10"/>
     <w:rsid w:val="00F83180"/>
     <w:rPr>
@@ -5720,11 +6065,11 @@
       <w:szCs w:val="56"/>
     </w:rPr>
   </w:style>
-  <w:style w:type="paragraph" w:styleId="Altyaz">
+  <w:style w:type="paragraph" w:styleId="Subtitle">
     <w:name w:val="Subtitle"/>
     <w:basedOn w:val="Normal"/>
     <w:next w:val="Normal"/>
-    <w:link w:val="AltyazChar"/>
+    <w:link w:val="SubtitleChar"/>
     <w:uiPriority w:val="11"/>
     <w:qFormat/>
     <w:rsid w:val="00F83180"/>
@@ -5741,10 +6086,10 @@
       <w:szCs w:val="28"/>
     </w:rPr>
   </w:style>
-  <w:style w:type="character" w:customStyle="1" w:styleId="AltyazChar">
-    <w:name w:val="Altyazı Char"/>
-    <w:basedOn w:val="VarsaylanParagrafYazTipi"/>
-    <w:link w:val="Altyaz"/>
+  <w:style w:type="character" w:customStyle="1" w:styleId="SubtitleChar">
+    <w:name w:val="Subtitle Char"/>
+    <w:basedOn w:val="DefaultParagraphFont"/>
+    <w:link w:val="Subtitle"/>
     <w:uiPriority w:val="11"/>
     <w:rsid w:val="00F83180"/>
     <w:rPr>
@@ -5755,11 +6100,11 @@
       <w:szCs w:val="28"/>
     </w:rPr>
   </w:style>
-  <w:style w:type="paragraph" w:styleId="Alnt">
+  <w:style w:type="paragraph" w:styleId="Quote">
     <w:name w:val="Quote"/>
     <w:basedOn w:val="Normal"/>
     <w:next w:val="Normal"/>
-    <w:link w:val="AlntChar"/>
+    <w:link w:val="QuoteChar"/>
     <w:uiPriority w:val="29"/>
     <w:qFormat/>
     <w:rsid w:val="00F83180"/>
@@ -5773,10 +6118,10 @@
       <w:color w:val="404040" w:themeColor="text1" w:themeTint="BF"/>
     </w:rPr>
   </w:style>
-  <w:style w:type="character" w:customStyle="1" w:styleId="AlntChar">
-    <w:name w:val="Alıntı Char"/>
-    <w:basedOn w:val="VarsaylanParagrafYazTipi"/>
-    <w:link w:val="Alnt"/>
+  <w:style w:type="character" w:customStyle="1" w:styleId="QuoteChar">
+    <w:name w:val="Quote Char"/>
+    <w:basedOn w:val="DefaultParagraphFont"/>
+    <w:link w:val="Quote"/>
     <w:uiPriority w:val="29"/>
     <w:rsid w:val="00F83180"/>
     <w:rPr>
@@ -5785,7 +6130,7 @@
       <w:color w:val="404040" w:themeColor="text1" w:themeTint="BF"/>
     </w:rPr>
   </w:style>
-  <w:style w:type="paragraph" w:styleId="ListeParagraf">
+  <w:style w:type="paragraph" w:styleId="ListParagraph">
     <w:name w:val="List Paragraph"/>
     <w:basedOn w:val="Normal"/>
     <w:uiPriority w:val="34"/>
@@ -5796,9 +6141,9 @@
       <w:contextualSpacing/>
     </w:pPr>
   </w:style>
-  <w:style w:type="character" w:styleId="GlVurgulama">
+  <w:style w:type="character" w:styleId="IntenseEmphasis">
     <w:name w:val="Intense Emphasis"/>
-    <w:basedOn w:val="VarsaylanParagrafYazTipi"/>
+    <w:basedOn w:val="DefaultParagraphFont"/>
     <w:uiPriority w:val="21"/>
     <w:qFormat/>
     <w:rsid w:val="00F83180"/>
@@ -5808,11 +6153,11 @@
       <w:color w:val="0F4761" w:themeColor="accent1" w:themeShade="BF"/>
     </w:rPr>
   </w:style>
-  <w:style w:type="paragraph" w:styleId="GlAlnt">
+  <w:style w:type="paragraph" w:styleId="IntenseQuote">
     <w:name w:val="Intense Quote"/>
     <w:basedOn w:val="Normal"/>
     <w:next w:val="Normal"/>
-    <w:link w:val="GlAlntChar"/>
+    <w:link w:val="IntenseQuoteChar"/>
     <w:uiPriority w:val="30"/>
     <w:qFormat/>
     <w:rsid w:val="00F83180"/>
@@ -5831,10 +6176,10 @@
       <w:color w:val="0F4761" w:themeColor="accent1" w:themeShade="BF"/>
     </w:rPr>
   </w:style>
-  <w:style w:type="character" w:customStyle="1" w:styleId="GlAlntChar">
-    <w:name w:val="Güçlü Alıntı Char"/>
-    <w:basedOn w:val="VarsaylanParagrafYazTipi"/>
-    <w:link w:val="GlAlnt"/>
+  <w:style w:type="character" w:customStyle="1" w:styleId="IntenseQuoteChar">
+    <w:name w:val="Intense Quote Char"/>
+    <w:basedOn w:val="DefaultParagraphFont"/>
+    <w:link w:val="IntenseQuote"/>
     <w:uiPriority w:val="30"/>
     <w:rsid w:val="00F83180"/>
     <w:rPr>
@@ -5843,9 +6188,9 @@
       <w:color w:val="0F4761" w:themeColor="accent1" w:themeShade="BF"/>
     </w:rPr>
   </w:style>
-  <w:style w:type="character" w:styleId="GlBavuru">
+  <w:style w:type="character" w:styleId="IntenseReference">
     <w:name w:val="Intense Reference"/>
-    <w:basedOn w:val="VarsaylanParagrafYazTipi"/>
+    <w:basedOn w:val="DefaultParagraphFont"/>
     <w:uiPriority w:val="32"/>
     <w:qFormat/>
     <w:rsid w:val="00F83180"/>
@@ -5859,12 +6204,12 @@
   </w:style>
   <w:style w:type="character" w:customStyle="1" w:styleId="normaltextrun">
     <w:name w:val="normaltextrun"/>
-    <w:basedOn w:val="VarsaylanParagrafYazTipi"/>
+    <w:basedOn w:val="DefaultParagraphFont"/>
     <w:rsid w:val="009E7348"/>
   </w:style>
   <w:style w:type="character" w:customStyle="1" w:styleId="eop">
     <w:name w:val="eop"/>
-    <w:basedOn w:val="VarsaylanParagrafYazTipi"/>
+    <w:basedOn w:val="DefaultParagraphFont"/>
     <w:rsid w:val="009E7348"/>
   </w:style>
   <w:style w:type="paragraph" w:customStyle="1" w:styleId="paragraph">
@@ -5882,7 +6227,7 @@
   </w:style>
   <w:style w:type="character" w:customStyle="1" w:styleId="scxw47173885">
     <w:name w:val="scxw47173885"/>
-    <w:basedOn w:val="VarsaylanParagrafYazTipi"/>
+    <w:basedOn w:val="DefaultParagraphFont"/>
     <w:rsid w:val="00074AA3"/>
   </w:style>
   <w:style w:type="paragraph" w:customStyle="1" w:styleId="p1">
@@ -5904,13 +6249,13 @@
   </w:style>
   <w:style w:type="character" w:customStyle="1" w:styleId="apple-converted-space">
     <w:name w:val="apple-converted-space"/>
-    <w:basedOn w:val="VarsaylanParagrafYazTipi"/>
+    <w:basedOn w:val="DefaultParagraphFont"/>
     <w:rsid w:val="000B2823"/>
   </w:style>
-  <w:style w:type="paragraph" w:styleId="DipnotMetni">
+  <w:style w:type="paragraph" w:styleId="FootnoteText">
     <w:name w:val="footnote text"/>
     <w:basedOn w:val="Normal"/>
-    <w:link w:val="DipnotMetniChar"/>
+    <w:link w:val="FootnoteTextChar"/>
     <w:uiPriority w:val="99"/>
     <w:semiHidden/>
     <w:unhideWhenUsed/>
@@ -5923,10 +6268,10 @@
       <w:szCs w:val="20"/>
     </w:rPr>
   </w:style>
-  <w:style w:type="character" w:customStyle="1" w:styleId="DipnotMetniChar">
-    <w:name w:val="Dipnot Metni Char"/>
-    <w:basedOn w:val="VarsaylanParagrafYazTipi"/>
-    <w:link w:val="DipnotMetni"/>
+  <w:style w:type="character" w:customStyle="1" w:styleId="FootnoteTextChar">
+    <w:name w:val="Footnote Text Char"/>
+    <w:basedOn w:val="DefaultParagraphFont"/>
+    <w:link w:val="FootnoteText"/>
     <w:uiPriority w:val="99"/>
     <w:semiHidden/>
     <w:rsid w:val="00A14097"/>
@@ -5935,9 +6280,9 @@
       <w:szCs w:val="20"/>
     </w:rPr>
   </w:style>
-  <w:style w:type="character" w:styleId="DipnotBavurusu">
+  <w:style w:type="character" w:styleId="FootnoteReference">
     <w:name w:val="footnote reference"/>
-    <w:basedOn w:val="VarsaylanParagrafYazTipi"/>
+    <w:basedOn w:val="DefaultParagraphFont"/>
     <w:uiPriority w:val="99"/>
     <w:semiHidden/>
     <w:unhideWhenUsed/>
@@ -5958,13 +6303,13 @@
     <w:rPr>
       <w:rFonts w:ascii="Times New Roman" w:eastAsia="Times New Roman" w:hAnsi="Times New Roman" w:cs="Times New Roman"/>
       <w:kern w:val="0"/>
-      <w:lang w:val="tr-CH" w:eastAsia="tr-TR"/>
+      <w:lang w:eastAsia="tr-TR"/>
       <w14:ligatures w14:val="none"/>
     </w:rPr>
   </w:style>
-  <w:style w:type="character" w:styleId="Vurgu">
+  <w:style w:type="character" w:styleId="Emphasis">
     <w:name w:val="Emphasis"/>
-    <w:basedOn w:val="VarsaylanParagrafYazTipi"/>
+    <w:basedOn w:val="DefaultParagraphFont"/>
     <w:uiPriority w:val="20"/>
     <w:qFormat/>
     <w:rsid w:val="00A26B23"/>
@@ -5973,9 +6318,9 @@
       <w:iCs/>
     </w:rPr>
   </w:style>
-  <w:style w:type="character" w:styleId="HTMLKodu">
+  <w:style w:type="character" w:styleId="HTMLCode">
     <w:name w:val="HTML Code"/>
-    <w:basedOn w:val="VarsaylanParagrafYazTipi"/>
+    <w:basedOn w:val="DefaultParagraphFont"/>
     <w:uiPriority w:val="99"/>
     <w:semiHidden/>
     <w:unhideWhenUsed/>
@@ -5986,9 +6331,9 @@
       <w:szCs w:val="20"/>
     </w:rPr>
   </w:style>
-  <w:style w:type="character" w:styleId="Gl">
+  <w:style w:type="character" w:styleId="Strong">
     <w:name w:val="Strong"/>
-    <w:basedOn w:val="VarsaylanParagrafYazTipi"/>
+    <w:basedOn w:val="DefaultParagraphFont"/>
     <w:uiPriority w:val="22"/>
     <w:qFormat/>
     <w:rsid w:val="0052453B"/>

</xml_diff>

<commit_message>
removing population by canton since we are not using. Updating references in documentation.
</commit_message>
<xml_diff>
--- a/documentation/CIP_FS2026_104_Project_Documentation.docx
+++ b/documentation/CIP_FS2026_104_Project_Documentation.docx
@@ -3641,31 +3641,7 @@
           <w:sz w:val="21"/>
           <w:szCs w:val="21"/>
         </w:rPr>
-        <w:t xml:space="preserve"> (model.py)</w:t>
-      </w:r>
-      <w:r>
-        <w:rPr>
-          <w:rFonts w:ascii="Arial" w:hAnsi="Arial" w:cs="Arial"/>
-          <w:sz w:val="21"/>
-          <w:szCs w:val="21"/>
-        </w:rPr>
-        <w:t xml:space="preserve">. Several features </w:t>
-      </w:r>
-      <w:r>
-        <w:rPr>
-          <w:rFonts w:ascii="Arial" w:hAnsi="Arial" w:cs="Arial"/>
-          <w:sz w:val="21"/>
-          <w:szCs w:val="21"/>
-        </w:rPr>
-        <w:t>were</w:t>
-      </w:r>
-      <w:r>
-        <w:rPr>
-          <w:rFonts w:ascii="Arial" w:hAnsi="Arial" w:cs="Arial"/>
-          <w:sz w:val="21"/>
-          <w:szCs w:val="21"/>
-        </w:rPr>
-        <w:t xml:space="preserve"> engineered, including a derived price-per-m² metric, city extraction from location text, and a binary flag indicating whether a listing is in its canton's capital. A</w:t>
+        <w:t xml:space="preserve"> (model.py). Several features were engineered, including a derived price-per-m² metric, city extraction from location text, and a binary flag indicating whether a listing is in its canton's capital. A</w:t>
       </w:r>
       <w:r>
         <w:rPr>
@@ -4424,7 +4400,16 @@
         <w:footnoteRef/>
       </w:r>
       <w:r>
-        <w:t xml:space="preserve"> Source: data_processing.py ln170</w:t>
+        <w:t xml:space="preserve"> </w:t>
+      </w:r>
+      <w:r>
+        <w:t xml:space="preserve">Figure 1 </w:t>
+      </w:r>
+      <w:r>
+        <w:t>Source: data_processing.py ln</w:t>
+      </w:r>
+      <w:r>
+        <w:t>290</w:t>
       </w:r>
     </w:p>
   </w:footnote>
@@ -4440,7 +4425,13 @@
         <w:footnoteRef/>
       </w:r>
       <w:r>
-        <w:t xml:space="preserve"> Source: data_processing.py ln170</w:t>
+        <w:t xml:space="preserve"> </w:t>
+      </w:r>
+      <w:r>
+        <w:t xml:space="preserve">Figure 2 </w:t>
+      </w:r>
+      <w:r>
+        <w:t>Source: data_processing.py ln170</w:t>
       </w:r>
     </w:p>
   </w:footnote>
@@ -4456,7 +4447,16 @@
         <w:footnoteRef/>
       </w:r>
       <w:r>
-        <w:t xml:space="preserve"> Source: data_processing.py ln170</w:t>
+        <w:t xml:space="preserve"> </w:t>
+      </w:r>
+      <w:r>
+        <w:t xml:space="preserve">Figure 3 </w:t>
+      </w:r>
+      <w:r>
+        <w:t>Source: data_processing.py ln</w:t>
+      </w:r>
+      <w:r>
+        <w:t>638</w:t>
       </w:r>
     </w:p>
   </w:footnote>

</xml_diff>

<commit_message>
Final edits for documentation
</commit_message>
<xml_diff>
--- a/documentation/CIP_FS2026_104_Project_Documentation.docx
+++ b/documentation/CIP_FS2026_104_Project_Documentation.docx
@@ -674,7 +674,7 @@
         <w:jc w:val="both"/>
         <w:rPr>
           <w:rFonts w:ascii="Arial" w:hAnsi="Arial" w:cs="Arial"/>
-          <w:color w:val="EE0000"/>
+          <w:color w:val="000000" w:themeColor="text1"/>
           <w:sz w:val="20"/>
           <w:szCs w:val="20"/>
         </w:rPr>
@@ -768,23 +768,33 @@
           <w:sz w:val="20"/>
           <w:szCs w:val="20"/>
         </w:rPr>
-        <w:t xml:space="preserve"> extract the relevant housing variables (price, living area, number of rooms, and location) for each listing and ensure consistency across all records.</w:t>
-      </w:r>
-      <w:r>
-        <w:rPr>
-          <w:rStyle w:val="normaltextrun"/>
-          <w:rFonts w:ascii="Arial" w:hAnsi="Arial" w:cs="Arial"/>
-          <w:color w:val="000000"/>
-          <w:sz w:val="20"/>
-          <w:szCs w:val="20"/>
-        </w:rPr>
-        <w:t xml:space="preserve"> </w:t>
-      </w:r>
-      <w:r>
-        <w:rPr>
-          <w:rStyle w:val="normaltextrun"/>
-          <w:rFonts w:ascii="Arial" w:hAnsi="Arial" w:cs="Arial"/>
-          <w:color w:val="000000"/>
+        <w:t xml:space="preserve"> extract the relevant housing variables (price, living area, number of rooms, and location) for each </w:t>
+      </w:r>
+      <w:r>
+        <w:rPr>
+          <w:rStyle w:val="normaltextrun"/>
+          <w:rFonts w:ascii="Arial" w:hAnsi="Arial" w:cs="Arial"/>
+          <w:color w:val="000000" w:themeColor="text1"/>
+          <w:sz w:val="20"/>
+          <w:szCs w:val="20"/>
+        </w:rPr>
+        <w:t>listing and ensure consistency across all records.</w:t>
+      </w:r>
+      <w:r>
+        <w:rPr>
+          <w:rStyle w:val="normaltextrun"/>
+          <w:rFonts w:ascii="Arial" w:hAnsi="Arial" w:cs="Arial"/>
+          <w:color w:val="000000" w:themeColor="text1"/>
+          <w:sz w:val="20"/>
+          <w:szCs w:val="20"/>
+        </w:rPr>
+        <w:t xml:space="preserve"> </w:t>
+      </w:r>
+      <w:r>
+        <w:rPr>
+          <w:rStyle w:val="normaltextrun"/>
+          <w:rFonts w:ascii="Arial" w:hAnsi="Arial" w:cs="Arial"/>
+          <w:color w:val="000000" w:themeColor="text1"/>
           <w:sz w:val="20"/>
           <w:szCs w:val="20"/>
         </w:rPr>
@@ -796,7 +806,7 @@
           <w:rFonts w:ascii="Courier New" w:hAnsi="Courier New" w:cs="Courier New"/>
           <w:i/>
           <w:iCs/>
-          <w:color w:val="000000"/>
+          <w:color w:val="000000" w:themeColor="text1"/>
           <w:sz w:val="18"/>
           <w:szCs w:val="18"/>
         </w:rPr>
@@ -806,27 +816,17 @@
         <w:rPr>
           <w:rStyle w:val="normaltextrun"/>
           <w:rFonts w:ascii="Arial" w:hAnsi="Arial" w:cs="Arial"/>
-          <w:color w:val="000000"/>
-          <w:sz w:val="20"/>
-          <w:szCs w:val="20"/>
-        </w:rPr>
-        <w:t xml:space="preserve"> package to apply regular expressions for extraction and cleaning</w:t>
-      </w:r>
-      <w:r>
-        <w:rPr>
-          <w:rStyle w:val="normaltextrun"/>
-          <w:rFonts w:ascii="Arial" w:hAnsi="Arial" w:cs="Arial"/>
-          <w:color w:val="EE0000"/>
-          <w:sz w:val="20"/>
-          <w:szCs w:val="20"/>
-        </w:rPr>
-        <w:t xml:space="preserve">. </w:t>
-      </w:r>
-      <w:r>
-        <w:rPr>
-          <w:rStyle w:val="normaltextrun"/>
-          <w:rFonts w:ascii="Arial" w:hAnsi="Arial" w:cs="Arial"/>
-          <w:color w:val="EE0000"/>
+          <w:color w:val="000000" w:themeColor="text1"/>
+          <w:sz w:val="20"/>
+          <w:szCs w:val="20"/>
+        </w:rPr>
+        <w:t xml:space="preserve"> package to apply regular expressions for extraction and cleaning. </w:t>
+      </w:r>
+      <w:r>
+        <w:rPr>
+          <w:rStyle w:val="normaltextrun"/>
+          <w:rFonts w:ascii="Arial" w:hAnsi="Arial" w:cs="Arial"/>
+          <w:color w:val="000000" w:themeColor="text1"/>
           <w:sz w:val="20"/>
           <w:szCs w:val="20"/>
         </w:rPr>
@@ -835,35 +835,17 @@
       <w:r>
         <w:rPr>
           <w:rFonts w:ascii="Arial" w:hAnsi="Arial" w:cs="Arial"/>
-          <w:color w:val="EE0000"/>
-          <w:sz w:val="20"/>
-          <w:szCs w:val="20"/>
-        </w:rPr>
-        <w:t>he initial parsing attempts revealed substantial missing values, indicating inconsistencies in how housing attributes were embedded within the listing text. To address this, the extraction logic was refined by adjusting regular expression patterns based on inspection of the raw HTML structure.</w:t>
-      </w:r>
-      <w:r>
-        <w:rPr>
-          <w:rFonts w:ascii="Arial" w:hAnsi="Arial" w:cs="Arial"/>
-          <w:color w:val="EE0000"/>
-          <w:sz w:val="20"/>
-          <w:szCs w:val="20"/>
-        </w:rPr>
-        <w:t xml:space="preserve"> </w:t>
-      </w:r>
-      <w:r>
-        <w:rPr>
-          <w:rFonts w:ascii="Arial" w:hAnsi="Arial" w:cs="Arial"/>
-          <w:color w:val="EE0000"/>
-          <w:sz w:val="20"/>
-          <w:szCs w:val="20"/>
-        </w:rPr>
-        <w:t>These refinements led to a significant increase in data completeness. The number of missing values for</w:t>
+          <w:color w:val="000000" w:themeColor="text1"/>
+          <w:sz w:val="20"/>
+          <w:szCs w:val="20"/>
+        </w:rPr>
+        <w:t>he initial parsing attempts revealed substantial missing values, indicating inconsistencies in how housing attributes were embedded within the listing text. To address this, the extraction logic was refined by adjusting regular expression patterns based on inspection of the raw HTML structure. These refinements led to a significant increase in data completeness. The number of missing values for</w:t>
       </w:r>
       <w:r>
         <w:rPr>
           <w:rStyle w:val="apple-converted-space"/>
           <w:rFonts w:ascii="Arial" w:eastAsiaTheme="majorEastAsia" w:hAnsi="Arial" w:cs="Arial"/>
-          <w:color w:val="EE0000"/>
+          <w:color w:val="000000" w:themeColor="text1"/>
           <w:sz w:val="20"/>
           <w:szCs w:val="20"/>
         </w:rPr>
@@ -873,54 +855,65 @@
         <w:rPr>
           <w:rStyle w:val="Emphasis"/>
           <w:rFonts w:ascii="Arial" w:eastAsiaTheme="majorEastAsia" w:hAnsi="Arial" w:cs="Arial"/>
-          <w:color w:val="EE0000"/>
-          <w:sz w:val="20"/>
-          <w:szCs w:val="20"/>
-        </w:rPr>
-        <w:t>living area</w:t>
+          <w:color w:val="000000" w:themeColor="text1"/>
+          <w:sz w:val="20"/>
+          <w:szCs w:val="20"/>
+        </w:rPr>
+        <w:t xml:space="preserve">living area </w:t>
+      </w:r>
+      <w:r>
+        <w:rPr>
+          <w:rFonts w:ascii="Arial" w:hAnsi="Arial" w:cs="Arial"/>
+          <w:color w:val="000000" w:themeColor="text1"/>
+          <w:sz w:val="20"/>
+          <w:szCs w:val="20"/>
+        </w:rPr>
+        <w:t>decreased from 4,689 to 653, reducing the missing rate from 100% to 13.8% (an improvement of approximately 86%). Similarly, the</w:t>
+      </w:r>
+      <w:r>
+        <w:rPr>
+          <w:rStyle w:val="apple-converted-space"/>
+          <w:rFonts w:ascii="Arial" w:eastAsiaTheme="majorEastAsia" w:hAnsi="Arial" w:cs="Arial"/>
+          <w:color w:val="000000" w:themeColor="text1"/>
+          <w:sz w:val="20"/>
+          <w:szCs w:val="20"/>
+        </w:rPr>
+        <w:t> </w:t>
       </w:r>
       <w:r>
         <w:rPr>
           <w:rStyle w:val="Emphasis"/>
           <w:rFonts w:ascii="Arial" w:eastAsiaTheme="majorEastAsia" w:hAnsi="Arial" w:cs="Arial"/>
-          <w:color w:val="EE0000"/>
-          <w:sz w:val="20"/>
-          <w:szCs w:val="20"/>
-        </w:rPr>
-        <w:t xml:space="preserve"> </w:t>
-      </w:r>
-      <w:r>
-        <w:rPr>
-          <w:rFonts w:ascii="Arial" w:hAnsi="Arial" w:cs="Arial"/>
-          <w:color w:val="EE0000"/>
-          <w:sz w:val="20"/>
-          <w:szCs w:val="20"/>
-        </w:rPr>
-        <w:t>decreased from 4,689 to 653, reducing the missing rate from 100% to 13.8% (an improvement of approximately 86%).</w:t>
-      </w:r>
-      <w:r>
-        <w:rPr>
-          <w:rFonts w:ascii="Arial" w:hAnsi="Arial" w:cs="Arial"/>
-          <w:color w:val="EE0000"/>
-          <w:sz w:val="20"/>
-          <w:szCs w:val="20"/>
-        </w:rPr>
-        <w:t xml:space="preserve"> </w:t>
-      </w:r>
-      <w:r>
-        <w:rPr>
-          <w:rFonts w:ascii="Arial" w:hAnsi="Arial" w:cs="Arial"/>
-          <w:color w:val="EE0000"/>
-          <w:sz w:val="20"/>
-          <w:szCs w:val="20"/>
-        </w:rPr>
-        <w:t>Similarly, the</w:t>
+          <w:color w:val="000000" w:themeColor="text1"/>
+          <w:sz w:val="20"/>
+          <w:szCs w:val="20"/>
+        </w:rPr>
+        <w:t>number of rooms</w:t>
       </w:r>
       <w:r>
         <w:rPr>
           <w:rStyle w:val="apple-converted-space"/>
           <w:rFonts w:ascii="Arial" w:eastAsiaTheme="majorEastAsia" w:hAnsi="Arial" w:cs="Arial"/>
-          <w:color w:val="EE0000"/>
+          <w:color w:val="000000" w:themeColor="text1"/>
+          <w:sz w:val="20"/>
+          <w:szCs w:val="20"/>
+        </w:rPr>
+        <w:t> </w:t>
+      </w:r>
+      <w:r>
+        <w:rPr>
+          <w:rFonts w:ascii="Arial" w:hAnsi="Arial" w:cs="Arial"/>
+          <w:color w:val="000000" w:themeColor="text1"/>
+          <w:sz w:val="20"/>
+          <w:szCs w:val="20"/>
+        </w:rPr>
+        <w:t>variable improved from being mostly missing in the initial dataset to only 63 missing values in the final dataset (over 98% coverage). The</w:t>
+      </w:r>
+      <w:r>
+        <w:rPr>
+          <w:rStyle w:val="apple-converted-space"/>
+          <w:rFonts w:ascii="Arial" w:eastAsiaTheme="majorEastAsia" w:hAnsi="Arial" w:cs="Arial"/>
+          <w:color w:val="000000" w:themeColor="text1"/>
           <w:sz w:val="20"/>
           <w:szCs w:val="20"/>
         </w:rPr>
@@ -930,17 +923,17 @@
         <w:rPr>
           <w:rStyle w:val="Emphasis"/>
           <w:rFonts w:ascii="Arial" w:eastAsiaTheme="majorEastAsia" w:hAnsi="Arial" w:cs="Arial"/>
-          <w:color w:val="EE0000"/>
-          <w:sz w:val="20"/>
-          <w:szCs w:val="20"/>
-        </w:rPr>
-        <w:t>number of rooms</w:t>
+          <w:color w:val="000000" w:themeColor="text1"/>
+          <w:sz w:val="20"/>
+          <w:szCs w:val="20"/>
+        </w:rPr>
+        <w:t>location text</w:t>
       </w:r>
       <w:r>
         <w:rPr>
           <w:rStyle w:val="apple-converted-space"/>
           <w:rFonts w:ascii="Arial" w:eastAsiaTheme="majorEastAsia" w:hAnsi="Arial" w:cs="Arial"/>
-          <w:color w:val="EE0000"/>
+          <w:color w:val="000000" w:themeColor="text1"/>
           <w:sz w:val="20"/>
           <w:szCs w:val="20"/>
         </w:rPr>
@@ -949,55 +942,7 @@
       <w:r>
         <w:rPr>
           <w:rFonts w:ascii="Arial" w:hAnsi="Arial" w:cs="Arial"/>
-          <w:color w:val="EE0000"/>
-          <w:sz w:val="20"/>
-          <w:szCs w:val="20"/>
-        </w:rPr>
-        <w:t xml:space="preserve">variable improved from being mostly missing in the initial dataset to only 63 </w:t>
-      </w:r>
-      <w:r>
-        <w:rPr>
-          <w:rFonts w:ascii="Arial" w:hAnsi="Arial" w:cs="Arial"/>
-          <w:color w:val="EE0000"/>
-          <w:sz w:val="20"/>
-          <w:szCs w:val="20"/>
-        </w:rPr>
-        <w:t>missing values in the final dataset (over 98% coverage). The</w:t>
-      </w:r>
-      <w:r>
-        <w:rPr>
-          <w:rStyle w:val="apple-converted-space"/>
-          <w:rFonts w:ascii="Arial" w:eastAsiaTheme="majorEastAsia" w:hAnsi="Arial" w:cs="Arial"/>
-          <w:color w:val="EE0000"/>
-          <w:sz w:val="20"/>
-          <w:szCs w:val="20"/>
-        </w:rPr>
-        <w:t> </w:t>
-      </w:r>
-      <w:r>
-        <w:rPr>
-          <w:rStyle w:val="Emphasis"/>
-          <w:rFonts w:ascii="Arial" w:eastAsiaTheme="majorEastAsia" w:hAnsi="Arial" w:cs="Arial"/>
-          <w:color w:val="EE0000"/>
-          <w:sz w:val="20"/>
-          <w:szCs w:val="20"/>
-        </w:rPr>
-        <w:t>location text</w:t>
-      </w:r>
-      <w:r>
-        <w:rPr>
-          <w:rStyle w:val="apple-converted-space"/>
-          <w:rFonts w:ascii="Arial" w:eastAsiaTheme="majorEastAsia" w:hAnsi="Arial" w:cs="Arial"/>
-          <w:color w:val="EE0000"/>
-          <w:sz w:val="20"/>
-          <w:szCs w:val="20"/>
-        </w:rPr>
-        <w:t> </w:t>
-      </w:r>
-      <w:r>
-        <w:rPr>
-          <w:rFonts w:ascii="Arial" w:hAnsi="Arial" w:cs="Arial"/>
-          <w:color w:val="EE0000"/>
+          <w:color w:val="000000" w:themeColor="text1"/>
           <w:sz w:val="20"/>
           <w:szCs w:val="20"/>
         </w:rPr>
@@ -1012,34 +957,25 @@
         <w:rPr>
           <w:rStyle w:val="normaltextrun"/>
           <w:rFonts w:ascii="Arial" w:hAnsi="Arial" w:cs="Arial"/>
-          <w:color w:val="000000"/>
-          <w:sz w:val="20"/>
-          <w:szCs w:val="20"/>
-        </w:rPr>
-      </w:pPr>
-      <w:r>
-        <w:rPr>
-          <w:rFonts w:ascii="Arial" w:hAnsi="Arial" w:cs="Arial"/>
-          <w:color w:val="000000"/>
-          <w:sz w:val="20"/>
-          <w:szCs w:val="20"/>
-        </w:rPr>
-        <w:t>Building on these improvements, once we understood the behavior of the code for one page, we proceeded to expand it to all cantons.</w:t>
-      </w:r>
-      <w:r>
-        <w:rPr>
-          <w:rFonts w:ascii="Arial" w:hAnsi="Arial" w:cs="Arial"/>
-          <w:color w:val="000000"/>
-          <w:sz w:val="20"/>
-          <w:szCs w:val="20"/>
-        </w:rPr>
-        <w:t xml:space="preserve"> </w:t>
-      </w:r>
-      <w:r>
-        <w:rPr>
-          <w:rStyle w:val="normaltextrun"/>
-          <w:rFonts w:ascii="Arial" w:hAnsi="Arial" w:cs="Arial"/>
-          <w:color w:val="000000"/>
+          <w:color w:val="000000" w:themeColor="text1"/>
+          <w:sz w:val="20"/>
+          <w:szCs w:val="20"/>
+        </w:rPr>
+      </w:pPr>
+      <w:r>
+        <w:rPr>
+          <w:rFonts w:ascii="Arial" w:hAnsi="Arial" w:cs="Arial"/>
+          <w:color w:val="000000" w:themeColor="text1"/>
+          <w:sz w:val="20"/>
+          <w:szCs w:val="20"/>
+        </w:rPr>
+        <w:t xml:space="preserve">Building on these improvements, once we understood the behavior of the code for one page, we proceeded to expand it to all cantons. </w:t>
+      </w:r>
+      <w:r>
+        <w:rPr>
+          <w:rStyle w:val="normaltextrun"/>
+          <w:rFonts w:ascii="Arial" w:hAnsi="Arial" w:cs="Arial"/>
+          <w:color w:val="000000" w:themeColor="text1"/>
           <w:sz w:val="20"/>
           <w:szCs w:val="20"/>
         </w:rPr>
@@ -1049,7 +985,7 @@
         <w:rPr>
           <w:rStyle w:val="normaltextrun"/>
           <w:rFonts w:ascii="Arial" w:hAnsi="Arial" w:cs="Arial"/>
-          <w:color w:val="000000"/>
+          <w:color w:val="000000" w:themeColor="text1"/>
           <w:sz w:val="20"/>
           <w:szCs w:val="20"/>
         </w:rPr>
@@ -1059,7 +995,7 @@
         <w:rPr>
           <w:rStyle w:val="normaltextrun"/>
           <w:rFonts w:ascii="Arial" w:hAnsi="Arial" w:cs="Arial"/>
-          <w:color w:val="000000"/>
+          <w:color w:val="000000" w:themeColor="text1"/>
           <w:sz w:val="20"/>
           <w:szCs w:val="20"/>
         </w:rPr>
@@ -1069,7 +1005,7 @@
         <w:rPr>
           <w:rStyle w:val="normaltextrun"/>
           <w:rFonts w:ascii="Arial" w:hAnsi="Arial" w:cs="Arial"/>
-          <w:color w:val="000000"/>
+          <w:color w:val="000000" w:themeColor="text1"/>
           <w:sz w:val="20"/>
           <w:szCs w:val="20"/>
         </w:rPr>
@@ -1079,7 +1015,7 @@
         <w:rPr>
           <w:rStyle w:val="normaltextrun"/>
           <w:rFonts w:ascii="Arial" w:hAnsi="Arial" w:cs="Arial"/>
-          <w:color w:val="000000"/>
+          <w:color w:val="000000" w:themeColor="text1"/>
           <w:sz w:val="20"/>
           <w:szCs w:val="20"/>
         </w:rPr>
@@ -1089,7 +1025,7 @@
         <w:rPr>
           <w:rStyle w:val="normaltextrun"/>
           <w:rFonts w:ascii="Arial" w:hAnsi="Arial" w:cs="Arial"/>
-          <w:color w:val="000000"/>
+          <w:color w:val="000000" w:themeColor="text1"/>
           <w:sz w:val="20"/>
           <w:szCs w:val="20"/>
         </w:rPr>
@@ -1099,7 +1035,7 @@
         <w:rPr>
           <w:rStyle w:val="normaltextrun"/>
           <w:rFonts w:ascii="Arial" w:hAnsi="Arial" w:cs="Arial"/>
-          <w:color w:val="000000"/>
+          <w:color w:val="000000" w:themeColor="text1"/>
           <w:sz w:val="20"/>
           <w:szCs w:val="20"/>
         </w:rPr>
@@ -1109,7 +1045,7 @@
         <w:rPr>
           <w:rStyle w:val="normaltextrun"/>
           <w:rFonts w:ascii="Arial" w:hAnsi="Arial" w:cs="Arial"/>
-          <w:color w:val="000000"/>
+          <w:color w:val="000000" w:themeColor="text1"/>
           <w:sz w:val="20"/>
           <w:szCs w:val="20"/>
         </w:rPr>
@@ -1119,7 +1055,7 @@
         <w:rPr>
           <w:rStyle w:val="normaltextrun"/>
           <w:rFonts w:ascii="Arial" w:hAnsi="Arial" w:cs="Arial"/>
-          <w:color w:val="000000"/>
+          <w:color w:val="000000" w:themeColor="text1"/>
           <w:sz w:val="20"/>
           <w:szCs w:val="20"/>
         </w:rPr>
@@ -1129,7 +1065,7 @@
         <w:rPr>
           <w:rStyle w:val="normaltextrun"/>
           <w:rFonts w:ascii="Arial" w:hAnsi="Arial" w:cs="Arial"/>
-          <w:color w:val="000000"/>
+          <w:color w:val="000000" w:themeColor="text1"/>
           <w:sz w:val="20"/>
           <w:szCs w:val="20"/>
         </w:rPr>
@@ -1139,7 +1075,7 @@
         <w:rPr>
           <w:rStyle w:val="normaltextrun"/>
           <w:rFonts w:ascii="Arial" w:hAnsi="Arial" w:cs="Arial"/>
-          <w:color w:val="000000"/>
+          <w:color w:val="000000" w:themeColor="text1"/>
           <w:sz w:val="20"/>
           <w:szCs w:val="20"/>
         </w:rPr>
@@ -1149,7 +1085,7 @@
         <w:rPr>
           <w:rStyle w:val="normaltextrun"/>
           <w:rFonts w:ascii="Arial" w:hAnsi="Arial" w:cs="Arial"/>
-          <w:color w:val="000000"/>
+          <w:color w:val="000000" w:themeColor="text1"/>
           <w:sz w:val="20"/>
           <w:szCs w:val="20"/>
         </w:rPr>
@@ -1159,7 +1095,7 @@
         <w:rPr>
           <w:rStyle w:val="normaltextrun"/>
           <w:rFonts w:ascii="Arial" w:hAnsi="Arial" w:cs="Arial"/>
-          <w:color w:val="000000"/>
+          <w:color w:val="000000" w:themeColor="text1"/>
           <w:sz w:val="20"/>
           <w:szCs w:val="20"/>
         </w:rPr>
@@ -1169,7 +1105,7 @@
         <w:rPr>
           <w:rStyle w:val="normaltextrun"/>
           <w:rFonts w:ascii="Arial" w:hAnsi="Arial" w:cs="Arial"/>
-          <w:color w:val="000000"/>
+          <w:color w:val="000000" w:themeColor="text1"/>
           <w:sz w:val="20"/>
           <w:szCs w:val="20"/>
         </w:rPr>
@@ -1179,7 +1115,7 @@
         <w:rPr>
           <w:rStyle w:val="normaltextrun"/>
           <w:rFonts w:ascii="Arial" w:hAnsi="Arial" w:cs="Arial"/>
-          <w:color w:val="000000"/>
+          <w:color w:val="000000" w:themeColor="text1"/>
           <w:sz w:val="20"/>
           <w:szCs w:val="20"/>
         </w:rPr>
@@ -1189,7 +1125,7 @@
         <w:rPr>
           <w:rStyle w:val="normaltextrun"/>
           <w:rFonts w:ascii="Arial" w:hAnsi="Arial" w:cs="Arial"/>
-          <w:color w:val="000000"/>
+          <w:color w:val="000000" w:themeColor="text1"/>
           <w:sz w:val="20"/>
           <w:szCs w:val="20"/>
         </w:rPr>
@@ -1199,7 +1135,7 @@
         <w:rPr>
           <w:rStyle w:val="normaltextrun"/>
           <w:rFonts w:ascii="Arial" w:hAnsi="Arial" w:cs="Arial"/>
-          <w:color w:val="000000"/>
+          <w:color w:val="000000" w:themeColor="text1"/>
           <w:sz w:val="20"/>
           <w:szCs w:val="20"/>
         </w:rPr>
@@ -1209,7 +1145,7 @@
         <w:rPr>
           <w:rStyle w:val="normaltextrun"/>
           <w:rFonts w:ascii="Arial" w:hAnsi="Arial" w:cs="Arial"/>
-          <w:color w:val="000000"/>
+          <w:color w:val="000000" w:themeColor="text1"/>
           <w:sz w:val="20"/>
           <w:szCs w:val="20"/>
         </w:rPr>
@@ -1219,7 +1155,7 @@
         <w:rPr>
           <w:rStyle w:val="normaltextrun"/>
           <w:rFonts w:ascii="Arial" w:hAnsi="Arial" w:cs="Arial"/>
-          <w:color w:val="000000"/>
+          <w:color w:val="000000" w:themeColor="text1"/>
           <w:sz w:val="20"/>
           <w:szCs w:val="20"/>
         </w:rPr>
@@ -1229,7 +1165,7 @@
         <w:rPr>
           <w:rStyle w:val="normaltextrun"/>
           <w:rFonts w:ascii="Arial" w:hAnsi="Arial" w:cs="Arial"/>
-          <w:color w:val="000000"/>
+          <w:color w:val="000000" w:themeColor="text1"/>
           <w:sz w:val="20"/>
           <w:szCs w:val="20"/>
         </w:rPr>
@@ -1239,7 +1175,7 @@
         <w:rPr>
           <w:rStyle w:val="normaltextrun"/>
           <w:rFonts w:ascii="Arial" w:hAnsi="Arial" w:cs="Arial"/>
-          <w:color w:val="000000"/>
+          <w:color w:val="000000" w:themeColor="text1"/>
           <w:sz w:val="20"/>
           <w:szCs w:val="20"/>
         </w:rPr>
@@ -1249,7 +1185,7 @@
         <w:rPr>
           <w:rStyle w:val="normaltextrun"/>
           <w:rFonts w:ascii="Arial" w:hAnsi="Arial" w:cs="Arial"/>
-          <w:color w:val="000000"/>
+          <w:color w:val="000000" w:themeColor="text1"/>
           <w:sz w:val="20"/>
           <w:szCs w:val="20"/>
         </w:rPr>
@@ -1259,7 +1195,7 @@
         <w:rPr>
           <w:rStyle w:val="normaltextrun"/>
           <w:rFonts w:ascii="Arial" w:hAnsi="Arial" w:cs="Arial"/>
-          <w:color w:val="000000"/>
+          <w:color w:val="000000" w:themeColor="text1"/>
           <w:sz w:val="20"/>
           <w:szCs w:val="20"/>
         </w:rPr>
@@ -1269,7 +1205,7 @@
         <w:rPr>
           <w:rStyle w:val="normaltextrun"/>
           <w:rFonts w:ascii="Arial" w:hAnsi="Arial" w:cs="Arial"/>
-          <w:color w:val="000000"/>
+          <w:color w:val="000000" w:themeColor="text1"/>
           <w:sz w:val="20"/>
           <w:szCs w:val="20"/>
         </w:rPr>
@@ -1279,7 +1215,7 @@
         <w:rPr>
           <w:rStyle w:val="normaltextrun"/>
           <w:rFonts w:ascii="Arial" w:hAnsi="Arial" w:cs="Arial"/>
-          <w:color w:val="000000"/>
+          <w:color w:val="000000" w:themeColor="text1"/>
           <w:sz w:val="20"/>
           <w:szCs w:val="20"/>
         </w:rPr>
@@ -1295,7 +1231,7 @@
         <w:rPr>
           <w:rStyle w:val="normaltextrun"/>
           <w:rFonts w:ascii="Arial" w:hAnsi="Arial" w:cs="Arial"/>
-          <w:color w:val="000000"/>
+          <w:color w:val="000000" w:themeColor="text1"/>
           <w:sz w:val="20"/>
           <w:szCs w:val="20"/>
         </w:rPr>
@@ -1308,16 +1244,16 @@
         <w:rPr>
           <w:rStyle w:val="normaltextrun"/>
           <w:rFonts w:ascii="Arial" w:hAnsi="Arial" w:cs="Arial"/>
-          <w:color w:val="EE0000"/>
-          <w:sz w:val="20"/>
-          <w:szCs w:val="20"/>
-        </w:rPr>
-      </w:pPr>
-      <w:r>
-        <w:rPr>
-          <w:rStyle w:val="normaltextrun"/>
-          <w:rFonts w:ascii="Arial" w:hAnsi="Arial" w:cs="Arial"/>
-          <w:color w:val="000000"/>
+          <w:color w:val="000000" w:themeColor="text1"/>
+          <w:sz w:val="20"/>
+          <w:szCs w:val="20"/>
+        </w:rPr>
+      </w:pPr>
+      <w:r>
+        <w:rPr>
+          <w:rStyle w:val="normaltextrun"/>
+          <w:rFonts w:ascii="Arial" w:hAnsi="Arial" w:cs="Arial"/>
+          <w:color w:val="000000" w:themeColor="text1"/>
           <w:sz w:val="20"/>
           <w:szCs w:val="20"/>
         </w:rPr>
@@ -1327,7 +1263,7 @@
         <w:rPr>
           <w:rStyle w:val="normaltextrun"/>
           <w:rFonts w:ascii="Arial" w:hAnsi="Arial" w:cs="Arial"/>
-          <w:color w:val="000000"/>
+          <w:color w:val="000000" w:themeColor="text1"/>
           <w:sz w:val="20"/>
           <w:szCs w:val="20"/>
         </w:rPr>
@@ -1337,7 +1273,7 @@
         <w:rPr>
           <w:rStyle w:val="normaltextrun"/>
           <w:rFonts w:ascii="Arial" w:hAnsi="Arial" w:cs="Arial"/>
-          <w:color w:val="000000"/>
+          <w:color w:val="000000" w:themeColor="text1"/>
           <w:sz w:val="20"/>
           <w:szCs w:val="20"/>
         </w:rPr>
@@ -1347,7 +1283,7 @@
         <w:rPr>
           <w:rStyle w:val="normaltextrun"/>
           <w:rFonts w:ascii="Arial" w:hAnsi="Arial" w:cs="Arial"/>
-          <w:color w:val="000000"/>
+          <w:color w:val="000000" w:themeColor="text1"/>
           <w:sz w:val="20"/>
           <w:szCs w:val="20"/>
         </w:rPr>
@@ -1357,7 +1293,7 @@
         <w:rPr>
           <w:rStyle w:val="normaltextrun"/>
           <w:rFonts w:ascii="Arial" w:hAnsi="Arial" w:cs="Arial"/>
-          <w:color w:val="000000"/>
+          <w:color w:val="000000" w:themeColor="text1"/>
           <w:sz w:val="20"/>
           <w:szCs w:val="20"/>
         </w:rPr>
@@ -1366,25 +1302,16 @@
       <w:r>
         <w:rPr>
           <w:rFonts w:ascii="Arial" w:hAnsi="Arial" w:cs="Arial"/>
-          <w:color w:val="EE0000"/>
-          <w:sz w:val="20"/>
-          <w:szCs w:val="20"/>
-        </w:rPr>
-        <w:t xml:space="preserve">Listings were identified using anchor elements within each listing card, which consistently contained the unique listing URLs and served as a stable reference point across </w:t>
-      </w:r>
-      <w:r>
-        <w:rPr>
-          <w:rFonts w:ascii="Arial" w:hAnsi="Arial" w:cs="Arial"/>
-          <w:color w:val="EE0000"/>
-          <w:sz w:val="20"/>
-          <w:szCs w:val="20"/>
-        </w:rPr>
-        <w:t xml:space="preserve">pages. </w:t>
-      </w:r>
-      <w:r>
-        <w:rPr>
-          <w:rFonts w:ascii="Arial" w:hAnsi="Arial" w:cs="Arial"/>
-          <w:color w:val="EE0000"/>
+          <w:color w:val="000000" w:themeColor="text1"/>
+          <w:sz w:val="20"/>
+          <w:szCs w:val="20"/>
+        </w:rPr>
+        <w:t xml:space="preserve">Listings were identified using anchor elements within each listing card, which consistently contained the unique listing URLs and served as a stable reference point across pages. </w:t>
+      </w:r>
+      <w:r>
+        <w:rPr>
+          <w:rFonts w:ascii="Arial" w:hAnsi="Arial" w:cs="Arial"/>
+          <w:color w:val="000000" w:themeColor="text1"/>
           <w:sz w:val="20"/>
           <w:szCs w:val="20"/>
         </w:rPr>
@@ -1393,7 +1320,7 @@
       <w:r>
         <w:rPr>
           <w:rFonts w:ascii="Arial" w:hAnsi="Arial" w:cs="Arial"/>
-          <w:color w:val="EE0000"/>
+          <w:color w:val="000000" w:themeColor="text1"/>
           <w:sz w:val="20"/>
           <w:szCs w:val="20"/>
         </w:rPr>
@@ -1405,7 +1332,7 @@
           <w:rFonts w:ascii="Arial" w:eastAsiaTheme="majorEastAsia" w:hAnsi="Arial" w:cs="Arial"/>
           <w:b w:val="0"/>
           <w:bCs w:val="0"/>
-          <w:color w:val="EE0000"/>
+          <w:color w:val="000000" w:themeColor="text1"/>
           <w:sz w:val="20"/>
           <w:szCs w:val="20"/>
         </w:rPr>
@@ -1415,7 +1342,7 @@
         <w:rPr>
           <w:rStyle w:val="apple-converted-space"/>
           <w:rFonts w:ascii="Arial" w:eastAsiaTheme="majorEastAsia" w:hAnsi="Arial" w:cs="Arial"/>
-          <w:color w:val="EE0000"/>
+          <w:color w:val="000000" w:themeColor="text1"/>
           <w:sz w:val="20"/>
           <w:szCs w:val="20"/>
         </w:rPr>
@@ -1424,7 +1351,7 @@
       <w:r>
         <w:rPr>
           <w:rFonts w:ascii="Arial" w:hAnsi="Arial" w:cs="Arial"/>
-          <w:color w:val="EE0000"/>
+          <w:color w:val="000000" w:themeColor="text1"/>
           <w:sz w:val="20"/>
           <w:szCs w:val="20"/>
         </w:rPr>
@@ -1433,7 +1360,7 @@
       <w:r>
         <w:rPr>
           <w:rFonts w:ascii="Arial" w:hAnsi="Arial" w:cs="Arial"/>
-          <w:color w:val="EE0000"/>
+          <w:color w:val="000000" w:themeColor="text1"/>
           <w:sz w:val="20"/>
           <w:szCs w:val="20"/>
         </w:rPr>
@@ -1442,16 +1369,16 @@
       <w:r>
         <w:rPr>
           <w:rFonts w:ascii="Arial" w:hAnsi="Arial" w:cs="Arial"/>
-          <w:color w:val="EE0000"/>
-          <w:sz w:val="20"/>
-          <w:szCs w:val="20"/>
-        </w:rPr>
-        <w:t xml:space="preserve"> </w:t>
-      </w:r>
-      <w:r>
-        <w:rPr>
-          <w:rFonts w:ascii="Arial" w:hAnsi="Arial" w:cs="Arial"/>
-          <w:color w:val="EE0000"/>
+          <w:color w:val="000000" w:themeColor="text1"/>
+          <w:sz w:val="20"/>
+          <w:szCs w:val="20"/>
+        </w:rPr>
+        <w:t xml:space="preserve"> </w:t>
+      </w:r>
+      <w:r>
+        <w:rPr>
+          <w:rFonts w:ascii="Arial" w:hAnsi="Arial" w:cs="Arial"/>
+          <w:color w:val="000000" w:themeColor="text1"/>
           <w:sz w:val="20"/>
           <w:szCs w:val="20"/>
         </w:rPr>
@@ -1462,7 +1389,7 @@
         <w:rPr>
           <w:rStyle w:val="HTMLCode"/>
           <w:rFonts w:ascii="Arial" w:eastAsiaTheme="majorEastAsia" w:hAnsi="Arial" w:cs="Arial"/>
-          <w:color w:val="EE0000"/>
+          <w:color w:val="000000" w:themeColor="text1"/>
         </w:rPr>
         <w:t>seen_urls</w:t>
       </w:r>
@@ -1470,7 +1397,7 @@
       <w:r>
         <w:rPr>
           <w:rFonts w:ascii="Arial" w:hAnsi="Arial" w:cs="Arial"/>
-          <w:color w:val="EE0000"/>
+          <w:color w:val="000000" w:themeColor="text1"/>
           <w:sz w:val="20"/>
           <w:szCs w:val="20"/>
         </w:rPr>
@@ -1479,7 +1406,7 @@
       <w:r>
         <w:rPr>
           <w:rFonts w:ascii="Arial" w:hAnsi="Arial" w:cs="Arial"/>
-          <w:color w:val="EE0000"/>
+          <w:color w:val="000000" w:themeColor="text1"/>
           <w:sz w:val="20"/>
           <w:szCs w:val="20"/>
         </w:rPr>
@@ -1489,7 +1416,7 @@
       <w:r>
         <w:rPr>
           <w:rFonts w:ascii="Arial" w:hAnsi="Arial" w:cs="Arial"/>
-          <w:color w:val="EE0000"/>
+          <w:color w:val="000000" w:themeColor="text1"/>
           <w:sz w:val="20"/>
           <w:szCs w:val="20"/>
         </w:rPr>
@@ -1499,7 +1426,7 @@
       <w:r>
         <w:rPr>
           <w:rFonts w:ascii="Arial" w:hAnsi="Arial" w:cs="Arial"/>
-          <w:color w:val="EE0000"/>
+          <w:color w:val="000000" w:themeColor="text1"/>
           <w:sz w:val="20"/>
           <w:szCs w:val="20"/>
         </w:rPr>
@@ -1510,20 +1437,11 @@
       <w:r>
         <w:rPr>
           <w:rFonts w:ascii="Arial" w:hAnsi="Arial" w:cs="Arial"/>
-          <w:color w:val="EE0000"/>
-          <w:sz w:val="20"/>
-          <w:szCs w:val="20"/>
-        </w:rPr>
-        <w:t>. The final dataset was exported as a CSV file for subsequent analysi</w:t>
-      </w:r>
-      <w:r>
-        <w:rPr>
-          <w:rFonts w:ascii="Arial" w:hAnsi="Arial" w:cs="Arial"/>
-          <w:color w:val="EE0000"/>
-          <w:sz w:val="20"/>
-          <w:szCs w:val="20"/>
-        </w:rPr>
-        <w:t>s.</w:t>
+          <w:color w:val="000000" w:themeColor="text1"/>
+          <w:sz w:val="20"/>
+          <w:szCs w:val="20"/>
+        </w:rPr>
+        <w:t>. The final dataset was exported as a CSV file for subsequent analysis.</w:t>
       </w:r>
     </w:p>
     <w:p>
@@ -1538,15 +1456,13 @@
           <w:rStyle w:val="normaltextrun"/>
           <w:b w:val="0"/>
           <w:bCs w:val="0"/>
-          <w:color w:val="000000"/>
-          <w:sz w:val="21"/>
-          <w:szCs w:val="21"/>
-        </w:rPr>
-      </w:pPr>
-      <w:r>
-        <w:rPr>
-          <w:rStyle w:val="normaltextrun"/>
-          <w:color w:val="000000"/>
+          <w:sz w:val="21"/>
+          <w:szCs w:val="21"/>
+        </w:rPr>
+      </w:pPr>
+      <w:r>
+        <w:rPr>
+          <w:rStyle w:val="normaltextrun"/>
           <w:sz w:val="21"/>
           <w:szCs w:val="21"/>
         </w:rPr>
@@ -1571,21 +1487,21 @@
         <w:rPr>
           <w:rStyle w:val="normaltextrun"/>
           <w:rFonts w:ascii="Arial" w:hAnsi="Arial" w:cs="Arial"/>
-          <w:color w:val="000000"/>
-          <w:sz w:val="21"/>
-          <w:szCs w:val="21"/>
-        </w:rPr>
-        <w:t>The</w:t>
-      </w:r>
-      <w:r>
-        <w:rPr>
-          <w:rStyle w:val="normaltextrun"/>
-          <w:rFonts w:ascii="Arial" w:hAnsi="Arial" w:cs="Arial"/>
-          <w:color w:val="000000"/>
-          <w:sz w:val="21"/>
-          <w:szCs w:val="21"/>
-        </w:rPr>
-        <w:t xml:space="preserve"> data collection process was conducted in compliance with ethical and legal standards by reviewing the robots.txt file of immobilier.ch prior to scraping. A 5-second crawl delay was implemented to respect server load constraints. Only publicly available data was collected, ensuring adherence to the platform’s terms of service.</w:t>
+          <w:color w:val="000000" w:themeColor="text1"/>
+          <w:sz w:val="21"/>
+          <w:szCs w:val="21"/>
+        </w:rPr>
+        <w:t xml:space="preserve">The data collection process was conducted in compliance with ethical and legal standards by reviewing the robots.txt file of immobilier.ch prior to scraping. A </w:t>
+      </w:r>
+      <w:r>
+        <w:rPr>
+          <w:rStyle w:val="normaltextrun"/>
+          <w:rFonts w:ascii="Arial" w:hAnsi="Arial" w:cs="Arial"/>
+          <w:color w:val="000000"/>
+          <w:sz w:val="21"/>
+          <w:szCs w:val="21"/>
+        </w:rPr>
+        <w:t>5-second crawl delay was implemented to respect server load constraints. Only publicly available data was collected, ensuring adherence to the platform’s terms of service.</w:t>
       </w:r>
     </w:p>
     <w:p>
@@ -3959,7 +3875,23 @@
           <w:sz w:val="20"/>
           <w:szCs w:val="20"/>
         </w:rPr>
-        <w:t>This project set out to examine the relationship between regional economic strength and apartment rental prices across Swiss cantons, with a focus on building the data pipeline, from web scraping trough to preprocessing and modelling.</w:t>
+        <w:t>This project set out to examine the relationship between regional economic strength and apartment rental prices across Swiss cantons, with a focus on building the data pipeline, from web scraping t</w:t>
+      </w:r>
+      <w:r>
+        <w:rPr>
+          <w:rFonts w:ascii="Arial" w:hAnsi="Arial" w:cs="Arial"/>
+          <w:sz w:val="20"/>
+          <w:szCs w:val="20"/>
+        </w:rPr>
+        <w:t>h</w:t>
+      </w:r>
+      <w:r>
+        <w:rPr>
+          <w:rFonts w:ascii="Arial" w:hAnsi="Arial" w:cs="Arial"/>
+          <w:sz w:val="20"/>
+          <w:szCs w:val="20"/>
+        </w:rPr>
+        <w:t>rough to preprocessing and modelling.</w:t>
       </w:r>
     </w:p>
     <w:p>
@@ -10164,6 +10096,16 @@
         </w:rPr>
         <w:t>.</w:t>
       </w:r>
+    </w:p>
+    <w:p>
+      <w:pPr>
+        <w:jc w:val="both"/>
+        <w:rPr>
+          <w:rFonts w:ascii="Arial" w:hAnsi="Arial" w:cs="Arial"/>
+          <w:sz w:val="13"/>
+          <w:szCs w:val="13"/>
+        </w:rPr>
+      </w:pPr>
     </w:p>
     <w:p>
       <w:pPr>

</xml_diff>